<commit_message>
CC controller updates, more functions for HOD
</commit_message>
<xml_diff>
--- a/backend/controllers/output.docx
+++ b/backend/controllers/output.docx
@@ -107,7 +107,7 @@
                       <w:szCs w:val="24"/>
                       <w:u w:val="single"/>
                     </w:rPr>
-                    <w:t xml:space="preserve">Thu Feb 01 2024 05:30:00 GMT+0530 (India Standard Time)</w:t>
+                    <w:t xml:space="preserve">undefined</w:t>
                   </w:r>
                 </w:p>
               </w:txbxContent>
@@ -295,7 +295,7 @@
                       <w:szCs w:val="24"/>
                       <w:u w:val="single"/>
                     </w:rPr>
-                    <w:t xml:space="preserve">Wed Feb 01 2023 05:30:00 GMT+0530 (India Standard Time)</w:t>
+                    <w:t xml:space="preserve">undefined</w:t>
                   </w:r>
                 </w:p>
               </w:txbxContent>
@@ -477,7 +477,7 @@
                       <w:szCs w:val="24"/>
                       <w:u w:val="single"/>
                     </w:rPr>
-                    <w:t xml:space="preserve">30</w:t>
+                    <w:t xml:space="preserve">undefined</w:t>
                   </w:r>
                   <w:r>
                     <w:rPr>
@@ -1017,7 +1017,7 @@
                 <w:sz w:val="24"/>
                 <w:szCs w:val="24"/>
               </w:rPr>
-              <w:t xml:space="preserve">What is TIme</w:t>
+              <w:t xml:space="preserve">What is Life</w:t>
             </w:r>
           </w:p>
         </w:tc>
@@ -2010,7 +2010,7 @@
         <w:sz w:val="28"/>
         <w:szCs w:val="28"/>
       </w:rPr>
-      <w:t xml:space="preserve"> undefined</w:t>
+      <w:t xml:space="preserve"> 23242</w:t>
     </w:r>
   </w:p>
   <w:p>

</xml_diff>

<commit_message>
Fixed more bugs in downloading, updated template
</commit_message>
<xml_diff>
--- a/backend/controllers/output.docx
+++ b/backend/controllers/output.docx
@@ -6,411 +6,3327 @@
       <w:pPr>
         <w:jc w:val="center"/>
         <w:rPr>
-          <w:lang w:val="en-US"/>
-        </w:rPr>
-      </w:pPr>
-      <w:r>
-        <w:rPr>
+          <w:rFonts w:ascii="Times New Roman" w:hAnsi="Times New Roman" w:cs="Times New Roman"/>
+          <w:b/>
+          <w:bCs/>
+          <w:lang w:val="en-US"/>
+        </w:rPr>
+      </w:pPr>
+      <w:r>
+        <w:rPr>
+          <w:rFonts w:ascii="Times New Roman" w:hAnsi="Times New Roman" w:cs="Times New Roman"/>
+          <w:b/>
+          <w:bCs/>
           <w:lang w:val="en-US"/>
         </w:rPr>
         <w:t xml:space="preserve">CA1</w:t>
       </w:r>
-      <w:proofErr w:type="spellStart"/>
-      <w:r>
-        <w:rPr>
-          <w:lang w:val="en-US"/>
-        </w:rPr>
-        <w:t/>
-      </w:r>
-      <w:proofErr w:type="spellEnd"/>
-      <w:r>
-        <w:rPr>
-          <w:lang w:val="en-US"/>
-        </w:rPr>
-        <w:t/>
-      </w:r>
     </w:p>
     <w:p>
       <w:pPr>
         <w:jc w:val="center"/>
         <w:rPr>
-          <w:lang w:val="en-US"/>
-        </w:rPr>
-      </w:pPr>
-      <w:r>
-        <w:rPr>
-          <w:lang w:val="en-US"/>
-        </w:rPr>
-        <w:t xml:space="preserve">INT222</w:t>
-      </w:r>
-      <w:proofErr w:type="spellStart"/>
-      <w:r>
-        <w:rPr>
-          <w:lang w:val="en-US"/>
-        </w:rPr>
-        <w:t/>
-      </w:r>
-      <w:proofErr w:type="spellEnd"/>
-      <w:proofErr w:type="gramStart"/>
-      <w:r>
-        <w:rPr>
-          <w:lang w:val="en-US"/>
-        </w:rPr>
-        <w:t xml:space="preserve">:Advance Web Development</w:t>
-      </w:r>
-      <w:proofErr w:type="spellStart"/>
-      <w:proofErr w:type="gramEnd"/>
-      <w:r>
-        <w:rPr>
-          <w:lang w:val="en-US"/>
-        </w:rPr>
-        <w:t/>
-      </w:r>
-      <w:proofErr w:type="spellEnd"/>
-      <w:r>
-        <w:rPr>
-          <w:lang w:val="en-US"/>
-        </w:rPr>
-        <w:t/>
-      </w:r>
-    </w:p>
-    <w:p>
-      <w:pPr>
-        <w:jc w:val="center"/>
-        <w:rPr>
-          <w:lang w:val="en-US"/>
-        </w:rPr>
-      </w:pPr>
-    </w:p>
-    <w:p>
-      <w:pPr>
-        <w:rPr>
-          <w:rFonts w:ascii="Times New Roman" w:hAnsi="Times New Roman" w:cs="Times New Roman"/>
-          <w:lang w:val="en-US"/>
-        </w:rPr>
-      </w:pPr>
-      <w:r>
-        <w:rPr>
-          <w:rFonts w:ascii="Times New Roman" w:hAnsi="Times New Roman" w:cs="Times New Roman"/>
+          <w:rFonts w:ascii="Times New Roman" w:hAnsi="Times New Roman" w:cs="Times New Roman"/>
+          <w:b/>
+          <w:bCs/>
+          <w:lang w:val="en-US"/>
+        </w:rPr>
+      </w:pPr>
+      <w:r>
+        <w:rPr>
+          <w:rFonts w:ascii="Times New Roman" w:hAnsi="Times New Roman" w:cs="Times New Roman"/>
+          <w:b/>
+          <w:bCs/>
+          <w:lang w:val="en-US"/>
+        </w:rPr>
+        <w:t xml:space="preserve">CSE316:</w:t>
+      </w:r>
+      <w:r>
+        <w:rPr>
+          <w:rFonts w:ascii="Times New Roman" w:hAnsi="Times New Roman" w:cs="Times New Roman"/>
+          <w:b/>
+          <w:bCs/>
           <w:lang w:val="en-US"/>
         </w:rPr>
         <w:t xml:space="preserve"> </w:t>
       </w:r>
-    </w:p>
-    <w:p>
-      <w:pPr>
-        <w:rPr>
-          <w:rFonts w:ascii="Times New Roman" w:hAnsi="Times New Roman" w:cs="Times New Roman"/>
-          <w:lang w:val="en-US"/>
-        </w:rPr>
-      </w:pPr>
-      <w:r>
-        <w:rPr>
-          <w:rStyle w:val="markedcontent"/>
-          <w:rFonts w:ascii="Times New Roman" w:hAnsi="Times New Roman" w:cs="Times New Roman"/>
-          <w:sz w:val="24"/>
-          <w:szCs w:val="24"/>
-        </w:rPr>
-        <w:t xml:space="preserve">1 </w:t>
-      </w:r>
-      <w:r>
-        <w:rPr>
-          <w:rStyle w:val="markedcontent"/>
-          <w:rFonts w:ascii="Times New Roman" w:hAnsi="Times New Roman" w:cs="Times New Roman"/>
-          <w:sz w:val="24"/>
-          <w:szCs w:val="24"/>
-        </w:rPr>
-        <w:t xml:space="preserve">What is Life</w:t>
-      </w:r>
-      <w:r>
-        <w:rPr>
-          <w:rFonts w:ascii="Times New Roman" w:hAnsi="Times New Roman" w:cs="Times New Roman"/>
-          <w:sz w:val="24"/>
-          <w:szCs w:val="24"/>
-        </w:rPr>
-        <w:t/>
-      </w:r>
-    </w:p>
-    <w:p>
-      <w:pPr>
-        <w:rPr>
-          <w:rFonts w:ascii="Times New Roman" w:hAnsi="Times New Roman" w:cs="Times New Roman"/>
-          <w:sz w:val="24"/>
-          <w:szCs w:val="24"/>
-        </w:rPr>
-      </w:pPr>
-      <w:r>
-        <w:rPr>
-          <w:rFonts w:ascii="Times New Roman" w:hAnsi="Times New Roman" w:cs="Times New Roman"/>
-          <w:sz w:val="24"/>
-          <w:szCs w:val="24"/>
+      <w:r>
+        <w:rPr>
+          <w:rFonts w:ascii="Times New Roman" w:hAnsi="Times New Roman" w:cs="Times New Roman"/>
+          <w:b/>
+          <w:bCs/>
+          <w:lang w:val="en-US"/>
+        </w:rPr>
+        <w:t xml:space="preserve">Operating System</w:t>
+      </w:r>
+    </w:p>
+    <w:p>
+      <w:pPr>
+        <w:rPr>
+          <w:rFonts w:ascii="Times New Roman" w:hAnsi="Times New Roman" w:cs="Times New Roman"/>
+          <w:b/>
+          <w:bCs/>
+          <w:lang w:val="en-US"/>
+        </w:rPr>
+      </w:pPr>
+      <w:r>
+        <w:rPr>
+          <w:rFonts w:ascii="Times New Roman" w:hAnsi="Times New Roman" w:cs="Times New Roman"/>
+          <w:b/>
+          <w:bCs/>
+          <w:lang w:val="en-US"/>
+        </w:rPr>
+        <w:t>General Instructions</w:t>
+      </w:r>
+    </w:p>
+    <w:p>
+      <w:pPr>
+        <w:pStyle w:val="ListParagraph"/>
+        <w:numPr>
+          <w:ilvl w:val="0"/>
+          <w:numId w:val="3"/>
+        </w:numPr>
+        <w:spacing w:after="0" w:line="240" w:lineRule="auto"/>
+        <w:jc w:val="both"/>
+        <w:rPr>
+          <w:rFonts w:ascii="Times New Roman" w:eastAsia="Times New Roman" w:hAnsi="Times New Roman" w:cs="Times New Roman"/>
+          <w:b/>
+          <w:bCs/>
+          <w:lang w:val="en-IN" w:eastAsia="en-IN"/>
+        </w:rPr>
+      </w:pPr>
+      <w:r>
+        <w:rPr>
+          <w:rFonts w:ascii="Times New Roman" w:eastAsia="Times New Roman" w:hAnsi="Times New Roman" w:cs="Times New Roman"/>
+          <w:b/>
+          <w:bCs/>
+          <w:lang w:val="en-IN" w:eastAsia="en-IN"/>
+        </w:rPr>
+        <w:t>Turn off and submit all mobile phones to the invigilator before the exam starts.</w:t>
+      </w:r>
+    </w:p>
+    <w:p>
+      <w:pPr>
+        <w:pStyle w:val="ListParagraph"/>
+        <w:numPr>
+          <w:ilvl w:val="0"/>
+          <w:numId w:val="3"/>
+        </w:numPr>
+        <w:spacing w:after="0" w:line="240" w:lineRule="auto"/>
+        <w:jc w:val="both"/>
+        <w:rPr>
+          <w:rFonts w:ascii="Times New Roman" w:eastAsia="Times New Roman" w:hAnsi="Times New Roman" w:cs="Times New Roman"/>
+          <w:b/>
+          <w:bCs/>
+          <w:lang w:val="en-IN" w:eastAsia="en-IN"/>
+        </w:rPr>
+      </w:pPr>
+      <w:r>
+        <w:rPr>
+          <w:rFonts w:ascii="Times New Roman" w:eastAsia="Times New Roman" w:hAnsi="Times New Roman" w:cs="Times New Roman"/>
+          <w:b/>
+          <w:bCs/>
+          <w:lang w:val="en-IN" w:eastAsia="en-IN"/>
+        </w:rPr>
+        <w:t>Use blue or black ink for writing answers; pencils are allowed only for diagrams.</w:t>
+      </w:r>
+    </w:p>
+    <w:p>
+      <w:pPr>
+        <w:pStyle w:val="ListParagraph"/>
+        <w:numPr>
+          <w:ilvl w:val="0"/>
+          <w:numId w:val="3"/>
+        </w:numPr>
+        <w:spacing w:after="0" w:line="240" w:lineRule="auto"/>
+        <w:jc w:val="both"/>
+        <w:rPr>
+          <w:rFonts w:ascii="Times New Roman" w:eastAsia="Times New Roman" w:hAnsi="Times New Roman" w:cs="Times New Roman"/>
+          <w:b/>
+          <w:bCs/>
+          <w:lang w:val="en-IN" w:eastAsia="en-IN"/>
+        </w:rPr>
+      </w:pPr>
+      <w:r>
+        <w:rPr>
+          <w:rFonts w:ascii="Times New Roman" w:eastAsia="Times New Roman" w:hAnsi="Times New Roman" w:cs="Times New Roman"/>
+          <w:b/>
+          <w:bCs/>
+          <w:lang w:val="en-IN" w:eastAsia="en-IN"/>
+        </w:rPr>
+        <w:t>Maintain silence and do not communicate with other students during the exam.</w:t>
+      </w:r>
+    </w:p>
+    <w:p>
+      <w:pPr>
+        <w:pStyle w:val="ListParagraph"/>
+        <w:numPr>
+          <w:ilvl w:val="0"/>
+          <w:numId w:val="3"/>
+        </w:numPr>
+        <w:spacing w:after="0" w:line="240" w:lineRule="auto"/>
+        <w:jc w:val="both"/>
+        <w:rPr>
+          <w:rFonts w:ascii="Times New Roman" w:eastAsia="Times New Roman" w:hAnsi="Times New Roman" w:cs="Times New Roman"/>
+          <w:b/>
+          <w:bCs/>
+          <w:lang w:val="en-IN" w:eastAsia="en-IN"/>
+        </w:rPr>
+      </w:pPr>
+      <w:r>
+        <w:rPr>
+          <w:rFonts w:ascii="Times New Roman" w:eastAsia="Times New Roman" w:hAnsi="Times New Roman" w:cs="Times New Roman"/>
+          <w:b/>
+          <w:bCs/>
+          <w:lang w:val="en-IN" w:eastAsia="en-IN"/>
+        </w:rPr>
+        <w:t>Raise your hand to ask any questions; do not leave your seat without permission.</w:t>
+      </w:r>
+    </w:p>
+    <w:p>
+      <w:pPr>
+        <w:pStyle w:val="ListParagraph"/>
+        <w:numPr>
+          <w:ilvl w:val="0"/>
+          <w:numId w:val="3"/>
+        </w:numPr>
+        <w:jc w:val="both"/>
+        <w:rPr>
+          <w:rFonts w:ascii="Times New Roman" w:hAnsi="Times New Roman" w:cs="Times New Roman"/>
+          <w:b/>
+          <w:bCs/>
+          <w:lang w:val="en-US"/>
+        </w:rPr>
+        <w:sectPr>
+          <w:pgSz w:w="11906" w:h="16838"/>
+          <w:pgMar w:top="1440" w:right="1440" w:bottom="1440" w:left="1440" w:header="708" w:footer="708" w:gutter="0"/>
+          <w:cols w:space="708"/>
+          <w:docGrid w:linePitch="360"/>
+        </w:sectPr>
+      </w:pPr>
+      <w:r>
+        <w:rPr>
+          <w:rFonts w:ascii="Times New Roman" w:eastAsia="Times New Roman" w:hAnsi="Times New Roman" w:cs="Times New Roman"/>
+          <w:b/>
+          <w:bCs/>
+          <w:lang w:val="en-IN" w:eastAsia="en-IN"/>
+        </w:rPr>
+        <w:t>Submit your answer sheets promptly at the end of the exam; late submissions will not be accepted.</w:t>
+      </w:r>
+    </w:p>
+    <w:p>
+      <w:pPr>
+        <w:spacing w:after="0" w:line="240" w:lineRule="auto"/>
+        <w:rPr>
+          <w:rFonts w:ascii="Times New Roman" w:hAnsi="Times New Roman" w:cs="Times New Roman"/>
+          <w:lang w:val="en-US"/>
+        </w:rPr>
+      </w:pPr>
+      <w:r>
+        <w:rPr>
+          <w:rFonts w:ascii="Times New Roman" w:hAnsi="Times New Roman" w:cs="Times New Roman"/>
+          <w:lang w:val="en-US"/>
         </w:rPr>
         <w:t xml:space="preserve"> </w:t>
       </w:r>
     </w:p>
     <w:p>
       <w:pPr>
-        <w:rPr>
-          <w:rFonts w:ascii="Times New Roman" w:hAnsi="Times New Roman" w:cs="Times New Roman"/>
-          <w:lang w:val="en-US"/>
-        </w:rPr>
-      </w:pPr>
-      <w:r>
-        <w:rPr>
-          <w:rStyle w:val="markedcontent"/>
-          <w:rFonts w:ascii="Times New Roman" w:hAnsi="Times New Roman" w:cs="Times New Roman"/>
-          <w:sz w:val="24"/>
-          <w:szCs w:val="24"/>
-        </w:rPr>
-        <w:t xml:space="preserve">2 </w:t>
-      </w:r>
-      <w:r>
-        <w:rPr>
-          <w:rStyle w:val="markedcontent"/>
-          <w:rFonts w:ascii="Times New Roman" w:hAnsi="Times New Roman" w:cs="Times New Roman"/>
-          <w:sz w:val="24"/>
-          <w:szCs w:val="24"/>
-        </w:rPr>
-        <w:t xml:space="preserve">What is Life</w:t>
-      </w:r>
-      <w:r>
-        <w:rPr>
-          <w:rFonts w:ascii="Times New Roman" w:hAnsi="Times New Roman" w:cs="Times New Roman"/>
-          <w:sz w:val="24"/>
-          <w:szCs w:val="24"/>
-        </w:rPr>
-        <w:t/>
-      </w:r>
-    </w:p>
-    <w:p>
-      <w:pPr>
-        <w:rPr>
-          <w:rFonts w:ascii="Times New Roman" w:hAnsi="Times New Roman" w:cs="Times New Roman"/>
-          <w:sz w:val="24"/>
-          <w:szCs w:val="24"/>
-        </w:rPr>
-      </w:pPr>
-      <w:r>
-        <w:rPr>
-          <w:rFonts w:ascii="Times New Roman" w:hAnsi="Times New Roman" w:cs="Times New Roman"/>
-          <w:sz w:val="24"/>
-          <w:szCs w:val="24"/>
+        <w:spacing w:after="0" w:line="240" w:lineRule="auto"/>
+        <w:rPr>
+          <w:rFonts w:ascii="Times New Roman" w:hAnsi="Times New Roman" w:cs="Times New Roman"/>
+          <w:lang w:val="en-US"/>
+        </w:rPr>
+      </w:pPr>
+      <w:r>
+        <w:rPr>
+          <w:rStyle w:val="markedcontent"/>
+          <w:rFonts w:ascii="Times New Roman" w:hAnsi="Times New Roman" w:cs="Times New Roman"/>
+        </w:rPr>
+        <w:t xml:space="preserve">1</w:t>
+      </w:r>
+      <w:r>
+        <w:rPr>
+          <w:rStyle w:val="markedcontent"/>
+          <w:rFonts w:ascii="Times New Roman" w:hAnsi="Times New Roman" w:cs="Times New Roman"/>
+        </w:rPr>
+        <w:t xml:space="preserve">.</w:t>
+      </w:r>
+      <w:r>
+        <w:rPr>
+          <w:rStyle w:val="markedcontent"/>
+          <w:rFonts w:ascii="Times New Roman" w:hAnsi="Times New Roman" w:cs="Times New Roman"/>
+        </w:rPr>
+        <w:t xml:space="preserve"> What is Operating System?</w:t>
+      </w:r>
+      <w:r>
+        <w:rPr>
+          <w:rFonts w:ascii="Times New Roman" w:hAnsi="Times New Roman" w:cs="Times New Roman"/>
+        </w:rPr>
+        <w:t/>
+      </w:r>
+      <w:r>
+        <w:rPr>
+          <w:rStyle w:val="hljs-selector-id"/>
+          <w:rFonts w:ascii="Times New Roman" w:hAnsi="Times New Roman" w:cs="Times New Roman"/>
+        </w:rPr>
+        <w:t/>
+      </w:r>
+      <w:r>
+        <w:rPr>
+          <w:rFonts w:ascii="Times New Roman" w:hAnsi="Times New Roman" w:cs="Times New Roman"/>
+        </w:rPr>
+        <w:t/>
+      </w:r>
+    </w:p>
+    <w:p>
+      <w:pPr>
+        <w:spacing w:after="0" w:line="240" w:lineRule="auto"/>
+        <w:rPr>
+          <w:rFonts w:ascii="Times New Roman" w:hAnsi="Times New Roman" w:cs="Times New Roman"/>
+          <w:lang w:val="en-US"/>
+        </w:rPr>
+      </w:pPr>
+      <w:r>
+        <w:rPr>
+          <w:rFonts w:ascii="Times New Roman" w:hAnsi="Times New Roman" w:cs="Times New Roman"/>
+        </w:rPr>
+        <w:t xml:space="preserve">    </w:t>
+      </w:r>
+      <w:r>
+        <w:rPr>
+          <w:rFonts w:ascii="Times New Roman" w:hAnsi="Times New Roman" w:cs="Times New Roman"/>
+        </w:rPr>
+        <w:t xml:space="preserve">-Hi</w:t>
+      </w:r>
+      <w:r>
+        <w:rPr>
+          <w:rStyle w:val="hljs-selector-id"/>
+          <w:rFonts w:ascii="Times New Roman" w:hAnsi="Times New Roman" w:cs="Times New Roman"/>
+        </w:rPr>
+        <w:t/>
+      </w:r>
+      <w:r>
+        <w:rPr>
+          <w:rFonts w:ascii="Times New Roman" w:hAnsi="Times New Roman" w:cs="Times New Roman"/>
+        </w:rPr>
+        <w:t/>
+      </w:r>
+    </w:p>
+    <w:p>
+      <w:pPr>
+        <w:spacing w:after="0" w:line="240" w:lineRule="auto"/>
+        <w:rPr>
+          <w:rFonts w:ascii="Times New Roman" w:hAnsi="Times New Roman" w:cs="Times New Roman"/>
+          <w:lang w:val="en-US"/>
+        </w:rPr>
+      </w:pPr>
+      <w:r>
+        <w:rPr>
+          <w:rFonts w:ascii="Times New Roman" w:hAnsi="Times New Roman" w:cs="Times New Roman"/>
+        </w:rPr>
+        <w:t xml:space="preserve">    </w:t>
+      </w:r>
+      <w:r>
+        <w:rPr>
+          <w:rFonts w:ascii="Times New Roman" w:hAnsi="Times New Roman" w:cs="Times New Roman"/>
+        </w:rPr>
+        <w:t xml:space="preserve">-Hello</w:t>
+      </w:r>
+      <w:r>
+        <w:rPr>
+          <w:rStyle w:val="hljs-selector-id"/>
+          <w:rFonts w:ascii="Times New Roman" w:hAnsi="Times New Roman" w:cs="Times New Roman"/>
+        </w:rPr>
+        <w:t/>
+      </w:r>
+      <w:r>
+        <w:rPr>
+          <w:rFonts w:ascii="Times New Roman" w:hAnsi="Times New Roman" w:cs="Times New Roman"/>
+        </w:rPr>
+        <w:t/>
+      </w:r>
+    </w:p>
+    <w:p>
+      <w:pPr>
+        <w:spacing w:after="0" w:line="240" w:lineRule="auto"/>
+        <w:rPr>
+          <w:rFonts w:ascii="Times New Roman" w:hAnsi="Times New Roman" w:cs="Times New Roman"/>
+          <w:lang w:val="en-US"/>
+        </w:rPr>
+      </w:pPr>
+      <w:r>
+        <w:rPr>
+          <w:rFonts w:ascii="Times New Roman" w:hAnsi="Times New Roman" w:cs="Times New Roman"/>
+        </w:rPr>
+        <w:t xml:space="preserve">    </w:t>
+      </w:r>
+      <w:r>
+        <w:rPr>
+          <w:rFonts w:ascii="Times New Roman" w:hAnsi="Times New Roman" w:cs="Times New Roman"/>
+        </w:rPr>
+        <w:t xml:space="preserve">-Bye</w:t>
+      </w:r>
+    </w:p>
+    <w:p>
+      <w:pPr>
+        <w:spacing w:after="0" w:line="240" w:lineRule="auto"/>
+        <w:rPr>
+          <w:rFonts w:ascii="Times New Roman" w:hAnsi="Times New Roman" w:cs="Times New Roman"/>
+        </w:rPr>
+      </w:pPr>
+      <w:r>
+        <w:rPr>
+          <w:rFonts w:ascii="Times New Roman" w:hAnsi="Times New Roman" w:cs="Times New Roman"/>
         </w:rPr>
         <w:t xml:space="preserve"> </w:t>
       </w:r>
     </w:p>
     <w:p>
       <w:pPr>
-        <w:rPr>
-          <w:rFonts w:ascii="Times New Roman" w:hAnsi="Times New Roman" w:cs="Times New Roman"/>
-          <w:lang w:val="en-US"/>
-        </w:rPr>
-      </w:pPr>
-      <w:r>
-        <w:rPr>
-          <w:rStyle w:val="markedcontent"/>
-          <w:rFonts w:ascii="Times New Roman" w:hAnsi="Times New Roman" w:cs="Times New Roman"/>
-          <w:sz w:val="24"/>
-          <w:szCs w:val="24"/>
-        </w:rPr>
-        <w:t xml:space="preserve">3 </w:t>
-      </w:r>
-      <w:r>
-        <w:rPr>
-          <w:rStyle w:val="markedcontent"/>
-          <w:rFonts w:ascii="Times New Roman" w:hAnsi="Times New Roman" w:cs="Times New Roman"/>
-          <w:sz w:val="24"/>
-          <w:szCs w:val="24"/>
-        </w:rPr>
-        <w:t xml:space="preserve">What is Operating System</w:t>
-      </w:r>
-      <w:r>
-        <w:rPr>
-          <w:rFonts w:ascii="Times New Roman" w:hAnsi="Times New Roman" w:cs="Times New Roman"/>
-          <w:sz w:val="24"/>
-          <w:szCs w:val="24"/>
-        </w:rPr>
-        <w:t/>
-      </w:r>
-    </w:p>
-    <w:p>
-      <w:pPr>
-        <w:rPr>
-          <w:rFonts w:ascii="Times New Roman" w:hAnsi="Times New Roman" w:cs="Times New Roman"/>
-          <w:sz w:val="24"/>
-          <w:szCs w:val="24"/>
-        </w:rPr>
-      </w:pPr>
-      <w:r>
-        <w:rPr>
-          <w:rFonts w:ascii="Times New Roman" w:hAnsi="Times New Roman" w:cs="Times New Roman"/>
-          <w:sz w:val="24"/>
-          <w:szCs w:val="24"/>
+        <w:spacing w:after="0" w:line="240" w:lineRule="auto"/>
+        <w:rPr>
+          <w:rFonts w:ascii="Times New Roman" w:hAnsi="Times New Roman" w:cs="Times New Roman"/>
+          <w:lang w:val="en-US"/>
+        </w:rPr>
+      </w:pPr>
+      <w:r>
+        <w:rPr>
+          <w:rStyle w:val="markedcontent"/>
+          <w:rFonts w:ascii="Times New Roman" w:hAnsi="Times New Roman" w:cs="Times New Roman"/>
+        </w:rPr>
+        <w:t xml:space="preserve">2</w:t>
+      </w:r>
+      <w:r>
+        <w:rPr>
+          <w:rStyle w:val="markedcontent"/>
+          <w:rFonts w:ascii="Times New Roman" w:hAnsi="Times New Roman" w:cs="Times New Roman"/>
+        </w:rPr>
+        <w:t xml:space="preserve">.</w:t>
+      </w:r>
+      <w:r>
+        <w:rPr>
+          <w:rStyle w:val="markedcontent"/>
+          <w:rFonts w:ascii="Times New Roman" w:hAnsi="Times New Roman" w:cs="Times New Roman"/>
+        </w:rPr>
+        <w:t xml:space="preserve"> What is Operating System?</w:t>
+      </w:r>
+      <w:r>
+        <w:rPr>
+          <w:rFonts w:ascii="Times New Roman" w:hAnsi="Times New Roman" w:cs="Times New Roman"/>
+        </w:rPr>
+        <w:t/>
+      </w:r>
+      <w:r>
+        <w:rPr>
+          <w:rStyle w:val="hljs-selector-id"/>
+          <w:rFonts w:ascii="Times New Roman" w:hAnsi="Times New Roman" w:cs="Times New Roman"/>
+        </w:rPr>
+        <w:t/>
+      </w:r>
+      <w:r>
+        <w:rPr>
+          <w:rFonts w:ascii="Times New Roman" w:hAnsi="Times New Roman" w:cs="Times New Roman"/>
+        </w:rPr>
+        <w:t/>
+      </w:r>
+    </w:p>
+    <w:p>
+      <w:pPr>
+        <w:spacing w:after="0" w:line="240" w:lineRule="auto"/>
+        <w:rPr>
+          <w:rFonts w:ascii="Times New Roman" w:hAnsi="Times New Roman" w:cs="Times New Roman"/>
+          <w:lang w:val="en-US"/>
+        </w:rPr>
+      </w:pPr>
+      <w:r>
+        <w:rPr>
+          <w:rFonts w:ascii="Times New Roman" w:hAnsi="Times New Roman" w:cs="Times New Roman"/>
+        </w:rPr>
+        <w:t xml:space="preserve">    </w:t>
+      </w:r>
+      <w:r>
+        <w:rPr>
+          <w:rFonts w:ascii="Times New Roman" w:hAnsi="Times New Roman" w:cs="Times New Roman"/>
+        </w:rPr>
+        <w:t xml:space="preserve">-Hi</w:t>
+      </w:r>
+      <w:r>
+        <w:rPr>
+          <w:rStyle w:val="hljs-selector-id"/>
+          <w:rFonts w:ascii="Times New Roman" w:hAnsi="Times New Roman" w:cs="Times New Roman"/>
+        </w:rPr>
+        <w:t/>
+      </w:r>
+      <w:r>
+        <w:rPr>
+          <w:rFonts w:ascii="Times New Roman" w:hAnsi="Times New Roman" w:cs="Times New Roman"/>
+        </w:rPr>
+        <w:t/>
+      </w:r>
+    </w:p>
+    <w:p>
+      <w:pPr>
+        <w:spacing w:after="0" w:line="240" w:lineRule="auto"/>
+        <w:rPr>
+          <w:rFonts w:ascii="Times New Roman" w:hAnsi="Times New Roman" w:cs="Times New Roman"/>
+          <w:lang w:val="en-US"/>
+        </w:rPr>
+      </w:pPr>
+      <w:r>
+        <w:rPr>
+          <w:rFonts w:ascii="Times New Roman" w:hAnsi="Times New Roman" w:cs="Times New Roman"/>
+        </w:rPr>
+        <w:t xml:space="preserve">    </w:t>
+      </w:r>
+      <w:r>
+        <w:rPr>
+          <w:rFonts w:ascii="Times New Roman" w:hAnsi="Times New Roman" w:cs="Times New Roman"/>
+        </w:rPr>
+        <w:t xml:space="preserve">-Hello</w:t>
+      </w:r>
+      <w:r>
+        <w:rPr>
+          <w:rStyle w:val="hljs-selector-id"/>
+          <w:rFonts w:ascii="Times New Roman" w:hAnsi="Times New Roman" w:cs="Times New Roman"/>
+        </w:rPr>
+        <w:t/>
+      </w:r>
+      <w:r>
+        <w:rPr>
+          <w:rFonts w:ascii="Times New Roman" w:hAnsi="Times New Roman" w:cs="Times New Roman"/>
+        </w:rPr>
+        <w:t/>
+      </w:r>
+    </w:p>
+    <w:p>
+      <w:pPr>
+        <w:spacing w:after="0" w:line="240" w:lineRule="auto"/>
+        <w:rPr>
+          <w:rFonts w:ascii="Times New Roman" w:hAnsi="Times New Roman" w:cs="Times New Roman"/>
+          <w:lang w:val="en-US"/>
+        </w:rPr>
+      </w:pPr>
+      <w:r>
+        <w:rPr>
+          <w:rFonts w:ascii="Times New Roman" w:hAnsi="Times New Roman" w:cs="Times New Roman"/>
+        </w:rPr>
+        <w:t xml:space="preserve">    </w:t>
+      </w:r>
+      <w:r>
+        <w:rPr>
+          <w:rFonts w:ascii="Times New Roman" w:hAnsi="Times New Roman" w:cs="Times New Roman"/>
+        </w:rPr>
+        <w:t xml:space="preserve">-Bye</w:t>
+      </w:r>
+    </w:p>
+    <w:p>
+      <w:pPr>
+        <w:spacing w:after="0" w:line="240" w:lineRule="auto"/>
+        <w:rPr>
+          <w:rFonts w:ascii="Times New Roman" w:hAnsi="Times New Roman" w:cs="Times New Roman"/>
+        </w:rPr>
+      </w:pPr>
+      <w:r>
+        <w:rPr>
+          <w:rFonts w:ascii="Times New Roman" w:hAnsi="Times New Roman" w:cs="Times New Roman"/>
         </w:rPr>
         <w:t xml:space="preserve"> </w:t>
       </w:r>
     </w:p>
     <w:p>
       <w:pPr>
-        <w:rPr>
-          <w:rFonts w:ascii="Times New Roman" w:hAnsi="Times New Roman" w:cs="Times New Roman"/>
-          <w:lang w:val="en-US"/>
-        </w:rPr>
-      </w:pPr>
-      <w:r>
-        <w:rPr>
-          <w:rStyle w:val="markedcontent"/>
-          <w:rFonts w:ascii="Times New Roman" w:hAnsi="Times New Roman" w:cs="Times New Roman"/>
-          <w:sz w:val="24"/>
-          <w:szCs w:val="24"/>
-        </w:rPr>
-        <w:t xml:space="preserve">4 </w:t>
-      </w:r>
-      <w:r>
-        <w:rPr>
-          <w:rStyle w:val="markedcontent"/>
-          <w:rFonts w:ascii="Times New Roman" w:hAnsi="Times New Roman" w:cs="Times New Roman"/>
-          <w:sz w:val="24"/>
-          <w:szCs w:val="24"/>
-        </w:rPr>
-        <w:t xml:space="preserve">What is Operating System</w:t>
-      </w:r>
-      <w:r>
-        <w:rPr>
-          <w:rFonts w:ascii="Times New Roman" w:hAnsi="Times New Roman" w:cs="Times New Roman"/>
-          <w:sz w:val="24"/>
-          <w:szCs w:val="24"/>
-        </w:rPr>
-        <w:t/>
-      </w:r>
-      <w:r>
-        <w:rPr>
-          <w:rStyle w:val="hljs-selector-id"/>
-          <w:rFonts w:ascii="Times New Roman" w:hAnsi="Times New Roman" w:cs="Times New Roman"/>
-          <w:sz w:val="24"/>
-          <w:szCs w:val="24"/>
-        </w:rPr>
-        <w:t/>
-      </w:r>
-      <w:r>
-        <w:rPr>
-          <w:rFonts w:ascii="Times New Roman" w:hAnsi="Times New Roman" w:cs="Times New Roman"/>
-          <w:sz w:val="24"/>
-          <w:szCs w:val="24"/>
-        </w:rPr>
-        <w:t/>
-      </w:r>
-    </w:p>
-    <w:p>
-      <w:pPr>
-        <w:rPr>
-          <w:rFonts w:ascii="Times New Roman" w:hAnsi="Times New Roman" w:cs="Times New Roman"/>
-          <w:sz w:val="24"/>
-          <w:szCs w:val="24"/>
-        </w:rPr>
-      </w:pPr>
-      <w:r>
-        <w:rPr>
-          <w:rFonts w:ascii="Times New Roman" w:hAnsi="Times New Roman" w:cs="Times New Roman"/>
-          <w:sz w:val="24"/>
-          <w:szCs w:val="24"/>
-        </w:rPr>
-        <w:t xml:space="preserve"> -Hi</w:t>
-      </w:r>
-      <w:r>
-        <w:rPr>
-          <w:rStyle w:val="hljs-selector-id"/>
-          <w:rFonts w:ascii="Times New Roman" w:hAnsi="Times New Roman" w:cs="Times New Roman"/>
-          <w:sz w:val="24"/>
-          <w:szCs w:val="24"/>
-        </w:rPr>
-        <w:t/>
-      </w:r>
-      <w:r>
-        <w:rPr>
-          <w:rFonts w:ascii="Times New Roman" w:hAnsi="Times New Roman" w:cs="Times New Roman"/>
-          <w:sz w:val="24"/>
-          <w:szCs w:val="24"/>
-        </w:rPr>
-        <w:t/>
-      </w:r>
-    </w:p>
-    <w:p>
-      <w:pPr>
-        <w:rPr>
-          <w:rFonts w:ascii="Times New Roman" w:hAnsi="Times New Roman" w:cs="Times New Roman"/>
-          <w:sz w:val="24"/>
-          <w:szCs w:val="24"/>
-        </w:rPr>
-      </w:pPr>
-      <w:r>
-        <w:rPr>
-          <w:rFonts w:ascii="Times New Roman" w:hAnsi="Times New Roman" w:cs="Times New Roman"/>
-          <w:sz w:val="24"/>
-          <w:szCs w:val="24"/>
-        </w:rPr>
-        <w:t xml:space="preserve"> -Hello</w:t>
-      </w:r>
-      <w:r>
-        <w:rPr>
-          <w:rStyle w:val="hljs-selector-id"/>
-          <w:rFonts w:ascii="Times New Roman" w:hAnsi="Times New Roman" w:cs="Times New Roman"/>
-          <w:sz w:val="24"/>
-          <w:szCs w:val="24"/>
-        </w:rPr>
-        <w:t/>
-      </w:r>
-      <w:r>
-        <w:rPr>
-          <w:rFonts w:ascii="Times New Roman" w:hAnsi="Times New Roman" w:cs="Times New Roman"/>
-          <w:sz w:val="24"/>
-          <w:szCs w:val="24"/>
-        </w:rPr>
-        <w:t/>
-      </w:r>
-    </w:p>
-    <w:p>
-      <w:pPr>
-        <w:rPr>
-          <w:rFonts w:ascii="Times New Roman" w:hAnsi="Times New Roman" w:cs="Times New Roman"/>
-          <w:sz w:val="24"/>
-          <w:szCs w:val="24"/>
-        </w:rPr>
-      </w:pPr>
-      <w:r>
-        <w:rPr>
-          <w:rFonts w:ascii="Times New Roman" w:hAnsi="Times New Roman" w:cs="Times New Roman"/>
-          <w:sz w:val="24"/>
-          <w:szCs w:val="24"/>
-        </w:rPr>
-        <w:t xml:space="preserve"> -Bye</w:t>
-      </w:r>
-    </w:p>
-    <w:p>
-      <w:pPr>
-        <w:rPr>
-          <w:rFonts w:ascii="Times New Roman" w:hAnsi="Times New Roman" w:cs="Times New Roman"/>
-          <w:sz w:val="24"/>
-          <w:szCs w:val="24"/>
-        </w:rPr>
-      </w:pPr>
-      <w:r>
-        <w:rPr>
-          <w:rFonts w:ascii="Times New Roman" w:hAnsi="Times New Roman" w:cs="Times New Roman"/>
-          <w:sz w:val="24"/>
-          <w:szCs w:val="24"/>
+        <w:spacing w:after="0" w:line="240" w:lineRule="auto"/>
+        <w:rPr>
+          <w:rFonts w:ascii="Times New Roman" w:hAnsi="Times New Roman" w:cs="Times New Roman"/>
+          <w:lang w:val="en-US"/>
+        </w:rPr>
+      </w:pPr>
+      <w:r>
+        <w:rPr>
+          <w:rStyle w:val="markedcontent"/>
+          <w:rFonts w:ascii="Times New Roman" w:hAnsi="Times New Roman" w:cs="Times New Roman"/>
+        </w:rPr>
+        <w:t xml:space="preserve">3</w:t>
+      </w:r>
+      <w:r>
+        <w:rPr>
+          <w:rStyle w:val="markedcontent"/>
+          <w:rFonts w:ascii="Times New Roman" w:hAnsi="Times New Roman" w:cs="Times New Roman"/>
+        </w:rPr>
+        <w:t xml:space="preserve">.</w:t>
+      </w:r>
+      <w:r>
+        <w:rPr>
+          <w:rStyle w:val="markedcontent"/>
+          <w:rFonts w:ascii="Times New Roman" w:hAnsi="Times New Roman" w:cs="Times New Roman"/>
+        </w:rPr>
+        <w:t xml:space="preserve"> What is Operating System?</w:t>
+      </w:r>
+      <w:r>
+        <w:rPr>
+          <w:rFonts w:ascii="Times New Roman" w:hAnsi="Times New Roman" w:cs="Times New Roman"/>
+        </w:rPr>
+        <w:t/>
+      </w:r>
+      <w:r>
+        <w:rPr>
+          <w:rStyle w:val="hljs-selector-id"/>
+          <w:rFonts w:ascii="Times New Roman" w:hAnsi="Times New Roman" w:cs="Times New Roman"/>
+        </w:rPr>
+        <w:t/>
+      </w:r>
+      <w:r>
+        <w:rPr>
+          <w:rFonts w:ascii="Times New Roman" w:hAnsi="Times New Roman" w:cs="Times New Roman"/>
+        </w:rPr>
+        <w:t/>
+      </w:r>
+    </w:p>
+    <w:p>
+      <w:pPr>
+        <w:spacing w:after="0" w:line="240" w:lineRule="auto"/>
+        <w:rPr>
+          <w:rFonts w:ascii="Times New Roman" w:hAnsi="Times New Roman" w:cs="Times New Roman"/>
+          <w:lang w:val="en-US"/>
+        </w:rPr>
+      </w:pPr>
+      <w:r>
+        <w:rPr>
+          <w:rFonts w:ascii="Times New Roman" w:hAnsi="Times New Roman" w:cs="Times New Roman"/>
+        </w:rPr>
+        <w:t xml:space="preserve">    </w:t>
+      </w:r>
+      <w:r>
+        <w:rPr>
+          <w:rFonts w:ascii="Times New Roman" w:hAnsi="Times New Roman" w:cs="Times New Roman"/>
+        </w:rPr>
+        <w:t xml:space="preserve">-Hi</w:t>
+      </w:r>
+      <w:r>
+        <w:rPr>
+          <w:rStyle w:val="hljs-selector-id"/>
+          <w:rFonts w:ascii="Times New Roman" w:hAnsi="Times New Roman" w:cs="Times New Roman"/>
+        </w:rPr>
+        <w:t/>
+      </w:r>
+      <w:r>
+        <w:rPr>
+          <w:rFonts w:ascii="Times New Roman" w:hAnsi="Times New Roman" w:cs="Times New Roman"/>
+        </w:rPr>
+        <w:t/>
+      </w:r>
+    </w:p>
+    <w:p>
+      <w:pPr>
+        <w:spacing w:after="0" w:line="240" w:lineRule="auto"/>
+        <w:rPr>
+          <w:rFonts w:ascii="Times New Roman" w:hAnsi="Times New Roman" w:cs="Times New Roman"/>
+          <w:lang w:val="en-US"/>
+        </w:rPr>
+      </w:pPr>
+      <w:r>
+        <w:rPr>
+          <w:rFonts w:ascii="Times New Roman" w:hAnsi="Times New Roman" w:cs="Times New Roman"/>
+        </w:rPr>
+        <w:t xml:space="preserve">    </w:t>
+      </w:r>
+      <w:r>
+        <w:rPr>
+          <w:rFonts w:ascii="Times New Roman" w:hAnsi="Times New Roman" w:cs="Times New Roman"/>
+        </w:rPr>
+        <w:t xml:space="preserve">-Hello</w:t>
+      </w:r>
+      <w:r>
+        <w:rPr>
+          <w:rStyle w:val="hljs-selector-id"/>
+          <w:rFonts w:ascii="Times New Roman" w:hAnsi="Times New Roman" w:cs="Times New Roman"/>
+        </w:rPr>
+        <w:t/>
+      </w:r>
+      <w:r>
+        <w:rPr>
+          <w:rFonts w:ascii="Times New Roman" w:hAnsi="Times New Roman" w:cs="Times New Roman"/>
+        </w:rPr>
+        <w:t/>
+      </w:r>
+    </w:p>
+    <w:p>
+      <w:pPr>
+        <w:spacing w:after="0" w:line="240" w:lineRule="auto"/>
+        <w:rPr>
+          <w:rFonts w:ascii="Times New Roman" w:hAnsi="Times New Roman" w:cs="Times New Roman"/>
+          <w:lang w:val="en-US"/>
+        </w:rPr>
+      </w:pPr>
+      <w:r>
+        <w:rPr>
+          <w:rFonts w:ascii="Times New Roman" w:hAnsi="Times New Roman" w:cs="Times New Roman"/>
+        </w:rPr>
+        <w:t xml:space="preserve">    </w:t>
+      </w:r>
+      <w:r>
+        <w:rPr>
+          <w:rFonts w:ascii="Times New Roman" w:hAnsi="Times New Roman" w:cs="Times New Roman"/>
+        </w:rPr>
+        <w:t xml:space="preserve">-Bye</w:t>
+      </w:r>
+    </w:p>
+    <w:p>
+      <w:pPr>
+        <w:spacing w:after="0" w:line="240" w:lineRule="auto"/>
+        <w:rPr>
+          <w:rFonts w:ascii="Times New Roman" w:hAnsi="Times New Roman" w:cs="Times New Roman"/>
+        </w:rPr>
+      </w:pPr>
+      <w:r>
+        <w:rPr>
+          <w:rFonts w:ascii="Times New Roman" w:hAnsi="Times New Roman" w:cs="Times New Roman"/>
+        </w:rPr>
+        <w:t xml:space="preserve"> </w:t>
+      </w:r>
+    </w:p>
+    <w:p>
+      <w:pPr>
+        <w:spacing w:after="0" w:line="240" w:lineRule="auto"/>
+        <w:rPr>
+          <w:rFonts w:ascii="Times New Roman" w:hAnsi="Times New Roman" w:cs="Times New Roman"/>
+          <w:lang w:val="en-US"/>
+        </w:rPr>
+      </w:pPr>
+      <w:r>
+        <w:rPr>
+          <w:rStyle w:val="markedcontent"/>
+          <w:rFonts w:ascii="Times New Roman" w:hAnsi="Times New Roman" w:cs="Times New Roman"/>
+        </w:rPr>
+        <w:t xml:space="preserve">4</w:t>
+      </w:r>
+      <w:r>
+        <w:rPr>
+          <w:rStyle w:val="markedcontent"/>
+          <w:rFonts w:ascii="Times New Roman" w:hAnsi="Times New Roman" w:cs="Times New Roman"/>
+        </w:rPr>
+        <w:t xml:space="preserve">.</w:t>
+      </w:r>
+      <w:r>
+        <w:rPr>
+          <w:rStyle w:val="markedcontent"/>
+          <w:rFonts w:ascii="Times New Roman" w:hAnsi="Times New Roman" w:cs="Times New Roman"/>
+        </w:rPr>
+        <w:t xml:space="preserve"> What is Operating System?</w:t>
+      </w:r>
+      <w:r>
+        <w:rPr>
+          <w:rFonts w:ascii="Times New Roman" w:hAnsi="Times New Roman" w:cs="Times New Roman"/>
+        </w:rPr>
+        <w:t/>
+      </w:r>
+      <w:r>
+        <w:rPr>
+          <w:rStyle w:val="hljs-selector-id"/>
+          <w:rFonts w:ascii="Times New Roman" w:hAnsi="Times New Roman" w:cs="Times New Roman"/>
+        </w:rPr>
+        <w:t/>
+      </w:r>
+      <w:r>
+        <w:rPr>
+          <w:rFonts w:ascii="Times New Roman" w:hAnsi="Times New Roman" w:cs="Times New Roman"/>
+        </w:rPr>
+        <w:t/>
+      </w:r>
+    </w:p>
+    <w:p>
+      <w:pPr>
+        <w:spacing w:after="0" w:line="240" w:lineRule="auto"/>
+        <w:rPr>
+          <w:rFonts w:ascii="Times New Roman" w:hAnsi="Times New Roman" w:cs="Times New Roman"/>
+          <w:lang w:val="en-US"/>
+        </w:rPr>
+      </w:pPr>
+      <w:r>
+        <w:rPr>
+          <w:rFonts w:ascii="Times New Roman" w:hAnsi="Times New Roman" w:cs="Times New Roman"/>
+        </w:rPr>
+        <w:t xml:space="preserve">    </w:t>
+      </w:r>
+      <w:r>
+        <w:rPr>
+          <w:rFonts w:ascii="Times New Roman" w:hAnsi="Times New Roman" w:cs="Times New Roman"/>
+        </w:rPr>
+        <w:t xml:space="preserve">-Hi</w:t>
+      </w:r>
+      <w:r>
+        <w:rPr>
+          <w:rStyle w:val="hljs-selector-id"/>
+          <w:rFonts w:ascii="Times New Roman" w:hAnsi="Times New Roman" w:cs="Times New Roman"/>
+        </w:rPr>
+        <w:t/>
+      </w:r>
+      <w:r>
+        <w:rPr>
+          <w:rFonts w:ascii="Times New Roman" w:hAnsi="Times New Roman" w:cs="Times New Roman"/>
+        </w:rPr>
+        <w:t/>
+      </w:r>
+    </w:p>
+    <w:p>
+      <w:pPr>
+        <w:spacing w:after="0" w:line="240" w:lineRule="auto"/>
+        <w:rPr>
+          <w:rFonts w:ascii="Times New Roman" w:hAnsi="Times New Roman" w:cs="Times New Roman"/>
+          <w:lang w:val="en-US"/>
+        </w:rPr>
+      </w:pPr>
+      <w:r>
+        <w:rPr>
+          <w:rFonts w:ascii="Times New Roman" w:hAnsi="Times New Roman" w:cs="Times New Roman"/>
+        </w:rPr>
+        <w:t xml:space="preserve">    </w:t>
+      </w:r>
+      <w:r>
+        <w:rPr>
+          <w:rFonts w:ascii="Times New Roman" w:hAnsi="Times New Roman" w:cs="Times New Roman"/>
+        </w:rPr>
+        <w:t xml:space="preserve">-Hello</w:t>
+      </w:r>
+      <w:r>
+        <w:rPr>
+          <w:rStyle w:val="hljs-selector-id"/>
+          <w:rFonts w:ascii="Times New Roman" w:hAnsi="Times New Roman" w:cs="Times New Roman"/>
+        </w:rPr>
+        <w:t/>
+      </w:r>
+      <w:r>
+        <w:rPr>
+          <w:rFonts w:ascii="Times New Roman" w:hAnsi="Times New Roman" w:cs="Times New Roman"/>
+        </w:rPr>
+        <w:t/>
+      </w:r>
+    </w:p>
+    <w:p>
+      <w:pPr>
+        <w:spacing w:after="0" w:line="240" w:lineRule="auto"/>
+        <w:rPr>
+          <w:rFonts w:ascii="Times New Roman" w:hAnsi="Times New Roman" w:cs="Times New Roman"/>
+          <w:lang w:val="en-US"/>
+        </w:rPr>
+      </w:pPr>
+      <w:r>
+        <w:rPr>
+          <w:rFonts w:ascii="Times New Roman" w:hAnsi="Times New Roman" w:cs="Times New Roman"/>
+        </w:rPr>
+        <w:t xml:space="preserve">    </w:t>
+      </w:r>
+      <w:r>
+        <w:rPr>
+          <w:rFonts w:ascii="Times New Roman" w:hAnsi="Times New Roman" w:cs="Times New Roman"/>
+        </w:rPr>
+        <w:t xml:space="preserve">-Bye</w:t>
+      </w:r>
+    </w:p>
+    <w:p>
+      <w:pPr>
+        <w:spacing w:after="0" w:line="240" w:lineRule="auto"/>
+        <w:rPr>
+          <w:rFonts w:ascii="Times New Roman" w:hAnsi="Times New Roman" w:cs="Times New Roman"/>
+        </w:rPr>
+      </w:pPr>
+      <w:r>
+        <w:rPr>
+          <w:rFonts w:ascii="Times New Roman" w:hAnsi="Times New Roman" w:cs="Times New Roman"/>
+        </w:rPr>
+        <w:t xml:space="preserve"> </w:t>
+      </w:r>
+    </w:p>
+    <w:p>
+      <w:pPr>
+        <w:spacing w:after="0" w:line="240" w:lineRule="auto"/>
+        <w:rPr>
+          <w:rFonts w:ascii="Times New Roman" w:hAnsi="Times New Roman" w:cs="Times New Roman"/>
+          <w:lang w:val="en-US"/>
+        </w:rPr>
+      </w:pPr>
+      <w:r>
+        <w:rPr>
+          <w:rStyle w:val="markedcontent"/>
+          <w:rFonts w:ascii="Times New Roman" w:hAnsi="Times New Roman" w:cs="Times New Roman"/>
+        </w:rPr>
+        <w:t xml:space="preserve">5</w:t>
+      </w:r>
+      <w:r>
+        <w:rPr>
+          <w:rStyle w:val="markedcontent"/>
+          <w:rFonts w:ascii="Times New Roman" w:hAnsi="Times New Roman" w:cs="Times New Roman"/>
+        </w:rPr>
+        <w:t xml:space="preserve">.</w:t>
+      </w:r>
+      <w:r>
+        <w:rPr>
+          <w:rStyle w:val="markedcontent"/>
+          <w:rFonts w:ascii="Times New Roman" w:hAnsi="Times New Roman" w:cs="Times New Roman"/>
+        </w:rPr>
+        <w:t xml:space="preserve"> What is Operating System?</w:t>
+      </w:r>
+      <w:r>
+        <w:rPr>
+          <w:rFonts w:ascii="Times New Roman" w:hAnsi="Times New Roman" w:cs="Times New Roman"/>
+        </w:rPr>
+        <w:t/>
+      </w:r>
+      <w:r>
+        <w:rPr>
+          <w:rStyle w:val="hljs-selector-id"/>
+          <w:rFonts w:ascii="Times New Roman" w:hAnsi="Times New Roman" w:cs="Times New Roman"/>
+        </w:rPr>
+        <w:t/>
+      </w:r>
+      <w:r>
+        <w:rPr>
+          <w:rFonts w:ascii="Times New Roman" w:hAnsi="Times New Roman" w:cs="Times New Roman"/>
+        </w:rPr>
+        <w:t/>
+      </w:r>
+    </w:p>
+    <w:p>
+      <w:pPr>
+        <w:spacing w:after="0" w:line="240" w:lineRule="auto"/>
+        <w:rPr>
+          <w:rFonts w:ascii="Times New Roman" w:hAnsi="Times New Roman" w:cs="Times New Roman"/>
+          <w:lang w:val="en-US"/>
+        </w:rPr>
+      </w:pPr>
+      <w:r>
+        <w:rPr>
+          <w:rFonts w:ascii="Times New Roman" w:hAnsi="Times New Roman" w:cs="Times New Roman"/>
+        </w:rPr>
+        <w:t xml:space="preserve">    </w:t>
+      </w:r>
+      <w:r>
+        <w:rPr>
+          <w:rFonts w:ascii="Times New Roman" w:hAnsi="Times New Roman" w:cs="Times New Roman"/>
+        </w:rPr>
+        <w:t xml:space="preserve">-Hi</w:t>
+      </w:r>
+      <w:r>
+        <w:rPr>
+          <w:rStyle w:val="hljs-selector-id"/>
+          <w:rFonts w:ascii="Times New Roman" w:hAnsi="Times New Roman" w:cs="Times New Roman"/>
+        </w:rPr>
+        <w:t/>
+      </w:r>
+      <w:r>
+        <w:rPr>
+          <w:rFonts w:ascii="Times New Roman" w:hAnsi="Times New Roman" w:cs="Times New Roman"/>
+        </w:rPr>
+        <w:t/>
+      </w:r>
+    </w:p>
+    <w:p>
+      <w:pPr>
+        <w:spacing w:after="0" w:line="240" w:lineRule="auto"/>
+        <w:rPr>
+          <w:rFonts w:ascii="Times New Roman" w:hAnsi="Times New Roman" w:cs="Times New Roman"/>
+          <w:lang w:val="en-US"/>
+        </w:rPr>
+      </w:pPr>
+      <w:r>
+        <w:rPr>
+          <w:rFonts w:ascii="Times New Roman" w:hAnsi="Times New Roman" w:cs="Times New Roman"/>
+        </w:rPr>
+        <w:t xml:space="preserve">    </w:t>
+      </w:r>
+      <w:r>
+        <w:rPr>
+          <w:rFonts w:ascii="Times New Roman" w:hAnsi="Times New Roman" w:cs="Times New Roman"/>
+        </w:rPr>
+        <w:t xml:space="preserve">-Hello</w:t>
+      </w:r>
+      <w:r>
+        <w:rPr>
+          <w:rStyle w:val="hljs-selector-id"/>
+          <w:rFonts w:ascii="Times New Roman" w:hAnsi="Times New Roman" w:cs="Times New Roman"/>
+        </w:rPr>
+        <w:t/>
+      </w:r>
+      <w:r>
+        <w:rPr>
+          <w:rFonts w:ascii="Times New Roman" w:hAnsi="Times New Roman" w:cs="Times New Roman"/>
+        </w:rPr>
+        <w:t/>
+      </w:r>
+    </w:p>
+    <w:p>
+      <w:pPr>
+        <w:spacing w:after="0" w:line="240" w:lineRule="auto"/>
+        <w:rPr>
+          <w:rFonts w:ascii="Times New Roman" w:hAnsi="Times New Roman" w:cs="Times New Roman"/>
+          <w:lang w:val="en-US"/>
+        </w:rPr>
+      </w:pPr>
+      <w:r>
+        <w:rPr>
+          <w:rFonts w:ascii="Times New Roman" w:hAnsi="Times New Roman" w:cs="Times New Roman"/>
+        </w:rPr>
+        <w:t xml:space="preserve">    </w:t>
+      </w:r>
+      <w:r>
+        <w:rPr>
+          <w:rFonts w:ascii="Times New Roman" w:hAnsi="Times New Roman" w:cs="Times New Roman"/>
+        </w:rPr>
+        <w:t xml:space="preserve">-Bye</w:t>
+      </w:r>
+    </w:p>
+    <w:p>
+      <w:pPr>
+        <w:spacing w:after="0" w:line="240" w:lineRule="auto"/>
+        <w:rPr>
+          <w:rFonts w:ascii="Times New Roman" w:hAnsi="Times New Roman" w:cs="Times New Roman"/>
+        </w:rPr>
+      </w:pPr>
+      <w:r>
+        <w:rPr>
+          <w:rFonts w:ascii="Times New Roman" w:hAnsi="Times New Roman" w:cs="Times New Roman"/>
+        </w:rPr>
+        <w:t xml:space="preserve"> </w:t>
+      </w:r>
+    </w:p>
+    <w:p>
+      <w:pPr>
+        <w:spacing w:after="0" w:line="240" w:lineRule="auto"/>
+        <w:rPr>
+          <w:rFonts w:ascii="Times New Roman" w:hAnsi="Times New Roman" w:cs="Times New Roman"/>
+          <w:lang w:val="en-US"/>
+        </w:rPr>
+      </w:pPr>
+      <w:r>
+        <w:rPr>
+          <w:rStyle w:val="markedcontent"/>
+          <w:rFonts w:ascii="Times New Roman" w:hAnsi="Times New Roman" w:cs="Times New Roman"/>
+        </w:rPr>
+        <w:t xml:space="preserve">6</w:t>
+      </w:r>
+      <w:r>
+        <w:rPr>
+          <w:rStyle w:val="markedcontent"/>
+          <w:rFonts w:ascii="Times New Roman" w:hAnsi="Times New Roman" w:cs="Times New Roman"/>
+        </w:rPr>
+        <w:t xml:space="preserve">.</w:t>
+      </w:r>
+      <w:r>
+        <w:rPr>
+          <w:rStyle w:val="markedcontent"/>
+          <w:rFonts w:ascii="Times New Roman" w:hAnsi="Times New Roman" w:cs="Times New Roman"/>
+        </w:rPr>
+        <w:t xml:space="preserve"> What is Operating System?</w:t>
+      </w:r>
+      <w:r>
+        <w:rPr>
+          <w:rFonts w:ascii="Times New Roman" w:hAnsi="Times New Roman" w:cs="Times New Roman"/>
+        </w:rPr>
+        <w:t/>
+      </w:r>
+      <w:r>
+        <w:rPr>
+          <w:rStyle w:val="hljs-selector-id"/>
+          <w:rFonts w:ascii="Times New Roman" w:hAnsi="Times New Roman" w:cs="Times New Roman"/>
+        </w:rPr>
+        <w:t/>
+      </w:r>
+      <w:r>
+        <w:rPr>
+          <w:rFonts w:ascii="Times New Roman" w:hAnsi="Times New Roman" w:cs="Times New Roman"/>
+        </w:rPr>
+        <w:t/>
+      </w:r>
+    </w:p>
+    <w:p>
+      <w:pPr>
+        <w:spacing w:after="0" w:line="240" w:lineRule="auto"/>
+        <w:rPr>
+          <w:rFonts w:ascii="Times New Roman" w:hAnsi="Times New Roman" w:cs="Times New Roman"/>
+          <w:lang w:val="en-US"/>
+        </w:rPr>
+      </w:pPr>
+      <w:r>
+        <w:rPr>
+          <w:rFonts w:ascii="Times New Roman" w:hAnsi="Times New Roman" w:cs="Times New Roman"/>
+        </w:rPr>
+        <w:t xml:space="preserve">    </w:t>
+      </w:r>
+      <w:r>
+        <w:rPr>
+          <w:rFonts w:ascii="Times New Roman" w:hAnsi="Times New Roman" w:cs="Times New Roman"/>
+        </w:rPr>
+        <w:t xml:space="preserve">-Hi</w:t>
+      </w:r>
+      <w:r>
+        <w:rPr>
+          <w:rStyle w:val="hljs-selector-id"/>
+          <w:rFonts w:ascii="Times New Roman" w:hAnsi="Times New Roman" w:cs="Times New Roman"/>
+        </w:rPr>
+        <w:t/>
+      </w:r>
+      <w:r>
+        <w:rPr>
+          <w:rFonts w:ascii="Times New Roman" w:hAnsi="Times New Roman" w:cs="Times New Roman"/>
+        </w:rPr>
+        <w:t/>
+      </w:r>
+    </w:p>
+    <w:p>
+      <w:pPr>
+        <w:spacing w:after="0" w:line="240" w:lineRule="auto"/>
+        <w:rPr>
+          <w:rFonts w:ascii="Times New Roman" w:hAnsi="Times New Roman" w:cs="Times New Roman"/>
+          <w:lang w:val="en-US"/>
+        </w:rPr>
+      </w:pPr>
+      <w:r>
+        <w:rPr>
+          <w:rFonts w:ascii="Times New Roman" w:hAnsi="Times New Roman" w:cs="Times New Roman"/>
+        </w:rPr>
+        <w:t xml:space="preserve">    </w:t>
+      </w:r>
+      <w:r>
+        <w:rPr>
+          <w:rFonts w:ascii="Times New Roman" w:hAnsi="Times New Roman" w:cs="Times New Roman"/>
+        </w:rPr>
+        <w:t xml:space="preserve">-Hello</w:t>
+      </w:r>
+      <w:r>
+        <w:rPr>
+          <w:rStyle w:val="hljs-selector-id"/>
+          <w:rFonts w:ascii="Times New Roman" w:hAnsi="Times New Roman" w:cs="Times New Roman"/>
+        </w:rPr>
+        <w:t/>
+      </w:r>
+      <w:r>
+        <w:rPr>
+          <w:rFonts w:ascii="Times New Roman" w:hAnsi="Times New Roman" w:cs="Times New Roman"/>
+        </w:rPr>
+        <w:t/>
+      </w:r>
+    </w:p>
+    <w:p>
+      <w:pPr>
+        <w:spacing w:after="0" w:line="240" w:lineRule="auto"/>
+        <w:rPr>
+          <w:rFonts w:ascii="Times New Roman" w:hAnsi="Times New Roman" w:cs="Times New Roman"/>
+          <w:lang w:val="en-US"/>
+        </w:rPr>
+      </w:pPr>
+      <w:r>
+        <w:rPr>
+          <w:rFonts w:ascii="Times New Roman" w:hAnsi="Times New Roman" w:cs="Times New Roman"/>
+        </w:rPr>
+        <w:t xml:space="preserve">    </w:t>
+      </w:r>
+      <w:r>
+        <w:rPr>
+          <w:rFonts w:ascii="Times New Roman" w:hAnsi="Times New Roman" w:cs="Times New Roman"/>
+        </w:rPr>
+        <w:t xml:space="preserve">-Bye</w:t>
+      </w:r>
+    </w:p>
+    <w:p>
+      <w:pPr>
+        <w:spacing w:after="0" w:line="240" w:lineRule="auto"/>
+        <w:rPr>
+          <w:rFonts w:ascii="Times New Roman" w:hAnsi="Times New Roman" w:cs="Times New Roman"/>
+        </w:rPr>
+      </w:pPr>
+      <w:r>
+        <w:rPr>
+          <w:rFonts w:ascii="Times New Roman" w:hAnsi="Times New Roman" w:cs="Times New Roman"/>
+        </w:rPr>
+        <w:t xml:space="preserve"> </w:t>
+      </w:r>
+    </w:p>
+    <w:p>
+      <w:pPr>
+        <w:spacing w:after="0" w:line="240" w:lineRule="auto"/>
+        <w:rPr>
+          <w:rFonts w:ascii="Times New Roman" w:hAnsi="Times New Roman" w:cs="Times New Roman"/>
+          <w:lang w:val="en-US"/>
+        </w:rPr>
+      </w:pPr>
+      <w:r>
+        <w:rPr>
+          <w:rStyle w:val="markedcontent"/>
+          <w:rFonts w:ascii="Times New Roman" w:hAnsi="Times New Roman" w:cs="Times New Roman"/>
+        </w:rPr>
+        <w:t xml:space="preserve">7</w:t>
+      </w:r>
+      <w:r>
+        <w:rPr>
+          <w:rStyle w:val="markedcontent"/>
+          <w:rFonts w:ascii="Times New Roman" w:hAnsi="Times New Roman" w:cs="Times New Roman"/>
+        </w:rPr>
+        <w:t xml:space="preserve">.</w:t>
+      </w:r>
+      <w:r>
+        <w:rPr>
+          <w:rStyle w:val="markedcontent"/>
+          <w:rFonts w:ascii="Times New Roman" w:hAnsi="Times New Roman" w:cs="Times New Roman"/>
+        </w:rPr>
+        <w:t xml:space="preserve"> What is Operating System?</w:t>
+      </w:r>
+      <w:r>
+        <w:rPr>
+          <w:rFonts w:ascii="Times New Roman" w:hAnsi="Times New Roman" w:cs="Times New Roman"/>
+        </w:rPr>
+        <w:t/>
+      </w:r>
+      <w:r>
+        <w:rPr>
+          <w:rStyle w:val="hljs-selector-id"/>
+          <w:rFonts w:ascii="Times New Roman" w:hAnsi="Times New Roman" w:cs="Times New Roman"/>
+        </w:rPr>
+        <w:t/>
+      </w:r>
+      <w:r>
+        <w:rPr>
+          <w:rFonts w:ascii="Times New Roman" w:hAnsi="Times New Roman" w:cs="Times New Roman"/>
+        </w:rPr>
+        <w:t/>
+      </w:r>
+    </w:p>
+    <w:p>
+      <w:pPr>
+        <w:spacing w:after="0" w:line="240" w:lineRule="auto"/>
+        <w:rPr>
+          <w:rFonts w:ascii="Times New Roman" w:hAnsi="Times New Roman" w:cs="Times New Roman"/>
+          <w:lang w:val="en-US"/>
+        </w:rPr>
+      </w:pPr>
+      <w:r>
+        <w:rPr>
+          <w:rFonts w:ascii="Times New Roman" w:hAnsi="Times New Roman" w:cs="Times New Roman"/>
+        </w:rPr>
+        <w:t xml:space="preserve">    </w:t>
+      </w:r>
+      <w:r>
+        <w:rPr>
+          <w:rFonts w:ascii="Times New Roman" w:hAnsi="Times New Roman" w:cs="Times New Roman"/>
+        </w:rPr>
+        <w:t xml:space="preserve">-Hi</w:t>
+      </w:r>
+      <w:r>
+        <w:rPr>
+          <w:rStyle w:val="hljs-selector-id"/>
+          <w:rFonts w:ascii="Times New Roman" w:hAnsi="Times New Roman" w:cs="Times New Roman"/>
+        </w:rPr>
+        <w:t/>
+      </w:r>
+      <w:r>
+        <w:rPr>
+          <w:rFonts w:ascii="Times New Roman" w:hAnsi="Times New Roman" w:cs="Times New Roman"/>
+        </w:rPr>
+        <w:t/>
+      </w:r>
+    </w:p>
+    <w:p>
+      <w:pPr>
+        <w:spacing w:after="0" w:line="240" w:lineRule="auto"/>
+        <w:rPr>
+          <w:rFonts w:ascii="Times New Roman" w:hAnsi="Times New Roman" w:cs="Times New Roman"/>
+          <w:lang w:val="en-US"/>
+        </w:rPr>
+      </w:pPr>
+      <w:r>
+        <w:rPr>
+          <w:rFonts w:ascii="Times New Roman" w:hAnsi="Times New Roman" w:cs="Times New Roman"/>
+        </w:rPr>
+        <w:t xml:space="preserve">    </w:t>
+      </w:r>
+      <w:r>
+        <w:rPr>
+          <w:rFonts w:ascii="Times New Roman" w:hAnsi="Times New Roman" w:cs="Times New Roman"/>
+        </w:rPr>
+        <w:t xml:space="preserve">-Hello</w:t>
+      </w:r>
+      <w:r>
+        <w:rPr>
+          <w:rStyle w:val="hljs-selector-id"/>
+          <w:rFonts w:ascii="Times New Roman" w:hAnsi="Times New Roman" w:cs="Times New Roman"/>
+        </w:rPr>
+        <w:t/>
+      </w:r>
+      <w:r>
+        <w:rPr>
+          <w:rFonts w:ascii="Times New Roman" w:hAnsi="Times New Roman" w:cs="Times New Roman"/>
+        </w:rPr>
+        <w:t/>
+      </w:r>
+    </w:p>
+    <w:p>
+      <w:pPr>
+        <w:spacing w:after="0" w:line="240" w:lineRule="auto"/>
+        <w:rPr>
+          <w:rFonts w:ascii="Times New Roman" w:hAnsi="Times New Roman" w:cs="Times New Roman"/>
+          <w:lang w:val="en-US"/>
+        </w:rPr>
+      </w:pPr>
+      <w:r>
+        <w:rPr>
+          <w:rFonts w:ascii="Times New Roman" w:hAnsi="Times New Roman" w:cs="Times New Roman"/>
+        </w:rPr>
+        <w:t xml:space="preserve">    </w:t>
+      </w:r>
+      <w:r>
+        <w:rPr>
+          <w:rFonts w:ascii="Times New Roman" w:hAnsi="Times New Roman" w:cs="Times New Roman"/>
+        </w:rPr>
+        <w:t xml:space="preserve">-Bye</w:t>
+      </w:r>
+    </w:p>
+    <w:p>
+      <w:pPr>
+        <w:spacing w:after="0" w:line="240" w:lineRule="auto"/>
+        <w:rPr>
+          <w:rFonts w:ascii="Times New Roman" w:hAnsi="Times New Roman" w:cs="Times New Roman"/>
+        </w:rPr>
+      </w:pPr>
+      <w:r>
+        <w:rPr>
+          <w:rFonts w:ascii="Times New Roman" w:hAnsi="Times New Roman" w:cs="Times New Roman"/>
+        </w:rPr>
+        <w:t xml:space="preserve"> </w:t>
+      </w:r>
+    </w:p>
+    <w:p>
+      <w:pPr>
+        <w:spacing w:after="0" w:line="240" w:lineRule="auto"/>
+        <w:rPr>
+          <w:rFonts w:ascii="Times New Roman" w:hAnsi="Times New Roman" w:cs="Times New Roman"/>
+          <w:lang w:val="en-US"/>
+        </w:rPr>
+      </w:pPr>
+      <w:r>
+        <w:rPr>
+          <w:rStyle w:val="markedcontent"/>
+          <w:rFonts w:ascii="Times New Roman" w:hAnsi="Times New Roman" w:cs="Times New Roman"/>
+        </w:rPr>
+        <w:t xml:space="preserve">8</w:t>
+      </w:r>
+      <w:r>
+        <w:rPr>
+          <w:rStyle w:val="markedcontent"/>
+          <w:rFonts w:ascii="Times New Roman" w:hAnsi="Times New Roman" w:cs="Times New Roman"/>
+        </w:rPr>
+        <w:t xml:space="preserve">.</w:t>
+      </w:r>
+      <w:r>
+        <w:rPr>
+          <w:rStyle w:val="markedcontent"/>
+          <w:rFonts w:ascii="Times New Roman" w:hAnsi="Times New Roman" w:cs="Times New Roman"/>
+        </w:rPr>
+        <w:t xml:space="preserve"> What is Operating System?</w:t>
+      </w:r>
+      <w:r>
+        <w:rPr>
+          <w:rFonts w:ascii="Times New Roman" w:hAnsi="Times New Roman" w:cs="Times New Roman"/>
+        </w:rPr>
+        <w:t/>
+      </w:r>
+      <w:r>
+        <w:rPr>
+          <w:rStyle w:val="hljs-selector-id"/>
+          <w:rFonts w:ascii="Times New Roman" w:hAnsi="Times New Roman" w:cs="Times New Roman"/>
+        </w:rPr>
+        <w:t/>
+      </w:r>
+      <w:r>
+        <w:rPr>
+          <w:rFonts w:ascii="Times New Roman" w:hAnsi="Times New Roman" w:cs="Times New Roman"/>
+        </w:rPr>
+        <w:t/>
+      </w:r>
+    </w:p>
+    <w:p>
+      <w:pPr>
+        <w:spacing w:after="0" w:line="240" w:lineRule="auto"/>
+        <w:rPr>
+          <w:rFonts w:ascii="Times New Roman" w:hAnsi="Times New Roman" w:cs="Times New Roman"/>
+          <w:lang w:val="en-US"/>
+        </w:rPr>
+      </w:pPr>
+      <w:r>
+        <w:rPr>
+          <w:rFonts w:ascii="Times New Roman" w:hAnsi="Times New Roman" w:cs="Times New Roman"/>
+        </w:rPr>
+        <w:t xml:space="preserve">    </w:t>
+      </w:r>
+      <w:r>
+        <w:rPr>
+          <w:rFonts w:ascii="Times New Roman" w:hAnsi="Times New Roman" w:cs="Times New Roman"/>
+        </w:rPr>
+        <w:t xml:space="preserve">-Hi</w:t>
+      </w:r>
+      <w:r>
+        <w:rPr>
+          <w:rStyle w:val="hljs-selector-id"/>
+          <w:rFonts w:ascii="Times New Roman" w:hAnsi="Times New Roman" w:cs="Times New Roman"/>
+        </w:rPr>
+        <w:t/>
+      </w:r>
+      <w:r>
+        <w:rPr>
+          <w:rFonts w:ascii="Times New Roman" w:hAnsi="Times New Roman" w:cs="Times New Roman"/>
+        </w:rPr>
+        <w:t/>
+      </w:r>
+    </w:p>
+    <w:p>
+      <w:pPr>
+        <w:spacing w:after="0" w:line="240" w:lineRule="auto"/>
+        <w:rPr>
+          <w:rFonts w:ascii="Times New Roman" w:hAnsi="Times New Roman" w:cs="Times New Roman"/>
+          <w:lang w:val="en-US"/>
+        </w:rPr>
+      </w:pPr>
+      <w:r>
+        <w:rPr>
+          <w:rFonts w:ascii="Times New Roman" w:hAnsi="Times New Roman" w:cs="Times New Roman"/>
+        </w:rPr>
+        <w:t xml:space="preserve">    </w:t>
+      </w:r>
+      <w:r>
+        <w:rPr>
+          <w:rFonts w:ascii="Times New Roman" w:hAnsi="Times New Roman" w:cs="Times New Roman"/>
+        </w:rPr>
+        <w:t xml:space="preserve">-Hello</w:t>
+      </w:r>
+      <w:r>
+        <w:rPr>
+          <w:rStyle w:val="hljs-selector-id"/>
+          <w:rFonts w:ascii="Times New Roman" w:hAnsi="Times New Roman" w:cs="Times New Roman"/>
+        </w:rPr>
+        <w:t/>
+      </w:r>
+      <w:r>
+        <w:rPr>
+          <w:rFonts w:ascii="Times New Roman" w:hAnsi="Times New Roman" w:cs="Times New Roman"/>
+        </w:rPr>
+        <w:t/>
+      </w:r>
+    </w:p>
+    <w:p>
+      <w:pPr>
+        <w:spacing w:after="0" w:line="240" w:lineRule="auto"/>
+        <w:rPr>
+          <w:rFonts w:ascii="Times New Roman" w:hAnsi="Times New Roman" w:cs="Times New Roman"/>
+          <w:lang w:val="en-US"/>
+        </w:rPr>
+      </w:pPr>
+      <w:r>
+        <w:rPr>
+          <w:rFonts w:ascii="Times New Roman" w:hAnsi="Times New Roman" w:cs="Times New Roman"/>
+        </w:rPr>
+        <w:t xml:space="preserve">    </w:t>
+      </w:r>
+      <w:r>
+        <w:rPr>
+          <w:rFonts w:ascii="Times New Roman" w:hAnsi="Times New Roman" w:cs="Times New Roman"/>
+        </w:rPr>
+        <w:t xml:space="preserve">-Bye</w:t>
+      </w:r>
+    </w:p>
+    <w:p>
+      <w:pPr>
+        <w:spacing w:after="0" w:line="240" w:lineRule="auto"/>
+        <w:rPr>
+          <w:rFonts w:ascii="Times New Roman" w:hAnsi="Times New Roman" w:cs="Times New Roman"/>
+        </w:rPr>
+      </w:pPr>
+      <w:r>
+        <w:rPr>
+          <w:rFonts w:ascii="Times New Roman" w:hAnsi="Times New Roman" w:cs="Times New Roman"/>
+        </w:rPr>
+        <w:t xml:space="preserve"> </w:t>
+      </w:r>
+    </w:p>
+    <w:p>
+      <w:pPr>
+        <w:spacing w:after="0" w:line="240" w:lineRule="auto"/>
+        <w:rPr>
+          <w:rFonts w:ascii="Times New Roman" w:hAnsi="Times New Roman" w:cs="Times New Roman"/>
+          <w:lang w:val="en-US"/>
+        </w:rPr>
+      </w:pPr>
+      <w:r>
+        <w:rPr>
+          <w:rStyle w:val="markedcontent"/>
+          <w:rFonts w:ascii="Times New Roman" w:hAnsi="Times New Roman" w:cs="Times New Roman"/>
+        </w:rPr>
+        <w:t xml:space="preserve">9</w:t>
+      </w:r>
+      <w:r>
+        <w:rPr>
+          <w:rStyle w:val="markedcontent"/>
+          <w:rFonts w:ascii="Times New Roman" w:hAnsi="Times New Roman" w:cs="Times New Roman"/>
+        </w:rPr>
+        <w:t xml:space="preserve">.</w:t>
+      </w:r>
+      <w:r>
+        <w:rPr>
+          <w:rStyle w:val="markedcontent"/>
+          <w:rFonts w:ascii="Times New Roman" w:hAnsi="Times New Roman" w:cs="Times New Roman"/>
+        </w:rPr>
+        <w:t xml:space="preserve"> What is Operating System?</w:t>
+      </w:r>
+      <w:r>
+        <w:rPr>
+          <w:rFonts w:ascii="Times New Roman" w:hAnsi="Times New Roman" w:cs="Times New Roman"/>
+        </w:rPr>
+        <w:t/>
+      </w:r>
+      <w:r>
+        <w:rPr>
+          <w:rStyle w:val="hljs-selector-id"/>
+          <w:rFonts w:ascii="Times New Roman" w:hAnsi="Times New Roman" w:cs="Times New Roman"/>
+        </w:rPr>
+        <w:t/>
+      </w:r>
+      <w:r>
+        <w:rPr>
+          <w:rFonts w:ascii="Times New Roman" w:hAnsi="Times New Roman" w:cs="Times New Roman"/>
+        </w:rPr>
+        <w:t/>
+      </w:r>
+    </w:p>
+    <w:p>
+      <w:pPr>
+        <w:spacing w:after="0" w:line="240" w:lineRule="auto"/>
+        <w:rPr>
+          <w:rFonts w:ascii="Times New Roman" w:hAnsi="Times New Roman" w:cs="Times New Roman"/>
+          <w:lang w:val="en-US"/>
+        </w:rPr>
+      </w:pPr>
+      <w:r>
+        <w:rPr>
+          <w:rFonts w:ascii="Times New Roman" w:hAnsi="Times New Roman" w:cs="Times New Roman"/>
+        </w:rPr>
+        <w:t xml:space="preserve">    </w:t>
+      </w:r>
+      <w:r>
+        <w:rPr>
+          <w:rFonts w:ascii="Times New Roman" w:hAnsi="Times New Roman" w:cs="Times New Roman"/>
+        </w:rPr>
+        <w:t xml:space="preserve">-Hi</w:t>
+      </w:r>
+      <w:r>
+        <w:rPr>
+          <w:rStyle w:val="hljs-selector-id"/>
+          <w:rFonts w:ascii="Times New Roman" w:hAnsi="Times New Roman" w:cs="Times New Roman"/>
+        </w:rPr>
+        <w:t/>
+      </w:r>
+      <w:r>
+        <w:rPr>
+          <w:rFonts w:ascii="Times New Roman" w:hAnsi="Times New Roman" w:cs="Times New Roman"/>
+        </w:rPr>
+        <w:t/>
+      </w:r>
+    </w:p>
+    <w:p>
+      <w:pPr>
+        <w:spacing w:after="0" w:line="240" w:lineRule="auto"/>
+        <w:rPr>
+          <w:rFonts w:ascii="Times New Roman" w:hAnsi="Times New Roman" w:cs="Times New Roman"/>
+          <w:lang w:val="en-US"/>
+        </w:rPr>
+      </w:pPr>
+      <w:r>
+        <w:rPr>
+          <w:rFonts w:ascii="Times New Roman" w:hAnsi="Times New Roman" w:cs="Times New Roman"/>
+        </w:rPr>
+        <w:t xml:space="preserve">    </w:t>
+      </w:r>
+      <w:r>
+        <w:rPr>
+          <w:rFonts w:ascii="Times New Roman" w:hAnsi="Times New Roman" w:cs="Times New Roman"/>
+        </w:rPr>
+        <w:t xml:space="preserve">-Hello</w:t>
+      </w:r>
+      <w:r>
+        <w:rPr>
+          <w:rStyle w:val="hljs-selector-id"/>
+          <w:rFonts w:ascii="Times New Roman" w:hAnsi="Times New Roman" w:cs="Times New Roman"/>
+        </w:rPr>
+        <w:t/>
+      </w:r>
+      <w:r>
+        <w:rPr>
+          <w:rFonts w:ascii="Times New Roman" w:hAnsi="Times New Roman" w:cs="Times New Roman"/>
+        </w:rPr>
+        <w:t/>
+      </w:r>
+    </w:p>
+    <w:p>
+      <w:pPr>
+        <w:spacing w:after="0" w:line="240" w:lineRule="auto"/>
+        <w:rPr>
+          <w:rFonts w:ascii="Times New Roman" w:hAnsi="Times New Roman" w:cs="Times New Roman"/>
+          <w:lang w:val="en-US"/>
+        </w:rPr>
+      </w:pPr>
+      <w:r>
+        <w:rPr>
+          <w:rFonts w:ascii="Times New Roman" w:hAnsi="Times New Roman" w:cs="Times New Roman"/>
+        </w:rPr>
+        <w:t xml:space="preserve">    </w:t>
+      </w:r>
+      <w:r>
+        <w:rPr>
+          <w:rFonts w:ascii="Times New Roman" w:hAnsi="Times New Roman" w:cs="Times New Roman"/>
+        </w:rPr>
+        <w:t xml:space="preserve">-Bye</w:t>
+      </w:r>
+    </w:p>
+    <w:p>
+      <w:pPr>
+        <w:spacing w:after="0" w:line="240" w:lineRule="auto"/>
+        <w:rPr>
+          <w:rFonts w:ascii="Times New Roman" w:hAnsi="Times New Roman" w:cs="Times New Roman"/>
+        </w:rPr>
+      </w:pPr>
+      <w:r>
+        <w:rPr>
+          <w:rFonts w:ascii="Times New Roman" w:hAnsi="Times New Roman" w:cs="Times New Roman"/>
+        </w:rPr>
+        <w:t xml:space="preserve"> </w:t>
+      </w:r>
+    </w:p>
+    <w:p>
+      <w:pPr>
+        <w:spacing w:after="0" w:line="240" w:lineRule="auto"/>
+        <w:rPr>
+          <w:rFonts w:ascii="Times New Roman" w:hAnsi="Times New Roman" w:cs="Times New Roman"/>
+          <w:lang w:val="en-US"/>
+        </w:rPr>
+      </w:pPr>
+      <w:r>
+        <w:rPr>
+          <w:rStyle w:val="markedcontent"/>
+          <w:rFonts w:ascii="Times New Roman" w:hAnsi="Times New Roman" w:cs="Times New Roman"/>
+        </w:rPr>
+        <w:t xml:space="preserve">10</w:t>
+      </w:r>
+      <w:r>
+        <w:rPr>
+          <w:rStyle w:val="markedcontent"/>
+          <w:rFonts w:ascii="Times New Roman" w:hAnsi="Times New Roman" w:cs="Times New Roman"/>
+        </w:rPr>
+        <w:t xml:space="preserve">.</w:t>
+      </w:r>
+      <w:r>
+        <w:rPr>
+          <w:rStyle w:val="markedcontent"/>
+          <w:rFonts w:ascii="Times New Roman" w:hAnsi="Times New Roman" w:cs="Times New Roman"/>
+        </w:rPr>
+        <w:t xml:space="preserve"> What is Operating System?</w:t>
+      </w:r>
+      <w:r>
+        <w:rPr>
+          <w:rFonts w:ascii="Times New Roman" w:hAnsi="Times New Roman" w:cs="Times New Roman"/>
+        </w:rPr>
+        <w:t/>
+      </w:r>
+      <w:r>
+        <w:rPr>
+          <w:rStyle w:val="hljs-selector-id"/>
+          <w:rFonts w:ascii="Times New Roman" w:hAnsi="Times New Roman" w:cs="Times New Roman"/>
+        </w:rPr>
+        <w:t/>
+      </w:r>
+      <w:r>
+        <w:rPr>
+          <w:rFonts w:ascii="Times New Roman" w:hAnsi="Times New Roman" w:cs="Times New Roman"/>
+        </w:rPr>
+        <w:t/>
+      </w:r>
+    </w:p>
+    <w:p>
+      <w:pPr>
+        <w:spacing w:after="0" w:line="240" w:lineRule="auto"/>
+        <w:rPr>
+          <w:rFonts w:ascii="Times New Roman" w:hAnsi="Times New Roman" w:cs="Times New Roman"/>
+          <w:lang w:val="en-US"/>
+        </w:rPr>
+      </w:pPr>
+      <w:r>
+        <w:rPr>
+          <w:rFonts w:ascii="Times New Roman" w:hAnsi="Times New Roman" w:cs="Times New Roman"/>
+        </w:rPr>
+        <w:t xml:space="preserve">    </w:t>
+      </w:r>
+      <w:r>
+        <w:rPr>
+          <w:rFonts w:ascii="Times New Roman" w:hAnsi="Times New Roman" w:cs="Times New Roman"/>
+        </w:rPr>
+        <w:t xml:space="preserve">-Hi</w:t>
+      </w:r>
+      <w:r>
+        <w:rPr>
+          <w:rStyle w:val="hljs-selector-id"/>
+          <w:rFonts w:ascii="Times New Roman" w:hAnsi="Times New Roman" w:cs="Times New Roman"/>
+        </w:rPr>
+        <w:t/>
+      </w:r>
+      <w:r>
+        <w:rPr>
+          <w:rFonts w:ascii="Times New Roman" w:hAnsi="Times New Roman" w:cs="Times New Roman"/>
+        </w:rPr>
+        <w:t/>
+      </w:r>
+    </w:p>
+    <w:p>
+      <w:pPr>
+        <w:spacing w:after="0" w:line="240" w:lineRule="auto"/>
+        <w:rPr>
+          <w:rFonts w:ascii="Times New Roman" w:hAnsi="Times New Roman" w:cs="Times New Roman"/>
+          <w:lang w:val="en-US"/>
+        </w:rPr>
+      </w:pPr>
+      <w:r>
+        <w:rPr>
+          <w:rFonts w:ascii="Times New Roman" w:hAnsi="Times New Roman" w:cs="Times New Roman"/>
+        </w:rPr>
+        <w:t xml:space="preserve">    </w:t>
+      </w:r>
+      <w:r>
+        <w:rPr>
+          <w:rFonts w:ascii="Times New Roman" w:hAnsi="Times New Roman" w:cs="Times New Roman"/>
+        </w:rPr>
+        <w:t xml:space="preserve">-Hello</w:t>
+      </w:r>
+      <w:r>
+        <w:rPr>
+          <w:rStyle w:val="hljs-selector-id"/>
+          <w:rFonts w:ascii="Times New Roman" w:hAnsi="Times New Roman" w:cs="Times New Roman"/>
+        </w:rPr>
+        <w:t/>
+      </w:r>
+      <w:r>
+        <w:rPr>
+          <w:rFonts w:ascii="Times New Roman" w:hAnsi="Times New Roman" w:cs="Times New Roman"/>
+        </w:rPr>
+        <w:t/>
+      </w:r>
+    </w:p>
+    <w:p>
+      <w:pPr>
+        <w:spacing w:after="0" w:line="240" w:lineRule="auto"/>
+        <w:rPr>
+          <w:rFonts w:ascii="Times New Roman" w:hAnsi="Times New Roman" w:cs="Times New Roman"/>
+          <w:lang w:val="en-US"/>
+        </w:rPr>
+      </w:pPr>
+      <w:r>
+        <w:rPr>
+          <w:rFonts w:ascii="Times New Roman" w:hAnsi="Times New Roman" w:cs="Times New Roman"/>
+        </w:rPr>
+        <w:t xml:space="preserve">    </w:t>
+      </w:r>
+      <w:r>
+        <w:rPr>
+          <w:rFonts w:ascii="Times New Roman" w:hAnsi="Times New Roman" w:cs="Times New Roman"/>
+        </w:rPr>
+        <w:t xml:space="preserve">-Bye</w:t>
+      </w:r>
+    </w:p>
+    <w:p>
+      <w:pPr>
+        <w:spacing w:after="0" w:line="240" w:lineRule="auto"/>
+        <w:rPr>
+          <w:rFonts w:ascii="Times New Roman" w:hAnsi="Times New Roman" w:cs="Times New Roman"/>
+        </w:rPr>
+      </w:pPr>
+      <w:r>
+        <w:rPr>
+          <w:rFonts w:ascii="Times New Roman" w:hAnsi="Times New Roman" w:cs="Times New Roman"/>
+        </w:rPr>
+        <w:t xml:space="preserve"> </w:t>
+      </w:r>
+    </w:p>
+    <w:p>
+      <w:pPr>
+        <w:spacing w:after="0" w:line="240" w:lineRule="auto"/>
+        <w:rPr>
+          <w:rFonts w:ascii="Times New Roman" w:hAnsi="Times New Roman" w:cs="Times New Roman"/>
+          <w:lang w:val="en-US"/>
+        </w:rPr>
+      </w:pPr>
+      <w:r>
+        <w:rPr>
+          <w:rStyle w:val="markedcontent"/>
+          <w:rFonts w:ascii="Times New Roman" w:hAnsi="Times New Roman" w:cs="Times New Roman"/>
+        </w:rPr>
+        <w:t xml:space="preserve">11</w:t>
+      </w:r>
+      <w:r>
+        <w:rPr>
+          <w:rStyle w:val="markedcontent"/>
+          <w:rFonts w:ascii="Times New Roman" w:hAnsi="Times New Roman" w:cs="Times New Roman"/>
+        </w:rPr>
+        <w:t xml:space="preserve">.</w:t>
+      </w:r>
+      <w:r>
+        <w:rPr>
+          <w:rStyle w:val="markedcontent"/>
+          <w:rFonts w:ascii="Times New Roman" w:hAnsi="Times New Roman" w:cs="Times New Roman"/>
+        </w:rPr>
+        <w:t xml:space="preserve"> What is Operating System?</w:t>
+      </w:r>
+      <w:r>
+        <w:rPr>
+          <w:rFonts w:ascii="Times New Roman" w:hAnsi="Times New Roman" w:cs="Times New Roman"/>
+        </w:rPr>
+        <w:t/>
+      </w:r>
+      <w:r>
+        <w:rPr>
+          <w:rStyle w:val="hljs-selector-id"/>
+          <w:rFonts w:ascii="Times New Roman" w:hAnsi="Times New Roman" w:cs="Times New Roman"/>
+        </w:rPr>
+        <w:t/>
+      </w:r>
+      <w:r>
+        <w:rPr>
+          <w:rFonts w:ascii="Times New Roman" w:hAnsi="Times New Roman" w:cs="Times New Roman"/>
+        </w:rPr>
+        <w:t/>
+      </w:r>
+    </w:p>
+    <w:p>
+      <w:pPr>
+        <w:spacing w:after="0" w:line="240" w:lineRule="auto"/>
+        <w:rPr>
+          <w:rFonts w:ascii="Times New Roman" w:hAnsi="Times New Roman" w:cs="Times New Roman"/>
+          <w:lang w:val="en-US"/>
+        </w:rPr>
+      </w:pPr>
+      <w:r>
+        <w:rPr>
+          <w:rFonts w:ascii="Times New Roman" w:hAnsi="Times New Roman" w:cs="Times New Roman"/>
+        </w:rPr>
+        <w:t xml:space="preserve">    </w:t>
+      </w:r>
+      <w:r>
+        <w:rPr>
+          <w:rFonts w:ascii="Times New Roman" w:hAnsi="Times New Roman" w:cs="Times New Roman"/>
+        </w:rPr>
+        <w:t xml:space="preserve">-Hi</w:t>
+      </w:r>
+      <w:r>
+        <w:rPr>
+          <w:rStyle w:val="hljs-selector-id"/>
+          <w:rFonts w:ascii="Times New Roman" w:hAnsi="Times New Roman" w:cs="Times New Roman"/>
+        </w:rPr>
+        <w:t/>
+      </w:r>
+      <w:r>
+        <w:rPr>
+          <w:rFonts w:ascii="Times New Roman" w:hAnsi="Times New Roman" w:cs="Times New Roman"/>
+        </w:rPr>
+        <w:t/>
+      </w:r>
+    </w:p>
+    <w:p>
+      <w:pPr>
+        <w:spacing w:after="0" w:line="240" w:lineRule="auto"/>
+        <w:rPr>
+          <w:rFonts w:ascii="Times New Roman" w:hAnsi="Times New Roman" w:cs="Times New Roman"/>
+          <w:lang w:val="en-US"/>
+        </w:rPr>
+      </w:pPr>
+      <w:r>
+        <w:rPr>
+          <w:rFonts w:ascii="Times New Roman" w:hAnsi="Times New Roman" w:cs="Times New Roman"/>
+        </w:rPr>
+        <w:t xml:space="preserve">    </w:t>
+      </w:r>
+      <w:r>
+        <w:rPr>
+          <w:rFonts w:ascii="Times New Roman" w:hAnsi="Times New Roman" w:cs="Times New Roman"/>
+        </w:rPr>
+        <w:t xml:space="preserve">-Hello</w:t>
+      </w:r>
+      <w:r>
+        <w:rPr>
+          <w:rStyle w:val="hljs-selector-id"/>
+          <w:rFonts w:ascii="Times New Roman" w:hAnsi="Times New Roman" w:cs="Times New Roman"/>
+        </w:rPr>
+        <w:t/>
+      </w:r>
+      <w:r>
+        <w:rPr>
+          <w:rFonts w:ascii="Times New Roman" w:hAnsi="Times New Roman" w:cs="Times New Roman"/>
+        </w:rPr>
+        <w:t/>
+      </w:r>
+    </w:p>
+    <w:p>
+      <w:pPr>
+        <w:spacing w:after="0" w:line="240" w:lineRule="auto"/>
+        <w:rPr>
+          <w:rFonts w:ascii="Times New Roman" w:hAnsi="Times New Roman" w:cs="Times New Roman"/>
+          <w:lang w:val="en-US"/>
+        </w:rPr>
+      </w:pPr>
+      <w:r>
+        <w:rPr>
+          <w:rFonts w:ascii="Times New Roman" w:hAnsi="Times New Roman" w:cs="Times New Roman"/>
+        </w:rPr>
+        <w:t xml:space="preserve">    </w:t>
+      </w:r>
+      <w:r>
+        <w:rPr>
+          <w:rFonts w:ascii="Times New Roman" w:hAnsi="Times New Roman" w:cs="Times New Roman"/>
+        </w:rPr>
+        <w:t xml:space="preserve">-Bye</w:t>
+      </w:r>
+    </w:p>
+    <w:p>
+      <w:pPr>
+        <w:spacing w:after="0" w:line="240" w:lineRule="auto"/>
+        <w:rPr>
+          <w:rFonts w:ascii="Times New Roman" w:hAnsi="Times New Roman" w:cs="Times New Roman"/>
+        </w:rPr>
+      </w:pPr>
+      <w:r>
+        <w:rPr>
+          <w:rFonts w:ascii="Times New Roman" w:hAnsi="Times New Roman" w:cs="Times New Roman"/>
+        </w:rPr>
+        <w:t xml:space="preserve"> </w:t>
+      </w:r>
+    </w:p>
+    <w:p>
+      <w:pPr>
+        <w:spacing w:after="0" w:line="240" w:lineRule="auto"/>
+        <w:rPr>
+          <w:rFonts w:ascii="Times New Roman" w:hAnsi="Times New Roman" w:cs="Times New Roman"/>
+          <w:lang w:val="en-US"/>
+        </w:rPr>
+      </w:pPr>
+      <w:r>
+        <w:rPr>
+          <w:rStyle w:val="markedcontent"/>
+          <w:rFonts w:ascii="Times New Roman" w:hAnsi="Times New Roman" w:cs="Times New Roman"/>
+        </w:rPr>
+        <w:t xml:space="preserve">12</w:t>
+      </w:r>
+      <w:r>
+        <w:rPr>
+          <w:rStyle w:val="markedcontent"/>
+          <w:rFonts w:ascii="Times New Roman" w:hAnsi="Times New Roman" w:cs="Times New Roman"/>
+        </w:rPr>
+        <w:t xml:space="preserve">.</w:t>
+      </w:r>
+      <w:r>
+        <w:rPr>
+          <w:rStyle w:val="markedcontent"/>
+          <w:rFonts w:ascii="Times New Roman" w:hAnsi="Times New Roman" w:cs="Times New Roman"/>
+        </w:rPr>
+        <w:t xml:space="preserve"> What is Operating System?</w:t>
+      </w:r>
+      <w:r>
+        <w:rPr>
+          <w:rFonts w:ascii="Times New Roman" w:hAnsi="Times New Roman" w:cs="Times New Roman"/>
+        </w:rPr>
+        <w:t/>
+      </w:r>
+      <w:r>
+        <w:rPr>
+          <w:rStyle w:val="hljs-selector-id"/>
+          <w:rFonts w:ascii="Times New Roman" w:hAnsi="Times New Roman" w:cs="Times New Roman"/>
+        </w:rPr>
+        <w:t/>
+      </w:r>
+      <w:r>
+        <w:rPr>
+          <w:rFonts w:ascii="Times New Roman" w:hAnsi="Times New Roman" w:cs="Times New Roman"/>
+        </w:rPr>
+        <w:t/>
+      </w:r>
+    </w:p>
+    <w:p>
+      <w:pPr>
+        <w:spacing w:after="0" w:line="240" w:lineRule="auto"/>
+        <w:rPr>
+          <w:rFonts w:ascii="Times New Roman" w:hAnsi="Times New Roman" w:cs="Times New Roman"/>
+          <w:lang w:val="en-US"/>
+        </w:rPr>
+      </w:pPr>
+      <w:r>
+        <w:rPr>
+          <w:rFonts w:ascii="Times New Roman" w:hAnsi="Times New Roman" w:cs="Times New Roman"/>
+        </w:rPr>
+        <w:t xml:space="preserve">    </w:t>
+      </w:r>
+      <w:r>
+        <w:rPr>
+          <w:rFonts w:ascii="Times New Roman" w:hAnsi="Times New Roman" w:cs="Times New Roman"/>
+        </w:rPr>
+        <w:t xml:space="preserve">-Hi</w:t>
+      </w:r>
+      <w:r>
+        <w:rPr>
+          <w:rStyle w:val="hljs-selector-id"/>
+          <w:rFonts w:ascii="Times New Roman" w:hAnsi="Times New Roman" w:cs="Times New Roman"/>
+        </w:rPr>
+        <w:t/>
+      </w:r>
+      <w:r>
+        <w:rPr>
+          <w:rFonts w:ascii="Times New Roman" w:hAnsi="Times New Roman" w:cs="Times New Roman"/>
+        </w:rPr>
+        <w:t/>
+      </w:r>
+    </w:p>
+    <w:p>
+      <w:pPr>
+        <w:spacing w:after="0" w:line="240" w:lineRule="auto"/>
+        <w:rPr>
+          <w:rFonts w:ascii="Times New Roman" w:hAnsi="Times New Roman" w:cs="Times New Roman"/>
+          <w:lang w:val="en-US"/>
+        </w:rPr>
+      </w:pPr>
+      <w:r>
+        <w:rPr>
+          <w:rFonts w:ascii="Times New Roman" w:hAnsi="Times New Roman" w:cs="Times New Roman"/>
+        </w:rPr>
+        <w:t xml:space="preserve">    </w:t>
+      </w:r>
+      <w:r>
+        <w:rPr>
+          <w:rFonts w:ascii="Times New Roman" w:hAnsi="Times New Roman" w:cs="Times New Roman"/>
+        </w:rPr>
+        <w:t xml:space="preserve">-Hello</w:t>
+      </w:r>
+      <w:r>
+        <w:rPr>
+          <w:rStyle w:val="hljs-selector-id"/>
+          <w:rFonts w:ascii="Times New Roman" w:hAnsi="Times New Roman" w:cs="Times New Roman"/>
+        </w:rPr>
+        <w:t/>
+      </w:r>
+      <w:r>
+        <w:rPr>
+          <w:rFonts w:ascii="Times New Roman" w:hAnsi="Times New Roman" w:cs="Times New Roman"/>
+        </w:rPr>
+        <w:t/>
+      </w:r>
+    </w:p>
+    <w:p>
+      <w:pPr>
+        <w:spacing w:after="0" w:line="240" w:lineRule="auto"/>
+        <w:rPr>
+          <w:rFonts w:ascii="Times New Roman" w:hAnsi="Times New Roman" w:cs="Times New Roman"/>
+          <w:lang w:val="en-US"/>
+        </w:rPr>
+      </w:pPr>
+      <w:r>
+        <w:rPr>
+          <w:rFonts w:ascii="Times New Roman" w:hAnsi="Times New Roman" w:cs="Times New Roman"/>
+        </w:rPr>
+        <w:t xml:space="preserve">    </w:t>
+      </w:r>
+      <w:r>
+        <w:rPr>
+          <w:rFonts w:ascii="Times New Roman" w:hAnsi="Times New Roman" w:cs="Times New Roman"/>
+        </w:rPr>
+        <w:t xml:space="preserve">-Bye</w:t>
+      </w:r>
+    </w:p>
+    <w:p>
+      <w:pPr>
+        <w:spacing w:after="0" w:line="240" w:lineRule="auto"/>
+        <w:rPr>
+          <w:rFonts w:ascii="Times New Roman" w:hAnsi="Times New Roman" w:cs="Times New Roman"/>
+        </w:rPr>
+      </w:pPr>
+      <w:r>
+        <w:rPr>
+          <w:rFonts w:ascii="Times New Roman" w:hAnsi="Times New Roman" w:cs="Times New Roman"/>
+        </w:rPr>
+        <w:t xml:space="preserve"> </w:t>
+      </w:r>
+    </w:p>
+    <w:p>
+      <w:pPr>
+        <w:spacing w:after="0" w:line="240" w:lineRule="auto"/>
+        <w:rPr>
+          <w:rFonts w:ascii="Times New Roman" w:hAnsi="Times New Roman" w:cs="Times New Roman"/>
+          <w:lang w:val="en-US"/>
+        </w:rPr>
+      </w:pPr>
+      <w:r>
+        <w:rPr>
+          <w:rStyle w:val="markedcontent"/>
+          <w:rFonts w:ascii="Times New Roman" w:hAnsi="Times New Roman" w:cs="Times New Roman"/>
+        </w:rPr>
+        <w:t xml:space="preserve">13</w:t>
+      </w:r>
+      <w:r>
+        <w:rPr>
+          <w:rStyle w:val="markedcontent"/>
+          <w:rFonts w:ascii="Times New Roman" w:hAnsi="Times New Roman" w:cs="Times New Roman"/>
+        </w:rPr>
+        <w:t xml:space="preserve">.</w:t>
+      </w:r>
+      <w:r>
+        <w:rPr>
+          <w:rStyle w:val="markedcontent"/>
+          <w:rFonts w:ascii="Times New Roman" w:hAnsi="Times New Roman" w:cs="Times New Roman"/>
+        </w:rPr>
+        <w:t xml:space="preserve"> What is Operating System?</w:t>
+      </w:r>
+      <w:r>
+        <w:rPr>
+          <w:rFonts w:ascii="Times New Roman" w:hAnsi="Times New Roman" w:cs="Times New Roman"/>
+        </w:rPr>
+        <w:t/>
+      </w:r>
+      <w:r>
+        <w:rPr>
+          <w:rStyle w:val="hljs-selector-id"/>
+          <w:rFonts w:ascii="Times New Roman" w:hAnsi="Times New Roman" w:cs="Times New Roman"/>
+        </w:rPr>
+        <w:t/>
+      </w:r>
+      <w:r>
+        <w:rPr>
+          <w:rFonts w:ascii="Times New Roman" w:hAnsi="Times New Roman" w:cs="Times New Roman"/>
+        </w:rPr>
+        <w:t/>
+      </w:r>
+    </w:p>
+    <w:p>
+      <w:pPr>
+        <w:spacing w:after="0" w:line="240" w:lineRule="auto"/>
+        <w:rPr>
+          <w:rFonts w:ascii="Times New Roman" w:hAnsi="Times New Roman" w:cs="Times New Roman"/>
+          <w:lang w:val="en-US"/>
+        </w:rPr>
+      </w:pPr>
+      <w:r>
+        <w:rPr>
+          <w:rFonts w:ascii="Times New Roman" w:hAnsi="Times New Roman" w:cs="Times New Roman"/>
+        </w:rPr>
+        <w:t xml:space="preserve">    </w:t>
+      </w:r>
+      <w:r>
+        <w:rPr>
+          <w:rFonts w:ascii="Times New Roman" w:hAnsi="Times New Roman" w:cs="Times New Roman"/>
+        </w:rPr>
+        <w:t xml:space="preserve">-Hi</w:t>
+      </w:r>
+      <w:r>
+        <w:rPr>
+          <w:rStyle w:val="hljs-selector-id"/>
+          <w:rFonts w:ascii="Times New Roman" w:hAnsi="Times New Roman" w:cs="Times New Roman"/>
+        </w:rPr>
+        <w:t/>
+      </w:r>
+      <w:r>
+        <w:rPr>
+          <w:rFonts w:ascii="Times New Roman" w:hAnsi="Times New Roman" w:cs="Times New Roman"/>
+        </w:rPr>
+        <w:t/>
+      </w:r>
+    </w:p>
+    <w:p>
+      <w:pPr>
+        <w:spacing w:after="0" w:line="240" w:lineRule="auto"/>
+        <w:rPr>
+          <w:rFonts w:ascii="Times New Roman" w:hAnsi="Times New Roman" w:cs="Times New Roman"/>
+          <w:lang w:val="en-US"/>
+        </w:rPr>
+      </w:pPr>
+      <w:r>
+        <w:rPr>
+          <w:rFonts w:ascii="Times New Roman" w:hAnsi="Times New Roman" w:cs="Times New Roman"/>
+        </w:rPr>
+        <w:t xml:space="preserve">    </w:t>
+      </w:r>
+      <w:r>
+        <w:rPr>
+          <w:rFonts w:ascii="Times New Roman" w:hAnsi="Times New Roman" w:cs="Times New Roman"/>
+        </w:rPr>
+        <w:t xml:space="preserve">-Hello</w:t>
+      </w:r>
+      <w:r>
+        <w:rPr>
+          <w:rStyle w:val="hljs-selector-id"/>
+          <w:rFonts w:ascii="Times New Roman" w:hAnsi="Times New Roman" w:cs="Times New Roman"/>
+        </w:rPr>
+        <w:t/>
+      </w:r>
+      <w:r>
+        <w:rPr>
+          <w:rFonts w:ascii="Times New Roman" w:hAnsi="Times New Roman" w:cs="Times New Roman"/>
+        </w:rPr>
+        <w:t/>
+      </w:r>
+    </w:p>
+    <w:p>
+      <w:pPr>
+        <w:spacing w:after="0" w:line="240" w:lineRule="auto"/>
+        <w:rPr>
+          <w:rFonts w:ascii="Times New Roman" w:hAnsi="Times New Roman" w:cs="Times New Roman"/>
+          <w:lang w:val="en-US"/>
+        </w:rPr>
+      </w:pPr>
+      <w:r>
+        <w:rPr>
+          <w:rFonts w:ascii="Times New Roman" w:hAnsi="Times New Roman" w:cs="Times New Roman"/>
+        </w:rPr>
+        <w:t xml:space="preserve">    </w:t>
+      </w:r>
+      <w:r>
+        <w:rPr>
+          <w:rFonts w:ascii="Times New Roman" w:hAnsi="Times New Roman" w:cs="Times New Roman"/>
+        </w:rPr>
+        <w:t xml:space="preserve">-Bye</w:t>
+      </w:r>
+    </w:p>
+    <w:p>
+      <w:pPr>
+        <w:spacing w:after="0" w:line="240" w:lineRule="auto"/>
+        <w:rPr>
+          <w:rFonts w:ascii="Times New Roman" w:hAnsi="Times New Roman" w:cs="Times New Roman"/>
+        </w:rPr>
+      </w:pPr>
+      <w:r>
+        <w:rPr>
+          <w:rFonts w:ascii="Times New Roman" w:hAnsi="Times New Roman" w:cs="Times New Roman"/>
+        </w:rPr>
+        <w:t xml:space="preserve"> </w:t>
+      </w:r>
+    </w:p>
+    <w:p>
+      <w:pPr>
+        <w:spacing w:after="0" w:line="240" w:lineRule="auto"/>
+        <w:rPr>
+          <w:rFonts w:ascii="Times New Roman" w:hAnsi="Times New Roman" w:cs="Times New Roman"/>
+          <w:lang w:val="en-US"/>
+        </w:rPr>
+      </w:pPr>
+      <w:r>
+        <w:rPr>
+          <w:rStyle w:val="markedcontent"/>
+          <w:rFonts w:ascii="Times New Roman" w:hAnsi="Times New Roman" w:cs="Times New Roman"/>
+        </w:rPr>
+        <w:t xml:space="preserve">14</w:t>
+      </w:r>
+      <w:r>
+        <w:rPr>
+          <w:rStyle w:val="markedcontent"/>
+          <w:rFonts w:ascii="Times New Roman" w:hAnsi="Times New Roman" w:cs="Times New Roman"/>
+        </w:rPr>
+        <w:t xml:space="preserve">.</w:t>
+      </w:r>
+      <w:r>
+        <w:rPr>
+          <w:rStyle w:val="markedcontent"/>
+          <w:rFonts w:ascii="Times New Roman" w:hAnsi="Times New Roman" w:cs="Times New Roman"/>
+        </w:rPr>
+        <w:t xml:space="preserve"> What is Operating System?</w:t>
+      </w:r>
+      <w:r>
+        <w:rPr>
+          <w:rFonts w:ascii="Times New Roman" w:hAnsi="Times New Roman" w:cs="Times New Roman"/>
+        </w:rPr>
+        <w:t/>
+      </w:r>
+      <w:r>
+        <w:rPr>
+          <w:rStyle w:val="hljs-selector-id"/>
+          <w:rFonts w:ascii="Times New Roman" w:hAnsi="Times New Roman" w:cs="Times New Roman"/>
+        </w:rPr>
+        <w:t/>
+      </w:r>
+      <w:r>
+        <w:rPr>
+          <w:rFonts w:ascii="Times New Roman" w:hAnsi="Times New Roman" w:cs="Times New Roman"/>
+        </w:rPr>
+        <w:t/>
+      </w:r>
+    </w:p>
+    <w:p>
+      <w:pPr>
+        <w:spacing w:after="0" w:line="240" w:lineRule="auto"/>
+        <w:rPr>
+          <w:rFonts w:ascii="Times New Roman" w:hAnsi="Times New Roman" w:cs="Times New Roman"/>
+          <w:lang w:val="en-US"/>
+        </w:rPr>
+      </w:pPr>
+      <w:r>
+        <w:rPr>
+          <w:rFonts w:ascii="Times New Roman" w:hAnsi="Times New Roman" w:cs="Times New Roman"/>
+        </w:rPr>
+        <w:t xml:space="preserve">    </w:t>
+      </w:r>
+      <w:r>
+        <w:rPr>
+          <w:rFonts w:ascii="Times New Roman" w:hAnsi="Times New Roman" w:cs="Times New Roman"/>
+        </w:rPr>
+        <w:t xml:space="preserve">-Hi</w:t>
+      </w:r>
+      <w:r>
+        <w:rPr>
+          <w:rStyle w:val="hljs-selector-id"/>
+          <w:rFonts w:ascii="Times New Roman" w:hAnsi="Times New Roman" w:cs="Times New Roman"/>
+        </w:rPr>
+        <w:t/>
+      </w:r>
+      <w:r>
+        <w:rPr>
+          <w:rFonts w:ascii="Times New Roman" w:hAnsi="Times New Roman" w:cs="Times New Roman"/>
+        </w:rPr>
+        <w:t/>
+      </w:r>
+    </w:p>
+    <w:p>
+      <w:pPr>
+        <w:spacing w:after="0" w:line="240" w:lineRule="auto"/>
+        <w:rPr>
+          <w:rFonts w:ascii="Times New Roman" w:hAnsi="Times New Roman" w:cs="Times New Roman"/>
+          <w:lang w:val="en-US"/>
+        </w:rPr>
+      </w:pPr>
+      <w:r>
+        <w:rPr>
+          <w:rFonts w:ascii="Times New Roman" w:hAnsi="Times New Roman" w:cs="Times New Roman"/>
+        </w:rPr>
+        <w:t xml:space="preserve">    </w:t>
+      </w:r>
+      <w:r>
+        <w:rPr>
+          <w:rFonts w:ascii="Times New Roman" w:hAnsi="Times New Roman" w:cs="Times New Roman"/>
+        </w:rPr>
+        <w:t xml:space="preserve">-Hello</w:t>
+      </w:r>
+      <w:r>
+        <w:rPr>
+          <w:rStyle w:val="hljs-selector-id"/>
+          <w:rFonts w:ascii="Times New Roman" w:hAnsi="Times New Roman" w:cs="Times New Roman"/>
+        </w:rPr>
+        <w:t/>
+      </w:r>
+      <w:r>
+        <w:rPr>
+          <w:rFonts w:ascii="Times New Roman" w:hAnsi="Times New Roman" w:cs="Times New Roman"/>
+        </w:rPr>
+        <w:t/>
+      </w:r>
+    </w:p>
+    <w:p>
+      <w:pPr>
+        <w:spacing w:after="0" w:line="240" w:lineRule="auto"/>
+        <w:rPr>
+          <w:rFonts w:ascii="Times New Roman" w:hAnsi="Times New Roman" w:cs="Times New Roman"/>
+          <w:lang w:val="en-US"/>
+        </w:rPr>
+      </w:pPr>
+      <w:r>
+        <w:rPr>
+          <w:rFonts w:ascii="Times New Roman" w:hAnsi="Times New Roman" w:cs="Times New Roman"/>
+        </w:rPr>
+        <w:t xml:space="preserve">    </w:t>
+      </w:r>
+      <w:r>
+        <w:rPr>
+          <w:rFonts w:ascii="Times New Roman" w:hAnsi="Times New Roman" w:cs="Times New Roman"/>
+        </w:rPr>
+        <w:t xml:space="preserve">-Bye</w:t>
+      </w:r>
+    </w:p>
+    <w:p>
+      <w:pPr>
+        <w:spacing w:after="0" w:line="240" w:lineRule="auto"/>
+        <w:rPr>
+          <w:rFonts w:ascii="Times New Roman" w:hAnsi="Times New Roman" w:cs="Times New Roman"/>
+        </w:rPr>
+      </w:pPr>
+      <w:r>
+        <w:rPr>
+          <w:rFonts w:ascii="Times New Roman" w:hAnsi="Times New Roman" w:cs="Times New Roman"/>
+        </w:rPr>
+        <w:t xml:space="preserve"> </w:t>
+      </w:r>
+    </w:p>
+    <w:p>
+      <w:pPr>
+        <w:spacing w:after="0" w:line="240" w:lineRule="auto"/>
+        <w:rPr>
+          <w:rFonts w:ascii="Times New Roman" w:hAnsi="Times New Roman" w:cs="Times New Roman"/>
+          <w:lang w:val="en-US"/>
+        </w:rPr>
+      </w:pPr>
+      <w:r>
+        <w:rPr>
+          <w:rStyle w:val="markedcontent"/>
+          <w:rFonts w:ascii="Times New Roman" w:hAnsi="Times New Roman" w:cs="Times New Roman"/>
+        </w:rPr>
+        <w:t xml:space="preserve">15</w:t>
+      </w:r>
+      <w:r>
+        <w:rPr>
+          <w:rStyle w:val="markedcontent"/>
+          <w:rFonts w:ascii="Times New Roman" w:hAnsi="Times New Roman" w:cs="Times New Roman"/>
+        </w:rPr>
+        <w:t xml:space="preserve">.</w:t>
+      </w:r>
+      <w:r>
+        <w:rPr>
+          <w:rStyle w:val="markedcontent"/>
+          <w:rFonts w:ascii="Times New Roman" w:hAnsi="Times New Roman" w:cs="Times New Roman"/>
+        </w:rPr>
+        <w:t xml:space="preserve"> What is Operating System?</w:t>
+      </w:r>
+      <w:r>
+        <w:rPr>
+          <w:rFonts w:ascii="Times New Roman" w:hAnsi="Times New Roman" w:cs="Times New Roman"/>
+        </w:rPr>
+        <w:t/>
+      </w:r>
+      <w:r>
+        <w:rPr>
+          <w:rStyle w:val="hljs-selector-id"/>
+          <w:rFonts w:ascii="Times New Roman" w:hAnsi="Times New Roman" w:cs="Times New Roman"/>
+        </w:rPr>
+        <w:t/>
+      </w:r>
+      <w:r>
+        <w:rPr>
+          <w:rFonts w:ascii="Times New Roman" w:hAnsi="Times New Roman" w:cs="Times New Roman"/>
+        </w:rPr>
+        <w:t/>
+      </w:r>
+    </w:p>
+    <w:p>
+      <w:pPr>
+        <w:spacing w:after="0" w:line="240" w:lineRule="auto"/>
+        <w:rPr>
+          <w:rFonts w:ascii="Times New Roman" w:hAnsi="Times New Roman" w:cs="Times New Roman"/>
+          <w:lang w:val="en-US"/>
+        </w:rPr>
+      </w:pPr>
+      <w:r>
+        <w:rPr>
+          <w:rFonts w:ascii="Times New Roman" w:hAnsi="Times New Roman" w:cs="Times New Roman"/>
+        </w:rPr>
+        <w:t xml:space="preserve">    </w:t>
+      </w:r>
+      <w:r>
+        <w:rPr>
+          <w:rFonts w:ascii="Times New Roman" w:hAnsi="Times New Roman" w:cs="Times New Roman"/>
+        </w:rPr>
+        <w:t xml:space="preserve">-Hi</w:t>
+      </w:r>
+      <w:r>
+        <w:rPr>
+          <w:rStyle w:val="hljs-selector-id"/>
+          <w:rFonts w:ascii="Times New Roman" w:hAnsi="Times New Roman" w:cs="Times New Roman"/>
+        </w:rPr>
+        <w:t/>
+      </w:r>
+      <w:r>
+        <w:rPr>
+          <w:rFonts w:ascii="Times New Roman" w:hAnsi="Times New Roman" w:cs="Times New Roman"/>
+        </w:rPr>
+        <w:t/>
+      </w:r>
+    </w:p>
+    <w:p>
+      <w:pPr>
+        <w:spacing w:after="0" w:line="240" w:lineRule="auto"/>
+        <w:rPr>
+          <w:rFonts w:ascii="Times New Roman" w:hAnsi="Times New Roman" w:cs="Times New Roman"/>
+          <w:lang w:val="en-US"/>
+        </w:rPr>
+      </w:pPr>
+      <w:r>
+        <w:rPr>
+          <w:rFonts w:ascii="Times New Roman" w:hAnsi="Times New Roman" w:cs="Times New Roman"/>
+        </w:rPr>
+        <w:t xml:space="preserve">    </w:t>
+      </w:r>
+      <w:r>
+        <w:rPr>
+          <w:rFonts w:ascii="Times New Roman" w:hAnsi="Times New Roman" w:cs="Times New Roman"/>
+        </w:rPr>
+        <w:t xml:space="preserve">-Hello</w:t>
+      </w:r>
+      <w:r>
+        <w:rPr>
+          <w:rStyle w:val="hljs-selector-id"/>
+          <w:rFonts w:ascii="Times New Roman" w:hAnsi="Times New Roman" w:cs="Times New Roman"/>
+        </w:rPr>
+        <w:t/>
+      </w:r>
+      <w:r>
+        <w:rPr>
+          <w:rFonts w:ascii="Times New Roman" w:hAnsi="Times New Roman" w:cs="Times New Roman"/>
+        </w:rPr>
+        <w:t/>
+      </w:r>
+    </w:p>
+    <w:p>
+      <w:pPr>
+        <w:spacing w:after="0" w:line="240" w:lineRule="auto"/>
+        <w:rPr>
+          <w:rFonts w:ascii="Times New Roman" w:hAnsi="Times New Roman" w:cs="Times New Roman"/>
+          <w:lang w:val="en-US"/>
+        </w:rPr>
+      </w:pPr>
+      <w:r>
+        <w:rPr>
+          <w:rFonts w:ascii="Times New Roman" w:hAnsi="Times New Roman" w:cs="Times New Roman"/>
+        </w:rPr>
+        <w:t xml:space="preserve">    </w:t>
+      </w:r>
+      <w:r>
+        <w:rPr>
+          <w:rFonts w:ascii="Times New Roman" w:hAnsi="Times New Roman" w:cs="Times New Roman"/>
+        </w:rPr>
+        <w:t xml:space="preserve">-Bye</w:t>
+      </w:r>
+    </w:p>
+    <w:p>
+      <w:pPr>
+        <w:spacing w:after="0" w:line="240" w:lineRule="auto"/>
+        <w:rPr>
+          <w:rFonts w:ascii="Times New Roman" w:hAnsi="Times New Roman" w:cs="Times New Roman"/>
+        </w:rPr>
+      </w:pPr>
+      <w:r>
+        <w:rPr>
+          <w:rFonts w:ascii="Times New Roman" w:hAnsi="Times New Roman" w:cs="Times New Roman"/>
+        </w:rPr>
+        <w:t xml:space="preserve"> </w:t>
+      </w:r>
+    </w:p>
+    <w:p>
+      <w:pPr>
+        <w:spacing w:after="0" w:line="240" w:lineRule="auto"/>
+        <w:rPr>
+          <w:rFonts w:ascii="Times New Roman" w:hAnsi="Times New Roman" w:cs="Times New Roman"/>
+          <w:lang w:val="en-US"/>
+        </w:rPr>
+      </w:pPr>
+      <w:r>
+        <w:rPr>
+          <w:rStyle w:val="markedcontent"/>
+          <w:rFonts w:ascii="Times New Roman" w:hAnsi="Times New Roman" w:cs="Times New Roman"/>
+        </w:rPr>
+        <w:t xml:space="preserve">16</w:t>
+      </w:r>
+      <w:r>
+        <w:rPr>
+          <w:rStyle w:val="markedcontent"/>
+          <w:rFonts w:ascii="Times New Roman" w:hAnsi="Times New Roman" w:cs="Times New Roman"/>
+        </w:rPr>
+        <w:t xml:space="preserve">.</w:t>
+      </w:r>
+      <w:r>
+        <w:rPr>
+          <w:rStyle w:val="markedcontent"/>
+          <w:rFonts w:ascii="Times New Roman" w:hAnsi="Times New Roman" w:cs="Times New Roman"/>
+        </w:rPr>
+        <w:t xml:space="preserve"> What is Operating System?</w:t>
+      </w:r>
+      <w:r>
+        <w:rPr>
+          <w:rFonts w:ascii="Times New Roman" w:hAnsi="Times New Roman" w:cs="Times New Roman"/>
+        </w:rPr>
+        <w:t/>
+      </w:r>
+      <w:r>
+        <w:rPr>
+          <w:rStyle w:val="hljs-selector-id"/>
+          <w:rFonts w:ascii="Times New Roman" w:hAnsi="Times New Roman" w:cs="Times New Roman"/>
+        </w:rPr>
+        <w:t/>
+      </w:r>
+      <w:r>
+        <w:rPr>
+          <w:rFonts w:ascii="Times New Roman" w:hAnsi="Times New Roman" w:cs="Times New Roman"/>
+        </w:rPr>
+        <w:t/>
+      </w:r>
+    </w:p>
+    <w:p>
+      <w:pPr>
+        <w:spacing w:after="0" w:line="240" w:lineRule="auto"/>
+        <w:rPr>
+          <w:rFonts w:ascii="Times New Roman" w:hAnsi="Times New Roman" w:cs="Times New Roman"/>
+          <w:lang w:val="en-US"/>
+        </w:rPr>
+      </w:pPr>
+      <w:r>
+        <w:rPr>
+          <w:rFonts w:ascii="Times New Roman" w:hAnsi="Times New Roman" w:cs="Times New Roman"/>
+        </w:rPr>
+        <w:t xml:space="preserve">    </w:t>
+      </w:r>
+      <w:r>
+        <w:rPr>
+          <w:rFonts w:ascii="Times New Roman" w:hAnsi="Times New Roman" w:cs="Times New Roman"/>
+        </w:rPr>
+        <w:t xml:space="preserve">-Hi</w:t>
+      </w:r>
+      <w:r>
+        <w:rPr>
+          <w:rStyle w:val="hljs-selector-id"/>
+          <w:rFonts w:ascii="Times New Roman" w:hAnsi="Times New Roman" w:cs="Times New Roman"/>
+        </w:rPr>
+        <w:t/>
+      </w:r>
+      <w:r>
+        <w:rPr>
+          <w:rFonts w:ascii="Times New Roman" w:hAnsi="Times New Roman" w:cs="Times New Roman"/>
+        </w:rPr>
+        <w:t/>
+      </w:r>
+    </w:p>
+    <w:p>
+      <w:pPr>
+        <w:spacing w:after="0" w:line="240" w:lineRule="auto"/>
+        <w:rPr>
+          <w:rFonts w:ascii="Times New Roman" w:hAnsi="Times New Roman" w:cs="Times New Roman"/>
+          <w:lang w:val="en-US"/>
+        </w:rPr>
+      </w:pPr>
+      <w:r>
+        <w:rPr>
+          <w:rFonts w:ascii="Times New Roman" w:hAnsi="Times New Roman" w:cs="Times New Roman"/>
+        </w:rPr>
+        <w:t xml:space="preserve">    </w:t>
+      </w:r>
+      <w:r>
+        <w:rPr>
+          <w:rFonts w:ascii="Times New Roman" w:hAnsi="Times New Roman" w:cs="Times New Roman"/>
+        </w:rPr>
+        <w:t xml:space="preserve">-Hello</w:t>
+      </w:r>
+      <w:r>
+        <w:rPr>
+          <w:rStyle w:val="hljs-selector-id"/>
+          <w:rFonts w:ascii="Times New Roman" w:hAnsi="Times New Roman" w:cs="Times New Roman"/>
+        </w:rPr>
+        <w:t/>
+      </w:r>
+      <w:r>
+        <w:rPr>
+          <w:rFonts w:ascii="Times New Roman" w:hAnsi="Times New Roman" w:cs="Times New Roman"/>
+        </w:rPr>
+        <w:t/>
+      </w:r>
+    </w:p>
+    <w:p>
+      <w:pPr>
+        <w:spacing w:after="0" w:line="240" w:lineRule="auto"/>
+        <w:rPr>
+          <w:rFonts w:ascii="Times New Roman" w:hAnsi="Times New Roman" w:cs="Times New Roman"/>
+          <w:lang w:val="en-US"/>
+        </w:rPr>
+      </w:pPr>
+      <w:r>
+        <w:rPr>
+          <w:rFonts w:ascii="Times New Roman" w:hAnsi="Times New Roman" w:cs="Times New Roman"/>
+        </w:rPr>
+        <w:t xml:space="preserve">    </w:t>
+      </w:r>
+      <w:r>
+        <w:rPr>
+          <w:rFonts w:ascii="Times New Roman" w:hAnsi="Times New Roman" w:cs="Times New Roman"/>
+        </w:rPr>
+        <w:t xml:space="preserve">-Bye</w:t>
+      </w:r>
+    </w:p>
+    <w:p>
+      <w:pPr>
+        <w:spacing w:after="0" w:line="240" w:lineRule="auto"/>
+        <w:rPr>
+          <w:rFonts w:ascii="Times New Roman" w:hAnsi="Times New Roman" w:cs="Times New Roman"/>
+        </w:rPr>
+      </w:pPr>
+      <w:r>
+        <w:rPr>
+          <w:rFonts w:ascii="Times New Roman" w:hAnsi="Times New Roman" w:cs="Times New Roman"/>
+        </w:rPr>
+        <w:t xml:space="preserve"> </w:t>
+      </w:r>
+    </w:p>
+    <w:p>
+      <w:pPr>
+        <w:spacing w:after="0" w:line="240" w:lineRule="auto"/>
+        <w:rPr>
+          <w:rFonts w:ascii="Times New Roman" w:hAnsi="Times New Roman" w:cs="Times New Roman"/>
+          <w:lang w:val="en-US"/>
+        </w:rPr>
+      </w:pPr>
+      <w:r>
+        <w:rPr>
+          <w:rStyle w:val="markedcontent"/>
+          <w:rFonts w:ascii="Times New Roman" w:hAnsi="Times New Roman" w:cs="Times New Roman"/>
+        </w:rPr>
+        <w:t xml:space="preserve">17</w:t>
+      </w:r>
+      <w:r>
+        <w:rPr>
+          <w:rStyle w:val="markedcontent"/>
+          <w:rFonts w:ascii="Times New Roman" w:hAnsi="Times New Roman" w:cs="Times New Roman"/>
+        </w:rPr>
+        <w:t xml:space="preserve">.</w:t>
+      </w:r>
+      <w:r>
+        <w:rPr>
+          <w:rStyle w:val="markedcontent"/>
+          <w:rFonts w:ascii="Times New Roman" w:hAnsi="Times New Roman" w:cs="Times New Roman"/>
+        </w:rPr>
+        <w:t xml:space="preserve"> What is Operating System?</w:t>
+      </w:r>
+      <w:r>
+        <w:rPr>
+          <w:rFonts w:ascii="Times New Roman" w:hAnsi="Times New Roman" w:cs="Times New Roman"/>
+        </w:rPr>
+        <w:t/>
+      </w:r>
+      <w:r>
+        <w:rPr>
+          <w:rStyle w:val="hljs-selector-id"/>
+          <w:rFonts w:ascii="Times New Roman" w:hAnsi="Times New Roman" w:cs="Times New Roman"/>
+        </w:rPr>
+        <w:t/>
+      </w:r>
+      <w:r>
+        <w:rPr>
+          <w:rFonts w:ascii="Times New Roman" w:hAnsi="Times New Roman" w:cs="Times New Roman"/>
+        </w:rPr>
+        <w:t/>
+      </w:r>
+    </w:p>
+    <w:p>
+      <w:pPr>
+        <w:spacing w:after="0" w:line="240" w:lineRule="auto"/>
+        <w:rPr>
+          <w:rFonts w:ascii="Times New Roman" w:hAnsi="Times New Roman" w:cs="Times New Roman"/>
+          <w:lang w:val="en-US"/>
+        </w:rPr>
+      </w:pPr>
+      <w:r>
+        <w:rPr>
+          <w:rFonts w:ascii="Times New Roman" w:hAnsi="Times New Roman" w:cs="Times New Roman"/>
+        </w:rPr>
+        <w:t xml:space="preserve">    </w:t>
+      </w:r>
+      <w:r>
+        <w:rPr>
+          <w:rFonts w:ascii="Times New Roman" w:hAnsi="Times New Roman" w:cs="Times New Roman"/>
+        </w:rPr>
+        <w:t xml:space="preserve">-Hi</w:t>
+      </w:r>
+      <w:r>
+        <w:rPr>
+          <w:rStyle w:val="hljs-selector-id"/>
+          <w:rFonts w:ascii="Times New Roman" w:hAnsi="Times New Roman" w:cs="Times New Roman"/>
+        </w:rPr>
+        <w:t/>
+      </w:r>
+      <w:r>
+        <w:rPr>
+          <w:rFonts w:ascii="Times New Roman" w:hAnsi="Times New Roman" w:cs="Times New Roman"/>
+        </w:rPr>
+        <w:t/>
+      </w:r>
+    </w:p>
+    <w:p>
+      <w:pPr>
+        <w:spacing w:after="0" w:line="240" w:lineRule="auto"/>
+        <w:rPr>
+          <w:rFonts w:ascii="Times New Roman" w:hAnsi="Times New Roman" w:cs="Times New Roman"/>
+          <w:lang w:val="en-US"/>
+        </w:rPr>
+      </w:pPr>
+      <w:r>
+        <w:rPr>
+          <w:rFonts w:ascii="Times New Roman" w:hAnsi="Times New Roman" w:cs="Times New Roman"/>
+        </w:rPr>
+        <w:t xml:space="preserve">    </w:t>
+      </w:r>
+      <w:r>
+        <w:rPr>
+          <w:rFonts w:ascii="Times New Roman" w:hAnsi="Times New Roman" w:cs="Times New Roman"/>
+        </w:rPr>
+        <w:t xml:space="preserve">-Hello</w:t>
+      </w:r>
+      <w:r>
+        <w:rPr>
+          <w:rStyle w:val="hljs-selector-id"/>
+          <w:rFonts w:ascii="Times New Roman" w:hAnsi="Times New Roman" w:cs="Times New Roman"/>
+        </w:rPr>
+        <w:t/>
+      </w:r>
+      <w:r>
+        <w:rPr>
+          <w:rFonts w:ascii="Times New Roman" w:hAnsi="Times New Roman" w:cs="Times New Roman"/>
+        </w:rPr>
+        <w:t/>
+      </w:r>
+    </w:p>
+    <w:p>
+      <w:pPr>
+        <w:spacing w:after="0" w:line="240" w:lineRule="auto"/>
+        <w:rPr>
+          <w:rFonts w:ascii="Times New Roman" w:hAnsi="Times New Roman" w:cs="Times New Roman"/>
+          <w:lang w:val="en-US"/>
+        </w:rPr>
+      </w:pPr>
+      <w:r>
+        <w:rPr>
+          <w:rFonts w:ascii="Times New Roman" w:hAnsi="Times New Roman" w:cs="Times New Roman"/>
+        </w:rPr>
+        <w:t xml:space="preserve">    </w:t>
+      </w:r>
+      <w:r>
+        <w:rPr>
+          <w:rFonts w:ascii="Times New Roman" w:hAnsi="Times New Roman" w:cs="Times New Roman"/>
+        </w:rPr>
+        <w:t xml:space="preserve">-Bye</w:t>
+      </w:r>
+    </w:p>
+    <w:p>
+      <w:pPr>
+        <w:spacing w:after="0" w:line="240" w:lineRule="auto"/>
+        <w:rPr>
+          <w:rFonts w:ascii="Times New Roman" w:hAnsi="Times New Roman" w:cs="Times New Roman"/>
+        </w:rPr>
+      </w:pPr>
+      <w:r>
+        <w:rPr>
+          <w:rFonts w:ascii="Times New Roman" w:hAnsi="Times New Roman" w:cs="Times New Roman"/>
+        </w:rPr>
+        <w:t xml:space="preserve"> </w:t>
+      </w:r>
+    </w:p>
+    <w:p>
+      <w:pPr>
+        <w:spacing w:after="0" w:line="240" w:lineRule="auto"/>
+        <w:rPr>
+          <w:rFonts w:ascii="Times New Roman" w:hAnsi="Times New Roman" w:cs="Times New Roman"/>
+          <w:lang w:val="en-US"/>
+        </w:rPr>
+      </w:pPr>
+      <w:r>
+        <w:rPr>
+          <w:rStyle w:val="markedcontent"/>
+          <w:rFonts w:ascii="Times New Roman" w:hAnsi="Times New Roman" w:cs="Times New Roman"/>
+        </w:rPr>
+        <w:t xml:space="preserve">18</w:t>
+      </w:r>
+      <w:r>
+        <w:rPr>
+          <w:rStyle w:val="markedcontent"/>
+          <w:rFonts w:ascii="Times New Roman" w:hAnsi="Times New Roman" w:cs="Times New Roman"/>
+        </w:rPr>
+        <w:t xml:space="preserve">.</w:t>
+      </w:r>
+      <w:r>
+        <w:rPr>
+          <w:rStyle w:val="markedcontent"/>
+          <w:rFonts w:ascii="Times New Roman" w:hAnsi="Times New Roman" w:cs="Times New Roman"/>
+        </w:rPr>
+        <w:t xml:space="preserve"> What is Operating System?</w:t>
+      </w:r>
+      <w:r>
+        <w:rPr>
+          <w:rFonts w:ascii="Times New Roman" w:hAnsi="Times New Roman" w:cs="Times New Roman"/>
+        </w:rPr>
+        <w:t/>
+      </w:r>
+      <w:r>
+        <w:rPr>
+          <w:rStyle w:val="hljs-selector-id"/>
+          <w:rFonts w:ascii="Times New Roman" w:hAnsi="Times New Roman" w:cs="Times New Roman"/>
+        </w:rPr>
+        <w:t/>
+      </w:r>
+      <w:r>
+        <w:rPr>
+          <w:rFonts w:ascii="Times New Roman" w:hAnsi="Times New Roman" w:cs="Times New Roman"/>
+        </w:rPr>
+        <w:t/>
+      </w:r>
+    </w:p>
+    <w:p>
+      <w:pPr>
+        <w:spacing w:after="0" w:line="240" w:lineRule="auto"/>
+        <w:rPr>
+          <w:rFonts w:ascii="Times New Roman" w:hAnsi="Times New Roman" w:cs="Times New Roman"/>
+          <w:lang w:val="en-US"/>
+        </w:rPr>
+      </w:pPr>
+      <w:r>
+        <w:rPr>
+          <w:rFonts w:ascii="Times New Roman" w:hAnsi="Times New Roman" w:cs="Times New Roman"/>
+        </w:rPr>
+        <w:t xml:space="preserve">    </w:t>
+      </w:r>
+      <w:r>
+        <w:rPr>
+          <w:rFonts w:ascii="Times New Roman" w:hAnsi="Times New Roman" w:cs="Times New Roman"/>
+        </w:rPr>
+        <w:t xml:space="preserve">-Hi</w:t>
+      </w:r>
+      <w:r>
+        <w:rPr>
+          <w:rStyle w:val="hljs-selector-id"/>
+          <w:rFonts w:ascii="Times New Roman" w:hAnsi="Times New Roman" w:cs="Times New Roman"/>
+        </w:rPr>
+        <w:t/>
+      </w:r>
+      <w:r>
+        <w:rPr>
+          <w:rFonts w:ascii="Times New Roman" w:hAnsi="Times New Roman" w:cs="Times New Roman"/>
+        </w:rPr>
+        <w:t/>
+      </w:r>
+    </w:p>
+    <w:p>
+      <w:pPr>
+        <w:spacing w:after="0" w:line="240" w:lineRule="auto"/>
+        <w:rPr>
+          <w:rFonts w:ascii="Times New Roman" w:hAnsi="Times New Roman" w:cs="Times New Roman"/>
+          <w:lang w:val="en-US"/>
+        </w:rPr>
+      </w:pPr>
+      <w:r>
+        <w:rPr>
+          <w:rFonts w:ascii="Times New Roman" w:hAnsi="Times New Roman" w:cs="Times New Roman"/>
+        </w:rPr>
+        <w:t xml:space="preserve">    </w:t>
+      </w:r>
+      <w:r>
+        <w:rPr>
+          <w:rFonts w:ascii="Times New Roman" w:hAnsi="Times New Roman" w:cs="Times New Roman"/>
+        </w:rPr>
+        <w:t xml:space="preserve">-Hello</w:t>
+      </w:r>
+      <w:r>
+        <w:rPr>
+          <w:rStyle w:val="hljs-selector-id"/>
+          <w:rFonts w:ascii="Times New Roman" w:hAnsi="Times New Roman" w:cs="Times New Roman"/>
+        </w:rPr>
+        <w:t/>
+      </w:r>
+      <w:r>
+        <w:rPr>
+          <w:rFonts w:ascii="Times New Roman" w:hAnsi="Times New Roman" w:cs="Times New Roman"/>
+        </w:rPr>
+        <w:t/>
+      </w:r>
+    </w:p>
+    <w:p>
+      <w:pPr>
+        <w:spacing w:after="0" w:line="240" w:lineRule="auto"/>
+        <w:rPr>
+          <w:rFonts w:ascii="Times New Roman" w:hAnsi="Times New Roman" w:cs="Times New Roman"/>
+          <w:lang w:val="en-US"/>
+        </w:rPr>
+      </w:pPr>
+      <w:r>
+        <w:rPr>
+          <w:rFonts w:ascii="Times New Roman" w:hAnsi="Times New Roman" w:cs="Times New Roman"/>
+        </w:rPr>
+        <w:t xml:space="preserve">    </w:t>
+      </w:r>
+      <w:r>
+        <w:rPr>
+          <w:rFonts w:ascii="Times New Roman" w:hAnsi="Times New Roman" w:cs="Times New Roman"/>
+        </w:rPr>
+        <w:t xml:space="preserve">-Bye</w:t>
+      </w:r>
+    </w:p>
+    <w:p>
+      <w:pPr>
+        <w:spacing w:after="0" w:line="240" w:lineRule="auto"/>
+        <w:rPr>
+          <w:rFonts w:ascii="Times New Roman" w:hAnsi="Times New Roman" w:cs="Times New Roman"/>
+        </w:rPr>
+      </w:pPr>
+      <w:r>
+        <w:rPr>
+          <w:rFonts w:ascii="Times New Roman" w:hAnsi="Times New Roman" w:cs="Times New Roman"/>
         </w:rPr>
         <w:t/>
       </w:r>
     </w:p>
     <w:sectPr>
+      <w:type w:val="continuous"/>
       <w:pgSz w:w="11906" w:h="16838"/>
       <w:pgMar w:top="1440" w:right="1440" w:bottom="1440" w:left="1440" w:header="708" w:footer="708" w:gutter="0"/>
-      <w:cols w:space="708"/>
+      <w:cols w:num="2" w:space="708"/>
       <w:docGrid w:linePitch="360"/>
     </w:sectPr>
   </w:body>
 </w:document>
+</file>
+
+<file path=word/numbering.xml><?xml version="1.0" encoding="utf-8"?>
+<w:numbering xmlns:wpc="http://schemas.microsoft.com/office/word/2010/wordprocessingCanvas" xmlns:cx="http://schemas.microsoft.com/office/drawing/2014/chartex" xmlns:cx1="http://schemas.microsoft.com/office/drawing/2015/9/8/chartex" xmlns:cx2="http://schemas.microsoft.com/office/drawing/2015/10/21/chartex" xmlns:cx3="http://schemas.microsoft.com/office/drawing/2016/5/9/chartex" xmlns:cx4="http://schemas.microsoft.com/office/drawing/2016/5/10/chartex" xmlns:cx5="http://schemas.microsoft.com/office/drawing/2016/5/11/chartex" xmlns:cx6="http://schemas.microsoft.com/office/drawing/2016/5/12/chartex" xmlns:cx7="http://schemas.microsoft.com/office/drawing/2016/5/13/chartex" xmlns:cx8="http://schemas.microsoft.com/office/drawing/2016/5/14/chartex" xmlns:mc="http://schemas.openxmlformats.org/markup-compatibility/2006" xmlns:aink="http://schemas.microsoft.com/office/drawing/2016/ink" xmlns:am3d="http://schemas.microsoft.com/office/drawing/2017/model3d" xmlns:o="urn:schemas-microsoft-com:office:office" xmlns:oel="http://schemas.microsoft.com/office/2019/extlst" xmlns:r="http://schemas.openxmlformats.org/officeDocument/2006/relationships" xmlns:m="http://schemas.openxmlformats.org/officeDocument/2006/math" xmlns:v="urn:schemas-microsoft-com:vml" xmlns:wp14="http://schemas.microsoft.com/office/word/2010/wordprocessingDrawing" xmlns:wp="http://schemas.openxmlformats.org/drawingml/2006/wordprocessingDrawing" xmlns:w10="urn:schemas-microsoft-com:office:word" xmlns:w="http://schemas.openxmlformats.org/wordprocessingml/2006/main" xmlns:w14="http://schemas.microsoft.com/office/word/2010/wordml" xmlns:w15="http://schemas.microsoft.com/office/word/2012/wordml" xmlns:w16cex="http://schemas.microsoft.com/office/word/2018/wordml/cex" xmlns:w16cid="http://schemas.microsoft.com/office/word/2016/wordml/cid" xmlns:w16="http://schemas.microsoft.com/office/word/2018/wordml" xmlns:w16du="http://schemas.microsoft.com/office/word/2023/wordml/word16du" xmlns:w16sdtdh="http://schemas.microsoft.com/office/word/2020/wordml/sdtdatahash" xmlns:w16se="http://schemas.microsoft.com/office/word/2015/wordml/symex" xmlns:wpg="http://schemas.microsoft.com/office/word/2010/wordprocessingGroup" xmlns:wpi="http://schemas.microsoft.com/office/word/2010/wordprocessingInk" xmlns:wne="http://schemas.microsoft.com/office/word/2006/wordml" xmlns:wps="http://schemas.microsoft.com/office/word/2010/wordprocessingShape" mc:Ignorable="w14 w15 w16se w16cid w16 w16cex w16sdtdh w16du wp14">
+  <w:abstractNum w:abstractNumId="0" w15:restartNumberingAfterBreak="0">
+    <w:nsid w:val="32ED71BA"/>
+    <w:multiLevelType w:val="hybridMultilevel"/>
+    <w:tmpl w:val="E7FC59C4"/>
+    <w:lvl w:ilvl="0" w:tplc="4009000F">
+      <w:start w:val="1"/>
+      <w:numFmt w:val="decimal"/>
+      <w:lvlText w:val="%1."/>
+      <w:lvlJc w:val="left"/>
+      <w:pPr>
+        <w:ind w:left="720" w:hanging="360"/>
+      </w:pPr>
+      <w:rPr>
+        <w:rFonts w:hint="default"/>
+      </w:rPr>
+    </w:lvl>
+    <w:lvl w:ilvl="1" w:tplc="FFFFFFFF" w:tentative="1">
+      <w:start w:val="1"/>
+      <w:numFmt w:val="bullet"/>
+      <w:lvlText w:val="o"/>
+      <w:lvlJc w:val="left"/>
+      <w:pPr>
+        <w:ind w:left="1440" w:hanging="360"/>
+      </w:pPr>
+      <w:rPr>
+        <w:rFonts w:ascii="Courier New" w:hAnsi="Courier New" w:cs="Courier New" w:hint="default"/>
+      </w:rPr>
+    </w:lvl>
+    <w:lvl w:ilvl="2" w:tplc="FFFFFFFF" w:tentative="1">
+      <w:start w:val="1"/>
+      <w:numFmt w:val="bullet"/>
+      <w:lvlText w:val=""/>
+      <w:lvlJc w:val="left"/>
+      <w:pPr>
+        <w:ind w:left="2160" w:hanging="360"/>
+      </w:pPr>
+      <w:rPr>
+        <w:rFonts w:ascii="Wingdings" w:hAnsi="Wingdings" w:hint="default"/>
+      </w:rPr>
+    </w:lvl>
+    <w:lvl w:ilvl="3" w:tplc="FFFFFFFF" w:tentative="1">
+      <w:start w:val="1"/>
+      <w:numFmt w:val="bullet"/>
+      <w:lvlText w:val=""/>
+      <w:lvlJc w:val="left"/>
+      <w:pPr>
+        <w:ind w:left="2880" w:hanging="360"/>
+      </w:pPr>
+      <w:rPr>
+        <w:rFonts w:ascii="Symbol" w:hAnsi="Symbol" w:hint="default"/>
+      </w:rPr>
+    </w:lvl>
+    <w:lvl w:ilvl="4" w:tplc="FFFFFFFF" w:tentative="1">
+      <w:start w:val="1"/>
+      <w:numFmt w:val="bullet"/>
+      <w:lvlText w:val="o"/>
+      <w:lvlJc w:val="left"/>
+      <w:pPr>
+        <w:ind w:left="3600" w:hanging="360"/>
+      </w:pPr>
+      <w:rPr>
+        <w:rFonts w:ascii="Courier New" w:hAnsi="Courier New" w:cs="Courier New" w:hint="default"/>
+      </w:rPr>
+    </w:lvl>
+    <w:lvl w:ilvl="5" w:tplc="FFFFFFFF" w:tentative="1">
+      <w:start w:val="1"/>
+      <w:numFmt w:val="bullet"/>
+      <w:lvlText w:val=""/>
+      <w:lvlJc w:val="left"/>
+      <w:pPr>
+        <w:ind w:left="4320" w:hanging="360"/>
+      </w:pPr>
+      <w:rPr>
+        <w:rFonts w:ascii="Wingdings" w:hAnsi="Wingdings" w:hint="default"/>
+      </w:rPr>
+    </w:lvl>
+    <w:lvl w:ilvl="6" w:tplc="FFFFFFFF" w:tentative="1">
+      <w:start w:val="1"/>
+      <w:numFmt w:val="bullet"/>
+      <w:lvlText w:val=""/>
+      <w:lvlJc w:val="left"/>
+      <w:pPr>
+        <w:ind w:left="5040" w:hanging="360"/>
+      </w:pPr>
+      <w:rPr>
+        <w:rFonts w:ascii="Symbol" w:hAnsi="Symbol" w:hint="default"/>
+      </w:rPr>
+    </w:lvl>
+    <w:lvl w:ilvl="7" w:tplc="FFFFFFFF" w:tentative="1">
+      <w:start w:val="1"/>
+      <w:numFmt w:val="bullet"/>
+      <w:lvlText w:val="o"/>
+      <w:lvlJc w:val="left"/>
+      <w:pPr>
+        <w:ind w:left="5760" w:hanging="360"/>
+      </w:pPr>
+      <w:rPr>
+        <w:rFonts w:ascii="Courier New" w:hAnsi="Courier New" w:cs="Courier New" w:hint="default"/>
+      </w:rPr>
+    </w:lvl>
+    <w:lvl w:ilvl="8" w:tplc="FFFFFFFF" w:tentative="1">
+      <w:start w:val="1"/>
+      <w:numFmt w:val="bullet"/>
+      <w:lvlText w:val=""/>
+      <w:lvlJc w:val="left"/>
+      <w:pPr>
+        <w:ind w:left="6480" w:hanging="360"/>
+      </w:pPr>
+      <w:rPr>
+        <w:rFonts w:ascii="Wingdings" w:hAnsi="Wingdings" w:hint="default"/>
+      </w:rPr>
+    </w:lvl>
+  </w:abstractNum>
+  <w:abstractNum w:abstractNumId="1" w15:restartNumberingAfterBreak="0">
+    <w:nsid w:val="3C8B5314"/>
+    <w:multiLevelType w:val="hybridMultilevel"/>
+    <w:tmpl w:val="41326810"/>
+    <w:lvl w:ilvl="0" w:tplc="40090001">
+      <w:numFmt w:val="bullet"/>
+      <w:lvlText w:val=""/>
+      <w:lvlJc w:val="left"/>
+      <w:pPr>
+        <w:ind w:left="720" w:hanging="360"/>
+      </w:pPr>
+      <w:rPr>
+        <w:rFonts w:ascii="Symbol" w:eastAsia="Times New Roman" w:hAnsi="Symbol" w:cs="Times New Roman" w:hint="default"/>
+      </w:rPr>
+    </w:lvl>
+    <w:lvl w:ilvl="1" w:tplc="40090003" w:tentative="1">
+      <w:start w:val="1"/>
+      <w:numFmt w:val="bullet"/>
+      <w:lvlText w:val="o"/>
+      <w:lvlJc w:val="left"/>
+      <w:pPr>
+        <w:ind w:left="1440" w:hanging="360"/>
+      </w:pPr>
+      <w:rPr>
+        <w:rFonts w:ascii="Courier New" w:hAnsi="Courier New" w:cs="Courier New" w:hint="default"/>
+      </w:rPr>
+    </w:lvl>
+    <w:lvl w:ilvl="2" w:tplc="40090005" w:tentative="1">
+      <w:start w:val="1"/>
+      <w:numFmt w:val="bullet"/>
+      <w:lvlText w:val=""/>
+      <w:lvlJc w:val="left"/>
+      <w:pPr>
+        <w:ind w:left="2160" w:hanging="360"/>
+      </w:pPr>
+      <w:rPr>
+        <w:rFonts w:ascii="Wingdings" w:hAnsi="Wingdings" w:hint="default"/>
+      </w:rPr>
+    </w:lvl>
+    <w:lvl w:ilvl="3" w:tplc="40090001" w:tentative="1">
+      <w:start w:val="1"/>
+      <w:numFmt w:val="bullet"/>
+      <w:lvlText w:val=""/>
+      <w:lvlJc w:val="left"/>
+      <w:pPr>
+        <w:ind w:left="2880" w:hanging="360"/>
+      </w:pPr>
+      <w:rPr>
+        <w:rFonts w:ascii="Symbol" w:hAnsi="Symbol" w:hint="default"/>
+      </w:rPr>
+    </w:lvl>
+    <w:lvl w:ilvl="4" w:tplc="40090003" w:tentative="1">
+      <w:start w:val="1"/>
+      <w:numFmt w:val="bullet"/>
+      <w:lvlText w:val="o"/>
+      <w:lvlJc w:val="left"/>
+      <w:pPr>
+        <w:ind w:left="3600" w:hanging="360"/>
+      </w:pPr>
+      <w:rPr>
+        <w:rFonts w:ascii="Courier New" w:hAnsi="Courier New" w:cs="Courier New" w:hint="default"/>
+      </w:rPr>
+    </w:lvl>
+    <w:lvl w:ilvl="5" w:tplc="40090005" w:tentative="1">
+      <w:start w:val="1"/>
+      <w:numFmt w:val="bullet"/>
+      <w:lvlText w:val=""/>
+      <w:lvlJc w:val="left"/>
+      <w:pPr>
+        <w:ind w:left="4320" w:hanging="360"/>
+      </w:pPr>
+      <w:rPr>
+        <w:rFonts w:ascii="Wingdings" w:hAnsi="Wingdings" w:hint="default"/>
+      </w:rPr>
+    </w:lvl>
+    <w:lvl w:ilvl="6" w:tplc="40090001" w:tentative="1">
+      <w:start w:val="1"/>
+      <w:numFmt w:val="bullet"/>
+      <w:lvlText w:val=""/>
+      <w:lvlJc w:val="left"/>
+      <w:pPr>
+        <w:ind w:left="5040" w:hanging="360"/>
+      </w:pPr>
+      <w:rPr>
+        <w:rFonts w:ascii="Symbol" w:hAnsi="Symbol" w:hint="default"/>
+      </w:rPr>
+    </w:lvl>
+    <w:lvl w:ilvl="7" w:tplc="40090003" w:tentative="1">
+      <w:start w:val="1"/>
+      <w:numFmt w:val="bullet"/>
+      <w:lvlText w:val="o"/>
+      <w:lvlJc w:val="left"/>
+      <w:pPr>
+        <w:ind w:left="5760" w:hanging="360"/>
+      </w:pPr>
+      <w:rPr>
+        <w:rFonts w:ascii="Courier New" w:hAnsi="Courier New" w:cs="Courier New" w:hint="default"/>
+      </w:rPr>
+    </w:lvl>
+    <w:lvl w:ilvl="8" w:tplc="40090005" w:tentative="1">
+      <w:start w:val="1"/>
+      <w:numFmt w:val="bullet"/>
+      <w:lvlText w:val=""/>
+      <w:lvlJc w:val="left"/>
+      <w:pPr>
+        <w:ind w:left="6480" w:hanging="360"/>
+      </w:pPr>
+      <w:rPr>
+        <w:rFonts w:ascii="Wingdings" w:hAnsi="Wingdings" w:hint="default"/>
+      </w:rPr>
+    </w:lvl>
+  </w:abstractNum>
+  <w:abstractNum w:abstractNumId="2" w15:restartNumberingAfterBreak="0">
+    <w:nsid w:val="76020502"/>
+    <w:multiLevelType w:val="hybridMultilevel"/>
+    <w:tmpl w:val="BC5E014C"/>
+    <w:lvl w:ilvl="0" w:tplc="40090001">
+      <w:start w:val="1"/>
+      <w:numFmt w:val="bullet"/>
+      <w:lvlText w:val=""/>
+      <w:lvlJc w:val="left"/>
+      <w:pPr>
+        <w:ind w:left="720" w:hanging="360"/>
+      </w:pPr>
+      <w:rPr>
+        <w:rFonts w:ascii="Symbol" w:hAnsi="Symbol" w:hint="default"/>
+      </w:rPr>
+    </w:lvl>
+    <w:lvl w:ilvl="1" w:tplc="40090003" w:tentative="1">
+      <w:start w:val="1"/>
+      <w:numFmt w:val="bullet"/>
+      <w:lvlText w:val="o"/>
+      <w:lvlJc w:val="left"/>
+      <w:pPr>
+        <w:ind w:left="1440" w:hanging="360"/>
+      </w:pPr>
+      <w:rPr>
+        <w:rFonts w:ascii="Courier New" w:hAnsi="Courier New" w:cs="Courier New" w:hint="default"/>
+      </w:rPr>
+    </w:lvl>
+    <w:lvl w:ilvl="2" w:tplc="40090005" w:tentative="1">
+      <w:start w:val="1"/>
+      <w:numFmt w:val="bullet"/>
+      <w:lvlText w:val=""/>
+      <w:lvlJc w:val="left"/>
+      <w:pPr>
+        <w:ind w:left="2160" w:hanging="360"/>
+      </w:pPr>
+      <w:rPr>
+        <w:rFonts w:ascii="Wingdings" w:hAnsi="Wingdings" w:hint="default"/>
+      </w:rPr>
+    </w:lvl>
+    <w:lvl w:ilvl="3" w:tplc="40090001" w:tentative="1">
+      <w:start w:val="1"/>
+      <w:numFmt w:val="bullet"/>
+      <w:lvlText w:val=""/>
+      <w:lvlJc w:val="left"/>
+      <w:pPr>
+        <w:ind w:left="2880" w:hanging="360"/>
+      </w:pPr>
+      <w:rPr>
+        <w:rFonts w:ascii="Symbol" w:hAnsi="Symbol" w:hint="default"/>
+      </w:rPr>
+    </w:lvl>
+    <w:lvl w:ilvl="4" w:tplc="40090003" w:tentative="1">
+      <w:start w:val="1"/>
+      <w:numFmt w:val="bullet"/>
+      <w:lvlText w:val="o"/>
+      <w:lvlJc w:val="left"/>
+      <w:pPr>
+        <w:ind w:left="3600" w:hanging="360"/>
+      </w:pPr>
+      <w:rPr>
+        <w:rFonts w:ascii="Courier New" w:hAnsi="Courier New" w:cs="Courier New" w:hint="default"/>
+      </w:rPr>
+    </w:lvl>
+    <w:lvl w:ilvl="5" w:tplc="40090005" w:tentative="1">
+      <w:start w:val="1"/>
+      <w:numFmt w:val="bullet"/>
+      <w:lvlText w:val=""/>
+      <w:lvlJc w:val="left"/>
+      <w:pPr>
+        <w:ind w:left="4320" w:hanging="360"/>
+      </w:pPr>
+      <w:rPr>
+        <w:rFonts w:ascii="Wingdings" w:hAnsi="Wingdings" w:hint="default"/>
+      </w:rPr>
+    </w:lvl>
+    <w:lvl w:ilvl="6" w:tplc="40090001" w:tentative="1">
+      <w:start w:val="1"/>
+      <w:numFmt w:val="bullet"/>
+      <w:lvlText w:val=""/>
+      <w:lvlJc w:val="left"/>
+      <w:pPr>
+        <w:ind w:left="5040" w:hanging="360"/>
+      </w:pPr>
+      <w:rPr>
+        <w:rFonts w:ascii="Symbol" w:hAnsi="Symbol" w:hint="default"/>
+      </w:rPr>
+    </w:lvl>
+    <w:lvl w:ilvl="7" w:tplc="40090003" w:tentative="1">
+      <w:start w:val="1"/>
+      <w:numFmt w:val="bullet"/>
+      <w:lvlText w:val="o"/>
+      <w:lvlJc w:val="left"/>
+      <w:pPr>
+        <w:ind w:left="5760" w:hanging="360"/>
+      </w:pPr>
+      <w:rPr>
+        <w:rFonts w:ascii="Courier New" w:hAnsi="Courier New" w:cs="Courier New" w:hint="default"/>
+      </w:rPr>
+    </w:lvl>
+    <w:lvl w:ilvl="8" w:tplc="40090005" w:tentative="1">
+      <w:start w:val="1"/>
+      <w:numFmt w:val="bullet"/>
+      <w:lvlText w:val=""/>
+      <w:lvlJc w:val="left"/>
+      <w:pPr>
+        <w:ind w:left="6480" w:hanging="360"/>
+      </w:pPr>
+      <w:rPr>
+        <w:rFonts w:ascii="Wingdings" w:hAnsi="Wingdings" w:hint="default"/>
+      </w:rPr>
+    </w:lvl>
+  </w:abstractNum>
+  <w:num w:numId="1" w16cid:durableId="446388376">
+    <w:abstractNumId w:val="2"/>
+  </w:num>
+  <w:num w:numId="2" w16cid:durableId="488984595">
+    <w:abstractNumId w:val="1"/>
+  </w:num>
+  <w:num w:numId="3" w16cid:durableId="983697697">
+    <w:abstractNumId w:val="0"/>
+  </w:num>
+</w:numbering>
 </file>
 
 <file path=word/styles.xml><?xml version="1.0" encoding="utf-8"?>
@@ -1439,6 +4355,17 @@
     <w:basedOn w:val="DefaultParagraphFont"/>
     <w:rsid w:val="00A34079"/>
   </w:style>
+  <w:style w:type="character" w:styleId="Strong">
+    <w:name w:val="Strong"/>
+    <w:basedOn w:val="DefaultParagraphFont"/>
+    <w:uiPriority w:val="22"/>
+    <w:qFormat/>
+    <w:rsid w:val="0023788B"/>
+    <w:rPr>
+      <w:b/>
+      <w:bCs/>
+    </w:rPr>
+  </w:style>
 </w:styles>
 </file>
 

</xml_diff>

<commit_message>
Added numbering to options
</commit_message>
<xml_diff>
--- a/backend/controllers/output.docx
+++ b/backend/controllers/output.docx
@@ -21,6 +21,26 @@
         </w:rPr>
         <w:t xml:space="preserve">CA1</w:t>
       </w:r>
+      <w:proofErr w:type="spellStart"/>
+      <w:r>
+        <w:rPr>
+          <w:rFonts w:ascii="Times New Roman" w:hAnsi="Times New Roman" w:cs="Times New Roman"/>
+          <w:b/>
+          <w:bCs/>
+          <w:lang w:val="en-US"/>
+        </w:rPr>
+        <w:t/>
+      </w:r>
+      <w:proofErr w:type="spellEnd"/>
+      <w:r>
+        <w:rPr>
+          <w:rFonts w:ascii="Times New Roman" w:hAnsi="Times New Roman" w:cs="Times New Roman"/>
+          <w:b/>
+          <w:bCs/>
+          <w:lang w:val="en-US"/>
+        </w:rPr>
+        <w:t/>
+      </w:r>
     </w:p>
     <w:p>
       <w:pPr>
@@ -39,7 +59,27 @@
           <w:bCs/>
           <w:lang w:val="en-US"/>
         </w:rPr>
-        <w:t xml:space="preserve">CSE316:</w:t>
+        <w:t xml:space="preserve">CSE316</w:t>
+      </w:r>
+      <w:proofErr w:type="spellStart"/>
+      <w:r>
+        <w:rPr>
+          <w:rFonts w:ascii="Times New Roman" w:hAnsi="Times New Roman" w:cs="Times New Roman"/>
+          <w:b/>
+          <w:bCs/>
+          <w:lang w:val="en-US"/>
+        </w:rPr>
+        <w:t/>
+      </w:r>
+      <w:proofErr w:type="spellEnd"/>
+      <w:r>
+        <w:rPr>
+          <w:rFonts w:ascii="Times New Roman" w:hAnsi="Times New Roman" w:cs="Times New Roman"/>
+          <w:b/>
+          <w:bCs/>
+          <w:lang w:val="en-US"/>
+        </w:rPr>
+        <w:t xml:space="preserve">:</w:t>
       </w:r>
       <w:r>
         <w:rPr>
@@ -58,6 +98,26 @@
           <w:lang w:val="en-US"/>
         </w:rPr>
         <w:t xml:space="preserve">Operating System</w:t>
+      </w:r>
+      <w:proofErr w:type="spellStart"/>
+      <w:r>
+        <w:rPr>
+          <w:rFonts w:ascii="Times New Roman" w:hAnsi="Times New Roman" w:cs="Times New Roman"/>
+          <w:b/>
+          <w:bCs/>
+          <w:lang w:val="en-US"/>
+        </w:rPr>
+        <w:t/>
+      </w:r>
+      <w:proofErr w:type="spellEnd"/>
+      <w:r>
+        <w:rPr>
+          <w:rFonts w:ascii="Times New Roman" w:hAnsi="Times New Roman" w:cs="Times New Roman"/>
+          <w:b/>
+          <w:bCs/>
+          <w:lang w:val="en-US"/>
+        </w:rPr>
+        <w:t/>
       </w:r>
     </w:p>
     <w:p>
@@ -242,6 +302,8 @@
         <w:rPr>
           <w:rStyle w:val="markedcontent"/>
           <w:rFonts w:ascii="Times New Roman" w:hAnsi="Times New Roman" w:cs="Times New Roman"/>
+          <w:b/>
+          <w:bCs/>
         </w:rPr>
         <w:t xml:space="preserve">1</w:t>
       </w:r>
@@ -249,6 +311,8 @@
         <w:rPr>
           <w:rStyle w:val="markedcontent"/>
           <w:rFonts w:ascii="Times New Roman" w:hAnsi="Times New Roman" w:cs="Times New Roman"/>
+          <w:b/>
+          <w:bCs/>
         </w:rPr>
         <w:t xml:space="preserve">.</w:t>
       </w:r>
@@ -297,75 +361,75 @@
         <w:rPr>
           <w:rFonts w:ascii="Times New Roman" w:hAnsi="Times New Roman" w:cs="Times New Roman"/>
         </w:rPr>
-        <w:t xml:space="preserve">-Hi</w:t>
-      </w:r>
-      <w:r>
-        <w:rPr>
-          <w:rStyle w:val="hljs-selector-id"/>
-          <w:rFonts w:ascii="Times New Roman" w:hAnsi="Times New Roman" w:cs="Times New Roman"/>
-        </w:rPr>
-        <w:t/>
-      </w:r>
-      <w:r>
-        <w:rPr>
-          <w:rFonts w:ascii="Times New Roman" w:hAnsi="Times New Roman" w:cs="Times New Roman"/>
-        </w:rPr>
-        <w:t/>
-      </w:r>
-    </w:p>
-    <w:p>
-      <w:pPr>
-        <w:spacing w:after="0" w:line="240" w:lineRule="auto"/>
-        <w:rPr>
-          <w:rFonts w:ascii="Times New Roman" w:hAnsi="Times New Roman" w:cs="Times New Roman"/>
-          <w:lang w:val="en-US"/>
-        </w:rPr>
-      </w:pPr>
-      <w:r>
-        <w:rPr>
-          <w:rFonts w:ascii="Times New Roman" w:hAnsi="Times New Roman" w:cs="Times New Roman"/>
-        </w:rPr>
-        <w:t xml:space="preserve">    </w:t>
-      </w:r>
-      <w:r>
-        <w:rPr>
-          <w:rFonts w:ascii="Times New Roman" w:hAnsi="Times New Roman" w:cs="Times New Roman"/>
-        </w:rPr>
-        <w:t xml:space="preserve">-Hello</w:t>
-      </w:r>
-      <w:r>
-        <w:rPr>
-          <w:rStyle w:val="hljs-selector-id"/>
-          <w:rFonts w:ascii="Times New Roman" w:hAnsi="Times New Roman" w:cs="Times New Roman"/>
-        </w:rPr>
-        <w:t/>
-      </w:r>
-      <w:r>
-        <w:rPr>
-          <w:rFonts w:ascii="Times New Roman" w:hAnsi="Times New Roman" w:cs="Times New Roman"/>
-        </w:rPr>
-        <w:t/>
-      </w:r>
-    </w:p>
-    <w:p>
-      <w:pPr>
-        <w:spacing w:after="0" w:line="240" w:lineRule="auto"/>
-        <w:rPr>
-          <w:rFonts w:ascii="Times New Roman" w:hAnsi="Times New Roman" w:cs="Times New Roman"/>
-          <w:lang w:val="en-US"/>
-        </w:rPr>
-      </w:pPr>
-      <w:r>
-        <w:rPr>
-          <w:rFonts w:ascii="Times New Roman" w:hAnsi="Times New Roman" w:cs="Times New Roman"/>
-        </w:rPr>
-        <w:t xml:space="preserve">    </w:t>
-      </w:r>
-      <w:r>
-        <w:rPr>
-          <w:rFonts w:ascii="Times New Roman" w:hAnsi="Times New Roman" w:cs="Times New Roman"/>
-        </w:rPr>
-        <w:t xml:space="preserve">-Bye</w:t>
+        <w:t xml:space="preserve">A. Hi</w:t>
+      </w:r>
+      <w:r>
+        <w:rPr>
+          <w:rStyle w:val="hljs-selector-id"/>
+          <w:rFonts w:ascii="Times New Roman" w:hAnsi="Times New Roman" w:cs="Times New Roman"/>
+        </w:rPr>
+        <w:t/>
+      </w:r>
+      <w:r>
+        <w:rPr>
+          <w:rFonts w:ascii="Times New Roman" w:hAnsi="Times New Roman" w:cs="Times New Roman"/>
+        </w:rPr>
+        <w:t/>
+      </w:r>
+    </w:p>
+    <w:p>
+      <w:pPr>
+        <w:spacing w:after="0" w:line="240" w:lineRule="auto"/>
+        <w:rPr>
+          <w:rFonts w:ascii="Times New Roman" w:hAnsi="Times New Roman" w:cs="Times New Roman"/>
+          <w:lang w:val="en-US"/>
+        </w:rPr>
+      </w:pPr>
+      <w:r>
+        <w:rPr>
+          <w:rFonts w:ascii="Times New Roman" w:hAnsi="Times New Roman" w:cs="Times New Roman"/>
+        </w:rPr>
+        <w:t xml:space="preserve">    </w:t>
+      </w:r>
+      <w:r>
+        <w:rPr>
+          <w:rFonts w:ascii="Times New Roman" w:hAnsi="Times New Roman" w:cs="Times New Roman"/>
+        </w:rPr>
+        <w:t xml:space="preserve">B. Hello</w:t>
+      </w:r>
+      <w:r>
+        <w:rPr>
+          <w:rStyle w:val="hljs-selector-id"/>
+          <w:rFonts w:ascii="Times New Roman" w:hAnsi="Times New Roman" w:cs="Times New Roman"/>
+        </w:rPr>
+        <w:t/>
+      </w:r>
+      <w:r>
+        <w:rPr>
+          <w:rFonts w:ascii="Times New Roman" w:hAnsi="Times New Roman" w:cs="Times New Roman"/>
+        </w:rPr>
+        <w:t/>
+      </w:r>
+    </w:p>
+    <w:p>
+      <w:pPr>
+        <w:spacing w:after="0" w:line="240" w:lineRule="auto"/>
+        <w:rPr>
+          <w:rFonts w:ascii="Times New Roman" w:hAnsi="Times New Roman" w:cs="Times New Roman"/>
+          <w:lang w:val="en-US"/>
+        </w:rPr>
+      </w:pPr>
+      <w:r>
+        <w:rPr>
+          <w:rFonts w:ascii="Times New Roman" w:hAnsi="Times New Roman" w:cs="Times New Roman"/>
+        </w:rPr>
+        <w:t xml:space="preserve">    </w:t>
+      </w:r>
+      <w:r>
+        <w:rPr>
+          <w:rFonts w:ascii="Times New Roman" w:hAnsi="Times New Roman" w:cs="Times New Roman"/>
+        </w:rPr>
+        <w:t xml:space="preserve">C. Bye</w:t>
       </w:r>
     </w:p>
     <w:p>
@@ -394,6 +458,8 @@
         <w:rPr>
           <w:rStyle w:val="markedcontent"/>
           <w:rFonts w:ascii="Times New Roman" w:hAnsi="Times New Roman" w:cs="Times New Roman"/>
+          <w:b/>
+          <w:bCs/>
         </w:rPr>
         <w:t xml:space="preserve">2</w:t>
       </w:r>
@@ -401,6 +467,8 @@
         <w:rPr>
           <w:rStyle w:val="markedcontent"/>
           <w:rFonts w:ascii="Times New Roman" w:hAnsi="Times New Roman" w:cs="Times New Roman"/>
+          <w:b/>
+          <w:bCs/>
         </w:rPr>
         <w:t xml:space="preserve">.</w:t>
       </w:r>
@@ -449,75 +517,75 @@
         <w:rPr>
           <w:rFonts w:ascii="Times New Roman" w:hAnsi="Times New Roman" w:cs="Times New Roman"/>
         </w:rPr>
-        <w:t xml:space="preserve">-Hi</w:t>
-      </w:r>
-      <w:r>
-        <w:rPr>
-          <w:rStyle w:val="hljs-selector-id"/>
-          <w:rFonts w:ascii="Times New Roman" w:hAnsi="Times New Roman" w:cs="Times New Roman"/>
-        </w:rPr>
-        <w:t/>
-      </w:r>
-      <w:r>
-        <w:rPr>
-          <w:rFonts w:ascii="Times New Roman" w:hAnsi="Times New Roman" w:cs="Times New Roman"/>
-        </w:rPr>
-        <w:t/>
-      </w:r>
-    </w:p>
-    <w:p>
-      <w:pPr>
-        <w:spacing w:after="0" w:line="240" w:lineRule="auto"/>
-        <w:rPr>
-          <w:rFonts w:ascii="Times New Roman" w:hAnsi="Times New Roman" w:cs="Times New Roman"/>
-          <w:lang w:val="en-US"/>
-        </w:rPr>
-      </w:pPr>
-      <w:r>
-        <w:rPr>
-          <w:rFonts w:ascii="Times New Roman" w:hAnsi="Times New Roman" w:cs="Times New Roman"/>
-        </w:rPr>
-        <w:t xml:space="preserve">    </w:t>
-      </w:r>
-      <w:r>
-        <w:rPr>
-          <w:rFonts w:ascii="Times New Roman" w:hAnsi="Times New Roman" w:cs="Times New Roman"/>
-        </w:rPr>
-        <w:t xml:space="preserve">-Hello</w:t>
-      </w:r>
-      <w:r>
-        <w:rPr>
-          <w:rStyle w:val="hljs-selector-id"/>
-          <w:rFonts w:ascii="Times New Roman" w:hAnsi="Times New Roman" w:cs="Times New Roman"/>
-        </w:rPr>
-        <w:t/>
-      </w:r>
-      <w:r>
-        <w:rPr>
-          <w:rFonts w:ascii="Times New Roman" w:hAnsi="Times New Roman" w:cs="Times New Roman"/>
-        </w:rPr>
-        <w:t/>
-      </w:r>
-    </w:p>
-    <w:p>
-      <w:pPr>
-        <w:spacing w:after="0" w:line="240" w:lineRule="auto"/>
-        <w:rPr>
-          <w:rFonts w:ascii="Times New Roman" w:hAnsi="Times New Roman" w:cs="Times New Roman"/>
-          <w:lang w:val="en-US"/>
-        </w:rPr>
-      </w:pPr>
-      <w:r>
-        <w:rPr>
-          <w:rFonts w:ascii="Times New Roman" w:hAnsi="Times New Roman" w:cs="Times New Roman"/>
-        </w:rPr>
-        <w:t xml:space="preserve">    </w:t>
-      </w:r>
-      <w:r>
-        <w:rPr>
-          <w:rFonts w:ascii="Times New Roman" w:hAnsi="Times New Roman" w:cs="Times New Roman"/>
-        </w:rPr>
-        <w:t xml:space="preserve">-Bye</w:t>
+        <w:t xml:space="preserve">A. Hi</w:t>
+      </w:r>
+      <w:r>
+        <w:rPr>
+          <w:rStyle w:val="hljs-selector-id"/>
+          <w:rFonts w:ascii="Times New Roman" w:hAnsi="Times New Roman" w:cs="Times New Roman"/>
+        </w:rPr>
+        <w:t/>
+      </w:r>
+      <w:r>
+        <w:rPr>
+          <w:rFonts w:ascii="Times New Roman" w:hAnsi="Times New Roman" w:cs="Times New Roman"/>
+        </w:rPr>
+        <w:t/>
+      </w:r>
+    </w:p>
+    <w:p>
+      <w:pPr>
+        <w:spacing w:after="0" w:line="240" w:lineRule="auto"/>
+        <w:rPr>
+          <w:rFonts w:ascii="Times New Roman" w:hAnsi="Times New Roman" w:cs="Times New Roman"/>
+          <w:lang w:val="en-US"/>
+        </w:rPr>
+      </w:pPr>
+      <w:r>
+        <w:rPr>
+          <w:rFonts w:ascii="Times New Roman" w:hAnsi="Times New Roman" w:cs="Times New Roman"/>
+        </w:rPr>
+        <w:t xml:space="preserve">    </w:t>
+      </w:r>
+      <w:r>
+        <w:rPr>
+          <w:rFonts w:ascii="Times New Roman" w:hAnsi="Times New Roman" w:cs="Times New Roman"/>
+        </w:rPr>
+        <w:t xml:space="preserve">B. Hello</w:t>
+      </w:r>
+      <w:r>
+        <w:rPr>
+          <w:rStyle w:val="hljs-selector-id"/>
+          <w:rFonts w:ascii="Times New Roman" w:hAnsi="Times New Roman" w:cs="Times New Roman"/>
+        </w:rPr>
+        <w:t/>
+      </w:r>
+      <w:r>
+        <w:rPr>
+          <w:rFonts w:ascii="Times New Roman" w:hAnsi="Times New Roman" w:cs="Times New Roman"/>
+        </w:rPr>
+        <w:t/>
+      </w:r>
+    </w:p>
+    <w:p>
+      <w:pPr>
+        <w:spacing w:after="0" w:line="240" w:lineRule="auto"/>
+        <w:rPr>
+          <w:rFonts w:ascii="Times New Roman" w:hAnsi="Times New Roman" w:cs="Times New Roman"/>
+          <w:lang w:val="en-US"/>
+        </w:rPr>
+      </w:pPr>
+      <w:r>
+        <w:rPr>
+          <w:rFonts w:ascii="Times New Roman" w:hAnsi="Times New Roman" w:cs="Times New Roman"/>
+        </w:rPr>
+        <w:t xml:space="preserve">    </w:t>
+      </w:r>
+      <w:r>
+        <w:rPr>
+          <w:rFonts w:ascii="Times New Roman" w:hAnsi="Times New Roman" w:cs="Times New Roman"/>
+        </w:rPr>
+        <w:t xml:space="preserve">C. Bye</w:t>
       </w:r>
     </w:p>
     <w:p>
@@ -546,6 +614,8 @@
         <w:rPr>
           <w:rStyle w:val="markedcontent"/>
           <w:rFonts w:ascii="Times New Roman" w:hAnsi="Times New Roman" w:cs="Times New Roman"/>
+          <w:b/>
+          <w:bCs/>
         </w:rPr>
         <w:t xml:space="preserve">3</w:t>
       </w:r>
@@ -553,6 +623,8 @@
         <w:rPr>
           <w:rStyle w:val="markedcontent"/>
           <w:rFonts w:ascii="Times New Roman" w:hAnsi="Times New Roman" w:cs="Times New Roman"/>
+          <w:b/>
+          <w:bCs/>
         </w:rPr>
         <w:t xml:space="preserve">.</w:t>
       </w:r>
@@ -601,75 +673,75 @@
         <w:rPr>
           <w:rFonts w:ascii="Times New Roman" w:hAnsi="Times New Roman" w:cs="Times New Roman"/>
         </w:rPr>
-        <w:t xml:space="preserve">-Hi</w:t>
-      </w:r>
-      <w:r>
-        <w:rPr>
-          <w:rStyle w:val="hljs-selector-id"/>
-          <w:rFonts w:ascii="Times New Roman" w:hAnsi="Times New Roman" w:cs="Times New Roman"/>
-        </w:rPr>
-        <w:t/>
-      </w:r>
-      <w:r>
-        <w:rPr>
-          <w:rFonts w:ascii="Times New Roman" w:hAnsi="Times New Roman" w:cs="Times New Roman"/>
-        </w:rPr>
-        <w:t/>
-      </w:r>
-    </w:p>
-    <w:p>
-      <w:pPr>
-        <w:spacing w:after="0" w:line="240" w:lineRule="auto"/>
-        <w:rPr>
-          <w:rFonts w:ascii="Times New Roman" w:hAnsi="Times New Roman" w:cs="Times New Roman"/>
-          <w:lang w:val="en-US"/>
-        </w:rPr>
-      </w:pPr>
-      <w:r>
-        <w:rPr>
-          <w:rFonts w:ascii="Times New Roman" w:hAnsi="Times New Roman" w:cs="Times New Roman"/>
-        </w:rPr>
-        <w:t xml:space="preserve">    </w:t>
-      </w:r>
-      <w:r>
-        <w:rPr>
-          <w:rFonts w:ascii="Times New Roman" w:hAnsi="Times New Roman" w:cs="Times New Roman"/>
-        </w:rPr>
-        <w:t xml:space="preserve">-Hello</w:t>
-      </w:r>
-      <w:r>
-        <w:rPr>
-          <w:rStyle w:val="hljs-selector-id"/>
-          <w:rFonts w:ascii="Times New Roman" w:hAnsi="Times New Roman" w:cs="Times New Roman"/>
-        </w:rPr>
-        <w:t/>
-      </w:r>
-      <w:r>
-        <w:rPr>
-          <w:rFonts w:ascii="Times New Roman" w:hAnsi="Times New Roman" w:cs="Times New Roman"/>
-        </w:rPr>
-        <w:t/>
-      </w:r>
-    </w:p>
-    <w:p>
-      <w:pPr>
-        <w:spacing w:after="0" w:line="240" w:lineRule="auto"/>
-        <w:rPr>
-          <w:rFonts w:ascii="Times New Roman" w:hAnsi="Times New Roman" w:cs="Times New Roman"/>
-          <w:lang w:val="en-US"/>
-        </w:rPr>
-      </w:pPr>
-      <w:r>
-        <w:rPr>
-          <w:rFonts w:ascii="Times New Roman" w:hAnsi="Times New Roman" w:cs="Times New Roman"/>
-        </w:rPr>
-        <w:t xml:space="preserve">    </w:t>
-      </w:r>
-      <w:r>
-        <w:rPr>
-          <w:rFonts w:ascii="Times New Roman" w:hAnsi="Times New Roman" w:cs="Times New Roman"/>
-        </w:rPr>
-        <w:t xml:space="preserve">-Bye</w:t>
+        <w:t xml:space="preserve">A. Hi</w:t>
+      </w:r>
+      <w:r>
+        <w:rPr>
+          <w:rStyle w:val="hljs-selector-id"/>
+          <w:rFonts w:ascii="Times New Roman" w:hAnsi="Times New Roman" w:cs="Times New Roman"/>
+        </w:rPr>
+        <w:t/>
+      </w:r>
+      <w:r>
+        <w:rPr>
+          <w:rFonts w:ascii="Times New Roman" w:hAnsi="Times New Roman" w:cs="Times New Roman"/>
+        </w:rPr>
+        <w:t/>
+      </w:r>
+    </w:p>
+    <w:p>
+      <w:pPr>
+        <w:spacing w:after="0" w:line="240" w:lineRule="auto"/>
+        <w:rPr>
+          <w:rFonts w:ascii="Times New Roman" w:hAnsi="Times New Roman" w:cs="Times New Roman"/>
+          <w:lang w:val="en-US"/>
+        </w:rPr>
+      </w:pPr>
+      <w:r>
+        <w:rPr>
+          <w:rFonts w:ascii="Times New Roman" w:hAnsi="Times New Roman" w:cs="Times New Roman"/>
+        </w:rPr>
+        <w:t xml:space="preserve">    </w:t>
+      </w:r>
+      <w:r>
+        <w:rPr>
+          <w:rFonts w:ascii="Times New Roman" w:hAnsi="Times New Roman" w:cs="Times New Roman"/>
+        </w:rPr>
+        <w:t xml:space="preserve">B. Hello</w:t>
+      </w:r>
+      <w:r>
+        <w:rPr>
+          <w:rStyle w:val="hljs-selector-id"/>
+          <w:rFonts w:ascii="Times New Roman" w:hAnsi="Times New Roman" w:cs="Times New Roman"/>
+        </w:rPr>
+        <w:t/>
+      </w:r>
+      <w:r>
+        <w:rPr>
+          <w:rFonts w:ascii="Times New Roman" w:hAnsi="Times New Roman" w:cs="Times New Roman"/>
+        </w:rPr>
+        <w:t/>
+      </w:r>
+    </w:p>
+    <w:p>
+      <w:pPr>
+        <w:spacing w:after="0" w:line="240" w:lineRule="auto"/>
+        <w:rPr>
+          <w:rFonts w:ascii="Times New Roman" w:hAnsi="Times New Roman" w:cs="Times New Roman"/>
+          <w:lang w:val="en-US"/>
+        </w:rPr>
+      </w:pPr>
+      <w:r>
+        <w:rPr>
+          <w:rFonts w:ascii="Times New Roman" w:hAnsi="Times New Roman" w:cs="Times New Roman"/>
+        </w:rPr>
+        <w:t xml:space="preserve">    </w:t>
+      </w:r>
+      <w:r>
+        <w:rPr>
+          <w:rFonts w:ascii="Times New Roman" w:hAnsi="Times New Roman" w:cs="Times New Roman"/>
+        </w:rPr>
+        <w:t xml:space="preserve">C. Bye</w:t>
       </w:r>
     </w:p>
     <w:p>
@@ -698,6 +770,8 @@
         <w:rPr>
           <w:rStyle w:val="markedcontent"/>
           <w:rFonts w:ascii="Times New Roman" w:hAnsi="Times New Roman" w:cs="Times New Roman"/>
+          <w:b/>
+          <w:bCs/>
         </w:rPr>
         <w:t xml:space="preserve">4</w:t>
       </w:r>
@@ -705,6 +779,8 @@
         <w:rPr>
           <w:rStyle w:val="markedcontent"/>
           <w:rFonts w:ascii="Times New Roman" w:hAnsi="Times New Roman" w:cs="Times New Roman"/>
+          <w:b/>
+          <w:bCs/>
         </w:rPr>
         <w:t xml:space="preserve">.</w:t>
       </w:r>
@@ -753,75 +829,75 @@
         <w:rPr>
           <w:rFonts w:ascii="Times New Roman" w:hAnsi="Times New Roman" w:cs="Times New Roman"/>
         </w:rPr>
-        <w:t xml:space="preserve">-Hi</w:t>
-      </w:r>
-      <w:r>
-        <w:rPr>
-          <w:rStyle w:val="hljs-selector-id"/>
-          <w:rFonts w:ascii="Times New Roman" w:hAnsi="Times New Roman" w:cs="Times New Roman"/>
-        </w:rPr>
-        <w:t/>
-      </w:r>
-      <w:r>
-        <w:rPr>
-          <w:rFonts w:ascii="Times New Roman" w:hAnsi="Times New Roman" w:cs="Times New Roman"/>
-        </w:rPr>
-        <w:t/>
-      </w:r>
-    </w:p>
-    <w:p>
-      <w:pPr>
-        <w:spacing w:after="0" w:line="240" w:lineRule="auto"/>
-        <w:rPr>
-          <w:rFonts w:ascii="Times New Roman" w:hAnsi="Times New Roman" w:cs="Times New Roman"/>
-          <w:lang w:val="en-US"/>
-        </w:rPr>
-      </w:pPr>
-      <w:r>
-        <w:rPr>
-          <w:rFonts w:ascii="Times New Roman" w:hAnsi="Times New Roman" w:cs="Times New Roman"/>
-        </w:rPr>
-        <w:t xml:space="preserve">    </w:t>
-      </w:r>
-      <w:r>
-        <w:rPr>
-          <w:rFonts w:ascii="Times New Roman" w:hAnsi="Times New Roman" w:cs="Times New Roman"/>
-        </w:rPr>
-        <w:t xml:space="preserve">-Hello</w:t>
-      </w:r>
-      <w:r>
-        <w:rPr>
-          <w:rStyle w:val="hljs-selector-id"/>
-          <w:rFonts w:ascii="Times New Roman" w:hAnsi="Times New Roman" w:cs="Times New Roman"/>
-        </w:rPr>
-        <w:t/>
-      </w:r>
-      <w:r>
-        <w:rPr>
-          <w:rFonts w:ascii="Times New Roman" w:hAnsi="Times New Roman" w:cs="Times New Roman"/>
-        </w:rPr>
-        <w:t/>
-      </w:r>
-    </w:p>
-    <w:p>
-      <w:pPr>
-        <w:spacing w:after="0" w:line="240" w:lineRule="auto"/>
-        <w:rPr>
-          <w:rFonts w:ascii="Times New Roman" w:hAnsi="Times New Roman" w:cs="Times New Roman"/>
-          <w:lang w:val="en-US"/>
-        </w:rPr>
-      </w:pPr>
-      <w:r>
-        <w:rPr>
-          <w:rFonts w:ascii="Times New Roman" w:hAnsi="Times New Roman" w:cs="Times New Roman"/>
-        </w:rPr>
-        <w:t xml:space="preserve">    </w:t>
-      </w:r>
-      <w:r>
-        <w:rPr>
-          <w:rFonts w:ascii="Times New Roman" w:hAnsi="Times New Roman" w:cs="Times New Roman"/>
-        </w:rPr>
-        <w:t xml:space="preserve">-Bye</w:t>
+        <w:t xml:space="preserve">A. Hi</w:t>
+      </w:r>
+      <w:r>
+        <w:rPr>
+          <w:rStyle w:val="hljs-selector-id"/>
+          <w:rFonts w:ascii="Times New Roman" w:hAnsi="Times New Roman" w:cs="Times New Roman"/>
+        </w:rPr>
+        <w:t/>
+      </w:r>
+      <w:r>
+        <w:rPr>
+          <w:rFonts w:ascii="Times New Roman" w:hAnsi="Times New Roman" w:cs="Times New Roman"/>
+        </w:rPr>
+        <w:t/>
+      </w:r>
+    </w:p>
+    <w:p>
+      <w:pPr>
+        <w:spacing w:after="0" w:line="240" w:lineRule="auto"/>
+        <w:rPr>
+          <w:rFonts w:ascii="Times New Roman" w:hAnsi="Times New Roman" w:cs="Times New Roman"/>
+          <w:lang w:val="en-US"/>
+        </w:rPr>
+      </w:pPr>
+      <w:r>
+        <w:rPr>
+          <w:rFonts w:ascii="Times New Roman" w:hAnsi="Times New Roman" w:cs="Times New Roman"/>
+        </w:rPr>
+        <w:t xml:space="preserve">    </w:t>
+      </w:r>
+      <w:r>
+        <w:rPr>
+          <w:rFonts w:ascii="Times New Roman" w:hAnsi="Times New Roman" w:cs="Times New Roman"/>
+        </w:rPr>
+        <w:t xml:space="preserve">B. Hello</w:t>
+      </w:r>
+      <w:r>
+        <w:rPr>
+          <w:rStyle w:val="hljs-selector-id"/>
+          <w:rFonts w:ascii="Times New Roman" w:hAnsi="Times New Roman" w:cs="Times New Roman"/>
+        </w:rPr>
+        <w:t/>
+      </w:r>
+      <w:r>
+        <w:rPr>
+          <w:rFonts w:ascii="Times New Roman" w:hAnsi="Times New Roman" w:cs="Times New Roman"/>
+        </w:rPr>
+        <w:t/>
+      </w:r>
+    </w:p>
+    <w:p>
+      <w:pPr>
+        <w:spacing w:after="0" w:line="240" w:lineRule="auto"/>
+        <w:rPr>
+          <w:rFonts w:ascii="Times New Roman" w:hAnsi="Times New Roman" w:cs="Times New Roman"/>
+          <w:lang w:val="en-US"/>
+        </w:rPr>
+      </w:pPr>
+      <w:r>
+        <w:rPr>
+          <w:rFonts w:ascii="Times New Roman" w:hAnsi="Times New Roman" w:cs="Times New Roman"/>
+        </w:rPr>
+        <w:t xml:space="preserve">    </w:t>
+      </w:r>
+      <w:r>
+        <w:rPr>
+          <w:rFonts w:ascii="Times New Roman" w:hAnsi="Times New Roman" w:cs="Times New Roman"/>
+        </w:rPr>
+        <w:t xml:space="preserve">C. Bye</w:t>
       </w:r>
     </w:p>
     <w:p>
@@ -850,6 +926,8 @@
         <w:rPr>
           <w:rStyle w:val="markedcontent"/>
           <w:rFonts w:ascii="Times New Roman" w:hAnsi="Times New Roman" w:cs="Times New Roman"/>
+          <w:b/>
+          <w:bCs/>
         </w:rPr>
         <w:t xml:space="preserve">5</w:t>
       </w:r>
@@ -857,6 +935,8 @@
         <w:rPr>
           <w:rStyle w:val="markedcontent"/>
           <w:rFonts w:ascii="Times New Roman" w:hAnsi="Times New Roman" w:cs="Times New Roman"/>
+          <w:b/>
+          <w:bCs/>
         </w:rPr>
         <w:t xml:space="preserve">.</w:t>
       </w:r>
@@ -905,75 +985,75 @@
         <w:rPr>
           <w:rFonts w:ascii="Times New Roman" w:hAnsi="Times New Roman" w:cs="Times New Roman"/>
         </w:rPr>
-        <w:t xml:space="preserve">-Hi</w:t>
-      </w:r>
-      <w:r>
-        <w:rPr>
-          <w:rStyle w:val="hljs-selector-id"/>
-          <w:rFonts w:ascii="Times New Roman" w:hAnsi="Times New Roman" w:cs="Times New Roman"/>
-        </w:rPr>
-        <w:t/>
-      </w:r>
-      <w:r>
-        <w:rPr>
-          <w:rFonts w:ascii="Times New Roman" w:hAnsi="Times New Roman" w:cs="Times New Roman"/>
-        </w:rPr>
-        <w:t/>
-      </w:r>
-    </w:p>
-    <w:p>
-      <w:pPr>
-        <w:spacing w:after="0" w:line="240" w:lineRule="auto"/>
-        <w:rPr>
-          <w:rFonts w:ascii="Times New Roman" w:hAnsi="Times New Roman" w:cs="Times New Roman"/>
-          <w:lang w:val="en-US"/>
-        </w:rPr>
-      </w:pPr>
-      <w:r>
-        <w:rPr>
-          <w:rFonts w:ascii="Times New Roman" w:hAnsi="Times New Roman" w:cs="Times New Roman"/>
-        </w:rPr>
-        <w:t xml:space="preserve">    </w:t>
-      </w:r>
-      <w:r>
-        <w:rPr>
-          <w:rFonts w:ascii="Times New Roman" w:hAnsi="Times New Roman" w:cs="Times New Roman"/>
-        </w:rPr>
-        <w:t xml:space="preserve">-Hello</w:t>
-      </w:r>
-      <w:r>
-        <w:rPr>
-          <w:rStyle w:val="hljs-selector-id"/>
-          <w:rFonts w:ascii="Times New Roman" w:hAnsi="Times New Roman" w:cs="Times New Roman"/>
-        </w:rPr>
-        <w:t/>
-      </w:r>
-      <w:r>
-        <w:rPr>
-          <w:rFonts w:ascii="Times New Roman" w:hAnsi="Times New Roman" w:cs="Times New Roman"/>
-        </w:rPr>
-        <w:t/>
-      </w:r>
-    </w:p>
-    <w:p>
-      <w:pPr>
-        <w:spacing w:after="0" w:line="240" w:lineRule="auto"/>
-        <w:rPr>
-          <w:rFonts w:ascii="Times New Roman" w:hAnsi="Times New Roman" w:cs="Times New Roman"/>
-          <w:lang w:val="en-US"/>
-        </w:rPr>
-      </w:pPr>
-      <w:r>
-        <w:rPr>
-          <w:rFonts w:ascii="Times New Roman" w:hAnsi="Times New Roman" w:cs="Times New Roman"/>
-        </w:rPr>
-        <w:t xml:space="preserve">    </w:t>
-      </w:r>
-      <w:r>
-        <w:rPr>
-          <w:rFonts w:ascii="Times New Roman" w:hAnsi="Times New Roman" w:cs="Times New Roman"/>
-        </w:rPr>
-        <w:t xml:space="preserve">-Bye</w:t>
+        <w:t xml:space="preserve">A. Hi</w:t>
+      </w:r>
+      <w:r>
+        <w:rPr>
+          <w:rStyle w:val="hljs-selector-id"/>
+          <w:rFonts w:ascii="Times New Roman" w:hAnsi="Times New Roman" w:cs="Times New Roman"/>
+        </w:rPr>
+        <w:t/>
+      </w:r>
+      <w:r>
+        <w:rPr>
+          <w:rFonts w:ascii="Times New Roman" w:hAnsi="Times New Roman" w:cs="Times New Roman"/>
+        </w:rPr>
+        <w:t/>
+      </w:r>
+    </w:p>
+    <w:p>
+      <w:pPr>
+        <w:spacing w:after="0" w:line="240" w:lineRule="auto"/>
+        <w:rPr>
+          <w:rFonts w:ascii="Times New Roman" w:hAnsi="Times New Roman" w:cs="Times New Roman"/>
+          <w:lang w:val="en-US"/>
+        </w:rPr>
+      </w:pPr>
+      <w:r>
+        <w:rPr>
+          <w:rFonts w:ascii="Times New Roman" w:hAnsi="Times New Roman" w:cs="Times New Roman"/>
+        </w:rPr>
+        <w:t xml:space="preserve">    </w:t>
+      </w:r>
+      <w:r>
+        <w:rPr>
+          <w:rFonts w:ascii="Times New Roman" w:hAnsi="Times New Roman" w:cs="Times New Roman"/>
+        </w:rPr>
+        <w:t xml:space="preserve">B. Hello</w:t>
+      </w:r>
+      <w:r>
+        <w:rPr>
+          <w:rStyle w:val="hljs-selector-id"/>
+          <w:rFonts w:ascii="Times New Roman" w:hAnsi="Times New Roman" w:cs="Times New Roman"/>
+        </w:rPr>
+        <w:t/>
+      </w:r>
+      <w:r>
+        <w:rPr>
+          <w:rFonts w:ascii="Times New Roman" w:hAnsi="Times New Roman" w:cs="Times New Roman"/>
+        </w:rPr>
+        <w:t/>
+      </w:r>
+    </w:p>
+    <w:p>
+      <w:pPr>
+        <w:spacing w:after="0" w:line="240" w:lineRule="auto"/>
+        <w:rPr>
+          <w:rFonts w:ascii="Times New Roman" w:hAnsi="Times New Roman" w:cs="Times New Roman"/>
+          <w:lang w:val="en-US"/>
+        </w:rPr>
+      </w:pPr>
+      <w:r>
+        <w:rPr>
+          <w:rFonts w:ascii="Times New Roman" w:hAnsi="Times New Roman" w:cs="Times New Roman"/>
+        </w:rPr>
+        <w:t xml:space="preserve">    </w:t>
+      </w:r>
+      <w:r>
+        <w:rPr>
+          <w:rFonts w:ascii="Times New Roman" w:hAnsi="Times New Roman" w:cs="Times New Roman"/>
+        </w:rPr>
+        <w:t xml:space="preserve">C. Bye</w:t>
       </w:r>
     </w:p>
     <w:p>
@@ -1002,6 +1082,8 @@
         <w:rPr>
           <w:rStyle w:val="markedcontent"/>
           <w:rFonts w:ascii="Times New Roman" w:hAnsi="Times New Roman" w:cs="Times New Roman"/>
+          <w:b/>
+          <w:bCs/>
         </w:rPr>
         <w:t xml:space="preserve">6</w:t>
       </w:r>
@@ -1009,6 +1091,8 @@
         <w:rPr>
           <w:rStyle w:val="markedcontent"/>
           <w:rFonts w:ascii="Times New Roman" w:hAnsi="Times New Roman" w:cs="Times New Roman"/>
+          <w:b/>
+          <w:bCs/>
         </w:rPr>
         <w:t xml:space="preserve">.</w:t>
       </w:r>
@@ -1057,75 +1141,75 @@
         <w:rPr>
           <w:rFonts w:ascii="Times New Roman" w:hAnsi="Times New Roman" w:cs="Times New Roman"/>
         </w:rPr>
-        <w:t xml:space="preserve">-Hi</w:t>
-      </w:r>
-      <w:r>
-        <w:rPr>
-          <w:rStyle w:val="hljs-selector-id"/>
-          <w:rFonts w:ascii="Times New Roman" w:hAnsi="Times New Roman" w:cs="Times New Roman"/>
-        </w:rPr>
-        <w:t/>
-      </w:r>
-      <w:r>
-        <w:rPr>
-          <w:rFonts w:ascii="Times New Roman" w:hAnsi="Times New Roman" w:cs="Times New Roman"/>
-        </w:rPr>
-        <w:t/>
-      </w:r>
-    </w:p>
-    <w:p>
-      <w:pPr>
-        <w:spacing w:after="0" w:line="240" w:lineRule="auto"/>
-        <w:rPr>
-          <w:rFonts w:ascii="Times New Roman" w:hAnsi="Times New Roman" w:cs="Times New Roman"/>
-          <w:lang w:val="en-US"/>
-        </w:rPr>
-      </w:pPr>
-      <w:r>
-        <w:rPr>
-          <w:rFonts w:ascii="Times New Roman" w:hAnsi="Times New Roman" w:cs="Times New Roman"/>
-        </w:rPr>
-        <w:t xml:space="preserve">    </w:t>
-      </w:r>
-      <w:r>
-        <w:rPr>
-          <w:rFonts w:ascii="Times New Roman" w:hAnsi="Times New Roman" w:cs="Times New Roman"/>
-        </w:rPr>
-        <w:t xml:space="preserve">-Hello</w:t>
-      </w:r>
-      <w:r>
-        <w:rPr>
-          <w:rStyle w:val="hljs-selector-id"/>
-          <w:rFonts w:ascii="Times New Roman" w:hAnsi="Times New Roman" w:cs="Times New Roman"/>
-        </w:rPr>
-        <w:t/>
-      </w:r>
-      <w:r>
-        <w:rPr>
-          <w:rFonts w:ascii="Times New Roman" w:hAnsi="Times New Roman" w:cs="Times New Roman"/>
-        </w:rPr>
-        <w:t/>
-      </w:r>
-    </w:p>
-    <w:p>
-      <w:pPr>
-        <w:spacing w:after="0" w:line="240" w:lineRule="auto"/>
-        <w:rPr>
-          <w:rFonts w:ascii="Times New Roman" w:hAnsi="Times New Roman" w:cs="Times New Roman"/>
-          <w:lang w:val="en-US"/>
-        </w:rPr>
-      </w:pPr>
-      <w:r>
-        <w:rPr>
-          <w:rFonts w:ascii="Times New Roman" w:hAnsi="Times New Roman" w:cs="Times New Roman"/>
-        </w:rPr>
-        <w:t xml:space="preserve">    </w:t>
-      </w:r>
-      <w:r>
-        <w:rPr>
-          <w:rFonts w:ascii="Times New Roman" w:hAnsi="Times New Roman" w:cs="Times New Roman"/>
-        </w:rPr>
-        <w:t xml:space="preserve">-Bye</w:t>
+        <w:t xml:space="preserve">A. Hi</w:t>
+      </w:r>
+      <w:r>
+        <w:rPr>
+          <w:rStyle w:val="hljs-selector-id"/>
+          <w:rFonts w:ascii="Times New Roman" w:hAnsi="Times New Roman" w:cs="Times New Roman"/>
+        </w:rPr>
+        <w:t/>
+      </w:r>
+      <w:r>
+        <w:rPr>
+          <w:rFonts w:ascii="Times New Roman" w:hAnsi="Times New Roman" w:cs="Times New Roman"/>
+        </w:rPr>
+        <w:t/>
+      </w:r>
+    </w:p>
+    <w:p>
+      <w:pPr>
+        <w:spacing w:after="0" w:line="240" w:lineRule="auto"/>
+        <w:rPr>
+          <w:rFonts w:ascii="Times New Roman" w:hAnsi="Times New Roman" w:cs="Times New Roman"/>
+          <w:lang w:val="en-US"/>
+        </w:rPr>
+      </w:pPr>
+      <w:r>
+        <w:rPr>
+          <w:rFonts w:ascii="Times New Roman" w:hAnsi="Times New Roman" w:cs="Times New Roman"/>
+        </w:rPr>
+        <w:t xml:space="preserve">    </w:t>
+      </w:r>
+      <w:r>
+        <w:rPr>
+          <w:rFonts w:ascii="Times New Roman" w:hAnsi="Times New Roman" w:cs="Times New Roman"/>
+        </w:rPr>
+        <w:t xml:space="preserve">B. Hello</w:t>
+      </w:r>
+      <w:r>
+        <w:rPr>
+          <w:rStyle w:val="hljs-selector-id"/>
+          <w:rFonts w:ascii="Times New Roman" w:hAnsi="Times New Roman" w:cs="Times New Roman"/>
+        </w:rPr>
+        <w:t/>
+      </w:r>
+      <w:r>
+        <w:rPr>
+          <w:rFonts w:ascii="Times New Roman" w:hAnsi="Times New Roman" w:cs="Times New Roman"/>
+        </w:rPr>
+        <w:t/>
+      </w:r>
+    </w:p>
+    <w:p>
+      <w:pPr>
+        <w:spacing w:after="0" w:line="240" w:lineRule="auto"/>
+        <w:rPr>
+          <w:rFonts w:ascii="Times New Roman" w:hAnsi="Times New Roman" w:cs="Times New Roman"/>
+          <w:lang w:val="en-US"/>
+        </w:rPr>
+      </w:pPr>
+      <w:r>
+        <w:rPr>
+          <w:rFonts w:ascii="Times New Roman" w:hAnsi="Times New Roman" w:cs="Times New Roman"/>
+        </w:rPr>
+        <w:t xml:space="preserve">    </w:t>
+      </w:r>
+      <w:r>
+        <w:rPr>
+          <w:rFonts w:ascii="Times New Roman" w:hAnsi="Times New Roman" w:cs="Times New Roman"/>
+        </w:rPr>
+        <w:t xml:space="preserve">C. Bye</w:t>
       </w:r>
     </w:p>
     <w:p>
@@ -1154,6 +1238,8 @@
         <w:rPr>
           <w:rStyle w:val="markedcontent"/>
           <w:rFonts w:ascii="Times New Roman" w:hAnsi="Times New Roman" w:cs="Times New Roman"/>
+          <w:b/>
+          <w:bCs/>
         </w:rPr>
         <w:t xml:space="preserve">7</w:t>
       </w:r>
@@ -1161,6 +1247,8 @@
         <w:rPr>
           <w:rStyle w:val="markedcontent"/>
           <w:rFonts w:ascii="Times New Roman" w:hAnsi="Times New Roman" w:cs="Times New Roman"/>
+          <w:b/>
+          <w:bCs/>
         </w:rPr>
         <w:t xml:space="preserve">.</w:t>
       </w:r>
@@ -1209,75 +1297,75 @@
         <w:rPr>
           <w:rFonts w:ascii="Times New Roman" w:hAnsi="Times New Roman" w:cs="Times New Roman"/>
         </w:rPr>
-        <w:t xml:space="preserve">-Hi</w:t>
-      </w:r>
-      <w:r>
-        <w:rPr>
-          <w:rStyle w:val="hljs-selector-id"/>
-          <w:rFonts w:ascii="Times New Roman" w:hAnsi="Times New Roman" w:cs="Times New Roman"/>
-        </w:rPr>
-        <w:t/>
-      </w:r>
-      <w:r>
-        <w:rPr>
-          <w:rFonts w:ascii="Times New Roman" w:hAnsi="Times New Roman" w:cs="Times New Roman"/>
-        </w:rPr>
-        <w:t/>
-      </w:r>
-    </w:p>
-    <w:p>
-      <w:pPr>
-        <w:spacing w:after="0" w:line="240" w:lineRule="auto"/>
-        <w:rPr>
-          <w:rFonts w:ascii="Times New Roman" w:hAnsi="Times New Roman" w:cs="Times New Roman"/>
-          <w:lang w:val="en-US"/>
-        </w:rPr>
-      </w:pPr>
-      <w:r>
-        <w:rPr>
-          <w:rFonts w:ascii="Times New Roman" w:hAnsi="Times New Roman" w:cs="Times New Roman"/>
-        </w:rPr>
-        <w:t xml:space="preserve">    </w:t>
-      </w:r>
-      <w:r>
-        <w:rPr>
-          <w:rFonts w:ascii="Times New Roman" w:hAnsi="Times New Roman" w:cs="Times New Roman"/>
-        </w:rPr>
-        <w:t xml:space="preserve">-Hello</w:t>
-      </w:r>
-      <w:r>
-        <w:rPr>
-          <w:rStyle w:val="hljs-selector-id"/>
-          <w:rFonts w:ascii="Times New Roman" w:hAnsi="Times New Roman" w:cs="Times New Roman"/>
-        </w:rPr>
-        <w:t/>
-      </w:r>
-      <w:r>
-        <w:rPr>
-          <w:rFonts w:ascii="Times New Roman" w:hAnsi="Times New Roman" w:cs="Times New Roman"/>
-        </w:rPr>
-        <w:t/>
-      </w:r>
-    </w:p>
-    <w:p>
-      <w:pPr>
-        <w:spacing w:after="0" w:line="240" w:lineRule="auto"/>
-        <w:rPr>
-          <w:rFonts w:ascii="Times New Roman" w:hAnsi="Times New Roman" w:cs="Times New Roman"/>
-          <w:lang w:val="en-US"/>
-        </w:rPr>
-      </w:pPr>
-      <w:r>
-        <w:rPr>
-          <w:rFonts w:ascii="Times New Roman" w:hAnsi="Times New Roman" w:cs="Times New Roman"/>
-        </w:rPr>
-        <w:t xml:space="preserve">    </w:t>
-      </w:r>
-      <w:r>
-        <w:rPr>
-          <w:rFonts w:ascii="Times New Roman" w:hAnsi="Times New Roman" w:cs="Times New Roman"/>
-        </w:rPr>
-        <w:t xml:space="preserve">-Bye</w:t>
+        <w:t xml:space="preserve">A. Hi</w:t>
+      </w:r>
+      <w:r>
+        <w:rPr>
+          <w:rStyle w:val="hljs-selector-id"/>
+          <w:rFonts w:ascii="Times New Roman" w:hAnsi="Times New Roman" w:cs="Times New Roman"/>
+        </w:rPr>
+        <w:t/>
+      </w:r>
+      <w:r>
+        <w:rPr>
+          <w:rFonts w:ascii="Times New Roman" w:hAnsi="Times New Roman" w:cs="Times New Roman"/>
+        </w:rPr>
+        <w:t/>
+      </w:r>
+    </w:p>
+    <w:p>
+      <w:pPr>
+        <w:spacing w:after="0" w:line="240" w:lineRule="auto"/>
+        <w:rPr>
+          <w:rFonts w:ascii="Times New Roman" w:hAnsi="Times New Roman" w:cs="Times New Roman"/>
+          <w:lang w:val="en-US"/>
+        </w:rPr>
+      </w:pPr>
+      <w:r>
+        <w:rPr>
+          <w:rFonts w:ascii="Times New Roman" w:hAnsi="Times New Roman" w:cs="Times New Roman"/>
+        </w:rPr>
+        <w:t xml:space="preserve">    </w:t>
+      </w:r>
+      <w:r>
+        <w:rPr>
+          <w:rFonts w:ascii="Times New Roman" w:hAnsi="Times New Roman" w:cs="Times New Roman"/>
+        </w:rPr>
+        <w:t xml:space="preserve">B. Hello</w:t>
+      </w:r>
+      <w:r>
+        <w:rPr>
+          <w:rStyle w:val="hljs-selector-id"/>
+          <w:rFonts w:ascii="Times New Roman" w:hAnsi="Times New Roman" w:cs="Times New Roman"/>
+        </w:rPr>
+        <w:t/>
+      </w:r>
+      <w:r>
+        <w:rPr>
+          <w:rFonts w:ascii="Times New Roman" w:hAnsi="Times New Roman" w:cs="Times New Roman"/>
+        </w:rPr>
+        <w:t/>
+      </w:r>
+    </w:p>
+    <w:p>
+      <w:pPr>
+        <w:spacing w:after="0" w:line="240" w:lineRule="auto"/>
+        <w:rPr>
+          <w:rFonts w:ascii="Times New Roman" w:hAnsi="Times New Roman" w:cs="Times New Roman"/>
+          <w:lang w:val="en-US"/>
+        </w:rPr>
+      </w:pPr>
+      <w:r>
+        <w:rPr>
+          <w:rFonts w:ascii="Times New Roman" w:hAnsi="Times New Roman" w:cs="Times New Roman"/>
+        </w:rPr>
+        <w:t xml:space="preserve">    </w:t>
+      </w:r>
+      <w:r>
+        <w:rPr>
+          <w:rFonts w:ascii="Times New Roman" w:hAnsi="Times New Roman" w:cs="Times New Roman"/>
+        </w:rPr>
+        <w:t xml:space="preserve">C. Bye</w:t>
       </w:r>
     </w:p>
     <w:p>
@@ -1306,6 +1394,8 @@
         <w:rPr>
           <w:rStyle w:val="markedcontent"/>
           <w:rFonts w:ascii="Times New Roman" w:hAnsi="Times New Roman" w:cs="Times New Roman"/>
+          <w:b/>
+          <w:bCs/>
         </w:rPr>
         <w:t xml:space="preserve">8</w:t>
       </w:r>
@@ -1313,6 +1403,8 @@
         <w:rPr>
           <w:rStyle w:val="markedcontent"/>
           <w:rFonts w:ascii="Times New Roman" w:hAnsi="Times New Roman" w:cs="Times New Roman"/>
+          <w:b/>
+          <w:bCs/>
         </w:rPr>
         <w:t xml:space="preserve">.</w:t>
       </w:r>
@@ -1361,75 +1453,75 @@
         <w:rPr>
           <w:rFonts w:ascii="Times New Roman" w:hAnsi="Times New Roman" w:cs="Times New Roman"/>
         </w:rPr>
-        <w:t xml:space="preserve">-Hi</w:t>
-      </w:r>
-      <w:r>
-        <w:rPr>
-          <w:rStyle w:val="hljs-selector-id"/>
-          <w:rFonts w:ascii="Times New Roman" w:hAnsi="Times New Roman" w:cs="Times New Roman"/>
-        </w:rPr>
-        <w:t/>
-      </w:r>
-      <w:r>
-        <w:rPr>
-          <w:rFonts w:ascii="Times New Roman" w:hAnsi="Times New Roman" w:cs="Times New Roman"/>
-        </w:rPr>
-        <w:t/>
-      </w:r>
-    </w:p>
-    <w:p>
-      <w:pPr>
-        <w:spacing w:after="0" w:line="240" w:lineRule="auto"/>
-        <w:rPr>
-          <w:rFonts w:ascii="Times New Roman" w:hAnsi="Times New Roman" w:cs="Times New Roman"/>
-          <w:lang w:val="en-US"/>
-        </w:rPr>
-      </w:pPr>
-      <w:r>
-        <w:rPr>
-          <w:rFonts w:ascii="Times New Roman" w:hAnsi="Times New Roman" w:cs="Times New Roman"/>
-        </w:rPr>
-        <w:t xml:space="preserve">    </w:t>
-      </w:r>
-      <w:r>
-        <w:rPr>
-          <w:rFonts w:ascii="Times New Roman" w:hAnsi="Times New Roman" w:cs="Times New Roman"/>
-        </w:rPr>
-        <w:t xml:space="preserve">-Hello</w:t>
-      </w:r>
-      <w:r>
-        <w:rPr>
-          <w:rStyle w:val="hljs-selector-id"/>
-          <w:rFonts w:ascii="Times New Roman" w:hAnsi="Times New Roman" w:cs="Times New Roman"/>
-        </w:rPr>
-        <w:t/>
-      </w:r>
-      <w:r>
-        <w:rPr>
-          <w:rFonts w:ascii="Times New Roman" w:hAnsi="Times New Roman" w:cs="Times New Roman"/>
-        </w:rPr>
-        <w:t/>
-      </w:r>
-    </w:p>
-    <w:p>
-      <w:pPr>
-        <w:spacing w:after="0" w:line="240" w:lineRule="auto"/>
-        <w:rPr>
-          <w:rFonts w:ascii="Times New Roman" w:hAnsi="Times New Roman" w:cs="Times New Roman"/>
-          <w:lang w:val="en-US"/>
-        </w:rPr>
-      </w:pPr>
-      <w:r>
-        <w:rPr>
-          <w:rFonts w:ascii="Times New Roman" w:hAnsi="Times New Roman" w:cs="Times New Roman"/>
-        </w:rPr>
-        <w:t xml:space="preserve">    </w:t>
-      </w:r>
-      <w:r>
-        <w:rPr>
-          <w:rFonts w:ascii="Times New Roman" w:hAnsi="Times New Roman" w:cs="Times New Roman"/>
-        </w:rPr>
-        <w:t xml:space="preserve">-Bye</w:t>
+        <w:t xml:space="preserve">A. Hi</w:t>
+      </w:r>
+      <w:r>
+        <w:rPr>
+          <w:rStyle w:val="hljs-selector-id"/>
+          <w:rFonts w:ascii="Times New Roman" w:hAnsi="Times New Roman" w:cs="Times New Roman"/>
+        </w:rPr>
+        <w:t/>
+      </w:r>
+      <w:r>
+        <w:rPr>
+          <w:rFonts w:ascii="Times New Roman" w:hAnsi="Times New Roman" w:cs="Times New Roman"/>
+        </w:rPr>
+        <w:t/>
+      </w:r>
+    </w:p>
+    <w:p>
+      <w:pPr>
+        <w:spacing w:after="0" w:line="240" w:lineRule="auto"/>
+        <w:rPr>
+          <w:rFonts w:ascii="Times New Roman" w:hAnsi="Times New Roman" w:cs="Times New Roman"/>
+          <w:lang w:val="en-US"/>
+        </w:rPr>
+      </w:pPr>
+      <w:r>
+        <w:rPr>
+          <w:rFonts w:ascii="Times New Roman" w:hAnsi="Times New Roman" w:cs="Times New Roman"/>
+        </w:rPr>
+        <w:t xml:space="preserve">    </w:t>
+      </w:r>
+      <w:r>
+        <w:rPr>
+          <w:rFonts w:ascii="Times New Roman" w:hAnsi="Times New Roman" w:cs="Times New Roman"/>
+        </w:rPr>
+        <w:t xml:space="preserve">B. Hello</w:t>
+      </w:r>
+      <w:r>
+        <w:rPr>
+          <w:rStyle w:val="hljs-selector-id"/>
+          <w:rFonts w:ascii="Times New Roman" w:hAnsi="Times New Roman" w:cs="Times New Roman"/>
+        </w:rPr>
+        <w:t/>
+      </w:r>
+      <w:r>
+        <w:rPr>
+          <w:rFonts w:ascii="Times New Roman" w:hAnsi="Times New Roman" w:cs="Times New Roman"/>
+        </w:rPr>
+        <w:t/>
+      </w:r>
+    </w:p>
+    <w:p>
+      <w:pPr>
+        <w:spacing w:after="0" w:line="240" w:lineRule="auto"/>
+        <w:rPr>
+          <w:rFonts w:ascii="Times New Roman" w:hAnsi="Times New Roman" w:cs="Times New Roman"/>
+          <w:lang w:val="en-US"/>
+        </w:rPr>
+      </w:pPr>
+      <w:r>
+        <w:rPr>
+          <w:rFonts w:ascii="Times New Roman" w:hAnsi="Times New Roman" w:cs="Times New Roman"/>
+        </w:rPr>
+        <w:t xml:space="preserve">    </w:t>
+      </w:r>
+      <w:r>
+        <w:rPr>
+          <w:rFonts w:ascii="Times New Roman" w:hAnsi="Times New Roman" w:cs="Times New Roman"/>
+        </w:rPr>
+        <w:t xml:space="preserve">C. Bye</w:t>
       </w:r>
     </w:p>
     <w:p>
@@ -1458,6 +1550,8 @@
         <w:rPr>
           <w:rStyle w:val="markedcontent"/>
           <w:rFonts w:ascii="Times New Roman" w:hAnsi="Times New Roman" w:cs="Times New Roman"/>
+          <w:b/>
+          <w:bCs/>
         </w:rPr>
         <w:t xml:space="preserve">9</w:t>
       </w:r>
@@ -1465,6 +1559,8 @@
         <w:rPr>
           <w:rStyle w:val="markedcontent"/>
           <w:rFonts w:ascii="Times New Roman" w:hAnsi="Times New Roman" w:cs="Times New Roman"/>
+          <w:b/>
+          <w:bCs/>
         </w:rPr>
         <w:t xml:space="preserve">.</w:t>
       </w:r>
@@ -1513,75 +1609,75 @@
         <w:rPr>
           <w:rFonts w:ascii="Times New Roman" w:hAnsi="Times New Roman" w:cs="Times New Roman"/>
         </w:rPr>
-        <w:t xml:space="preserve">-Hi</w:t>
-      </w:r>
-      <w:r>
-        <w:rPr>
-          <w:rStyle w:val="hljs-selector-id"/>
-          <w:rFonts w:ascii="Times New Roman" w:hAnsi="Times New Roman" w:cs="Times New Roman"/>
-        </w:rPr>
-        <w:t/>
-      </w:r>
-      <w:r>
-        <w:rPr>
-          <w:rFonts w:ascii="Times New Roman" w:hAnsi="Times New Roman" w:cs="Times New Roman"/>
-        </w:rPr>
-        <w:t/>
-      </w:r>
-    </w:p>
-    <w:p>
-      <w:pPr>
-        <w:spacing w:after="0" w:line="240" w:lineRule="auto"/>
-        <w:rPr>
-          <w:rFonts w:ascii="Times New Roman" w:hAnsi="Times New Roman" w:cs="Times New Roman"/>
-          <w:lang w:val="en-US"/>
-        </w:rPr>
-      </w:pPr>
-      <w:r>
-        <w:rPr>
-          <w:rFonts w:ascii="Times New Roman" w:hAnsi="Times New Roman" w:cs="Times New Roman"/>
-        </w:rPr>
-        <w:t xml:space="preserve">    </w:t>
-      </w:r>
-      <w:r>
-        <w:rPr>
-          <w:rFonts w:ascii="Times New Roman" w:hAnsi="Times New Roman" w:cs="Times New Roman"/>
-        </w:rPr>
-        <w:t xml:space="preserve">-Hello</w:t>
-      </w:r>
-      <w:r>
-        <w:rPr>
-          <w:rStyle w:val="hljs-selector-id"/>
-          <w:rFonts w:ascii="Times New Roman" w:hAnsi="Times New Roman" w:cs="Times New Roman"/>
-        </w:rPr>
-        <w:t/>
-      </w:r>
-      <w:r>
-        <w:rPr>
-          <w:rFonts w:ascii="Times New Roman" w:hAnsi="Times New Roman" w:cs="Times New Roman"/>
-        </w:rPr>
-        <w:t/>
-      </w:r>
-    </w:p>
-    <w:p>
-      <w:pPr>
-        <w:spacing w:after="0" w:line="240" w:lineRule="auto"/>
-        <w:rPr>
-          <w:rFonts w:ascii="Times New Roman" w:hAnsi="Times New Roman" w:cs="Times New Roman"/>
-          <w:lang w:val="en-US"/>
-        </w:rPr>
-      </w:pPr>
-      <w:r>
-        <w:rPr>
-          <w:rFonts w:ascii="Times New Roman" w:hAnsi="Times New Roman" w:cs="Times New Roman"/>
-        </w:rPr>
-        <w:t xml:space="preserve">    </w:t>
-      </w:r>
-      <w:r>
-        <w:rPr>
-          <w:rFonts w:ascii="Times New Roman" w:hAnsi="Times New Roman" w:cs="Times New Roman"/>
-        </w:rPr>
-        <w:t xml:space="preserve">-Bye</w:t>
+        <w:t xml:space="preserve">A. Hi</w:t>
+      </w:r>
+      <w:r>
+        <w:rPr>
+          <w:rStyle w:val="hljs-selector-id"/>
+          <w:rFonts w:ascii="Times New Roman" w:hAnsi="Times New Roman" w:cs="Times New Roman"/>
+        </w:rPr>
+        <w:t/>
+      </w:r>
+      <w:r>
+        <w:rPr>
+          <w:rFonts w:ascii="Times New Roman" w:hAnsi="Times New Roman" w:cs="Times New Roman"/>
+        </w:rPr>
+        <w:t/>
+      </w:r>
+    </w:p>
+    <w:p>
+      <w:pPr>
+        <w:spacing w:after="0" w:line="240" w:lineRule="auto"/>
+        <w:rPr>
+          <w:rFonts w:ascii="Times New Roman" w:hAnsi="Times New Roman" w:cs="Times New Roman"/>
+          <w:lang w:val="en-US"/>
+        </w:rPr>
+      </w:pPr>
+      <w:r>
+        <w:rPr>
+          <w:rFonts w:ascii="Times New Roman" w:hAnsi="Times New Roman" w:cs="Times New Roman"/>
+        </w:rPr>
+        <w:t xml:space="preserve">    </w:t>
+      </w:r>
+      <w:r>
+        <w:rPr>
+          <w:rFonts w:ascii="Times New Roman" w:hAnsi="Times New Roman" w:cs="Times New Roman"/>
+        </w:rPr>
+        <w:t xml:space="preserve">B. Hello</w:t>
+      </w:r>
+      <w:r>
+        <w:rPr>
+          <w:rStyle w:val="hljs-selector-id"/>
+          <w:rFonts w:ascii="Times New Roman" w:hAnsi="Times New Roman" w:cs="Times New Roman"/>
+        </w:rPr>
+        <w:t/>
+      </w:r>
+      <w:r>
+        <w:rPr>
+          <w:rFonts w:ascii="Times New Roman" w:hAnsi="Times New Roman" w:cs="Times New Roman"/>
+        </w:rPr>
+        <w:t/>
+      </w:r>
+    </w:p>
+    <w:p>
+      <w:pPr>
+        <w:spacing w:after="0" w:line="240" w:lineRule="auto"/>
+        <w:rPr>
+          <w:rFonts w:ascii="Times New Roman" w:hAnsi="Times New Roman" w:cs="Times New Roman"/>
+          <w:lang w:val="en-US"/>
+        </w:rPr>
+      </w:pPr>
+      <w:r>
+        <w:rPr>
+          <w:rFonts w:ascii="Times New Roman" w:hAnsi="Times New Roman" w:cs="Times New Roman"/>
+        </w:rPr>
+        <w:t xml:space="preserve">    </w:t>
+      </w:r>
+      <w:r>
+        <w:rPr>
+          <w:rFonts w:ascii="Times New Roman" w:hAnsi="Times New Roman" w:cs="Times New Roman"/>
+        </w:rPr>
+        <w:t xml:space="preserve">C. Bye</w:t>
       </w:r>
     </w:p>
     <w:p>
@@ -1610,6 +1706,8 @@
         <w:rPr>
           <w:rStyle w:val="markedcontent"/>
           <w:rFonts w:ascii="Times New Roman" w:hAnsi="Times New Roman" w:cs="Times New Roman"/>
+          <w:b/>
+          <w:bCs/>
         </w:rPr>
         <w:t xml:space="preserve">10</w:t>
       </w:r>
@@ -1617,6 +1715,8 @@
         <w:rPr>
           <w:rStyle w:val="markedcontent"/>
           <w:rFonts w:ascii="Times New Roman" w:hAnsi="Times New Roman" w:cs="Times New Roman"/>
+          <w:b/>
+          <w:bCs/>
         </w:rPr>
         <w:t xml:space="preserve">.</w:t>
       </w:r>
@@ -1665,75 +1765,75 @@
         <w:rPr>
           <w:rFonts w:ascii="Times New Roman" w:hAnsi="Times New Roman" w:cs="Times New Roman"/>
         </w:rPr>
-        <w:t xml:space="preserve">-Hi</w:t>
-      </w:r>
-      <w:r>
-        <w:rPr>
-          <w:rStyle w:val="hljs-selector-id"/>
-          <w:rFonts w:ascii="Times New Roman" w:hAnsi="Times New Roman" w:cs="Times New Roman"/>
-        </w:rPr>
-        <w:t/>
-      </w:r>
-      <w:r>
-        <w:rPr>
-          <w:rFonts w:ascii="Times New Roman" w:hAnsi="Times New Roman" w:cs="Times New Roman"/>
-        </w:rPr>
-        <w:t/>
-      </w:r>
-    </w:p>
-    <w:p>
-      <w:pPr>
-        <w:spacing w:after="0" w:line="240" w:lineRule="auto"/>
-        <w:rPr>
-          <w:rFonts w:ascii="Times New Roman" w:hAnsi="Times New Roman" w:cs="Times New Roman"/>
-          <w:lang w:val="en-US"/>
-        </w:rPr>
-      </w:pPr>
-      <w:r>
-        <w:rPr>
-          <w:rFonts w:ascii="Times New Roman" w:hAnsi="Times New Roman" w:cs="Times New Roman"/>
-        </w:rPr>
-        <w:t xml:space="preserve">    </w:t>
-      </w:r>
-      <w:r>
-        <w:rPr>
-          <w:rFonts w:ascii="Times New Roman" w:hAnsi="Times New Roman" w:cs="Times New Roman"/>
-        </w:rPr>
-        <w:t xml:space="preserve">-Hello</w:t>
-      </w:r>
-      <w:r>
-        <w:rPr>
-          <w:rStyle w:val="hljs-selector-id"/>
-          <w:rFonts w:ascii="Times New Roman" w:hAnsi="Times New Roman" w:cs="Times New Roman"/>
-        </w:rPr>
-        <w:t/>
-      </w:r>
-      <w:r>
-        <w:rPr>
-          <w:rFonts w:ascii="Times New Roman" w:hAnsi="Times New Roman" w:cs="Times New Roman"/>
-        </w:rPr>
-        <w:t/>
-      </w:r>
-    </w:p>
-    <w:p>
-      <w:pPr>
-        <w:spacing w:after="0" w:line="240" w:lineRule="auto"/>
-        <w:rPr>
-          <w:rFonts w:ascii="Times New Roman" w:hAnsi="Times New Roman" w:cs="Times New Roman"/>
-          <w:lang w:val="en-US"/>
-        </w:rPr>
-      </w:pPr>
-      <w:r>
-        <w:rPr>
-          <w:rFonts w:ascii="Times New Roman" w:hAnsi="Times New Roman" w:cs="Times New Roman"/>
-        </w:rPr>
-        <w:t xml:space="preserve">    </w:t>
-      </w:r>
-      <w:r>
-        <w:rPr>
-          <w:rFonts w:ascii="Times New Roman" w:hAnsi="Times New Roman" w:cs="Times New Roman"/>
-        </w:rPr>
-        <w:t xml:space="preserve">-Bye</w:t>
+        <w:t xml:space="preserve">A. Hi</w:t>
+      </w:r>
+      <w:r>
+        <w:rPr>
+          <w:rStyle w:val="hljs-selector-id"/>
+          <w:rFonts w:ascii="Times New Roman" w:hAnsi="Times New Roman" w:cs="Times New Roman"/>
+        </w:rPr>
+        <w:t/>
+      </w:r>
+      <w:r>
+        <w:rPr>
+          <w:rFonts w:ascii="Times New Roman" w:hAnsi="Times New Roman" w:cs="Times New Roman"/>
+        </w:rPr>
+        <w:t/>
+      </w:r>
+    </w:p>
+    <w:p>
+      <w:pPr>
+        <w:spacing w:after="0" w:line="240" w:lineRule="auto"/>
+        <w:rPr>
+          <w:rFonts w:ascii="Times New Roman" w:hAnsi="Times New Roman" w:cs="Times New Roman"/>
+          <w:lang w:val="en-US"/>
+        </w:rPr>
+      </w:pPr>
+      <w:r>
+        <w:rPr>
+          <w:rFonts w:ascii="Times New Roman" w:hAnsi="Times New Roman" w:cs="Times New Roman"/>
+        </w:rPr>
+        <w:t xml:space="preserve">    </w:t>
+      </w:r>
+      <w:r>
+        <w:rPr>
+          <w:rFonts w:ascii="Times New Roman" w:hAnsi="Times New Roman" w:cs="Times New Roman"/>
+        </w:rPr>
+        <w:t xml:space="preserve">B. Hello</w:t>
+      </w:r>
+      <w:r>
+        <w:rPr>
+          <w:rStyle w:val="hljs-selector-id"/>
+          <w:rFonts w:ascii="Times New Roman" w:hAnsi="Times New Roman" w:cs="Times New Roman"/>
+        </w:rPr>
+        <w:t/>
+      </w:r>
+      <w:r>
+        <w:rPr>
+          <w:rFonts w:ascii="Times New Roman" w:hAnsi="Times New Roman" w:cs="Times New Roman"/>
+        </w:rPr>
+        <w:t/>
+      </w:r>
+    </w:p>
+    <w:p>
+      <w:pPr>
+        <w:spacing w:after="0" w:line="240" w:lineRule="auto"/>
+        <w:rPr>
+          <w:rFonts w:ascii="Times New Roman" w:hAnsi="Times New Roman" w:cs="Times New Roman"/>
+          <w:lang w:val="en-US"/>
+        </w:rPr>
+      </w:pPr>
+      <w:r>
+        <w:rPr>
+          <w:rFonts w:ascii="Times New Roman" w:hAnsi="Times New Roman" w:cs="Times New Roman"/>
+        </w:rPr>
+        <w:t xml:space="preserve">    </w:t>
+      </w:r>
+      <w:r>
+        <w:rPr>
+          <w:rFonts w:ascii="Times New Roman" w:hAnsi="Times New Roman" w:cs="Times New Roman"/>
+        </w:rPr>
+        <w:t xml:space="preserve">C. Bye</w:t>
       </w:r>
     </w:p>
     <w:p>
@@ -1762,6 +1862,8 @@
         <w:rPr>
           <w:rStyle w:val="markedcontent"/>
           <w:rFonts w:ascii="Times New Roman" w:hAnsi="Times New Roman" w:cs="Times New Roman"/>
+          <w:b/>
+          <w:bCs/>
         </w:rPr>
         <w:t xml:space="preserve">11</w:t>
       </w:r>
@@ -1769,6 +1871,8 @@
         <w:rPr>
           <w:rStyle w:val="markedcontent"/>
           <w:rFonts w:ascii="Times New Roman" w:hAnsi="Times New Roman" w:cs="Times New Roman"/>
+          <w:b/>
+          <w:bCs/>
         </w:rPr>
         <w:t xml:space="preserve">.</w:t>
       </w:r>
@@ -1817,75 +1921,75 @@
         <w:rPr>
           <w:rFonts w:ascii="Times New Roman" w:hAnsi="Times New Roman" w:cs="Times New Roman"/>
         </w:rPr>
-        <w:t xml:space="preserve">-Hi</w:t>
-      </w:r>
-      <w:r>
-        <w:rPr>
-          <w:rStyle w:val="hljs-selector-id"/>
-          <w:rFonts w:ascii="Times New Roman" w:hAnsi="Times New Roman" w:cs="Times New Roman"/>
-        </w:rPr>
-        <w:t/>
-      </w:r>
-      <w:r>
-        <w:rPr>
-          <w:rFonts w:ascii="Times New Roman" w:hAnsi="Times New Roman" w:cs="Times New Roman"/>
-        </w:rPr>
-        <w:t/>
-      </w:r>
-    </w:p>
-    <w:p>
-      <w:pPr>
-        <w:spacing w:after="0" w:line="240" w:lineRule="auto"/>
-        <w:rPr>
-          <w:rFonts w:ascii="Times New Roman" w:hAnsi="Times New Roman" w:cs="Times New Roman"/>
-          <w:lang w:val="en-US"/>
-        </w:rPr>
-      </w:pPr>
-      <w:r>
-        <w:rPr>
-          <w:rFonts w:ascii="Times New Roman" w:hAnsi="Times New Roman" w:cs="Times New Roman"/>
-        </w:rPr>
-        <w:t xml:space="preserve">    </w:t>
-      </w:r>
-      <w:r>
-        <w:rPr>
-          <w:rFonts w:ascii="Times New Roman" w:hAnsi="Times New Roman" w:cs="Times New Roman"/>
-        </w:rPr>
-        <w:t xml:space="preserve">-Hello</w:t>
-      </w:r>
-      <w:r>
-        <w:rPr>
-          <w:rStyle w:val="hljs-selector-id"/>
-          <w:rFonts w:ascii="Times New Roman" w:hAnsi="Times New Roman" w:cs="Times New Roman"/>
-        </w:rPr>
-        <w:t/>
-      </w:r>
-      <w:r>
-        <w:rPr>
-          <w:rFonts w:ascii="Times New Roman" w:hAnsi="Times New Roman" w:cs="Times New Roman"/>
-        </w:rPr>
-        <w:t/>
-      </w:r>
-    </w:p>
-    <w:p>
-      <w:pPr>
-        <w:spacing w:after="0" w:line="240" w:lineRule="auto"/>
-        <w:rPr>
-          <w:rFonts w:ascii="Times New Roman" w:hAnsi="Times New Roman" w:cs="Times New Roman"/>
-          <w:lang w:val="en-US"/>
-        </w:rPr>
-      </w:pPr>
-      <w:r>
-        <w:rPr>
-          <w:rFonts w:ascii="Times New Roman" w:hAnsi="Times New Roman" w:cs="Times New Roman"/>
-        </w:rPr>
-        <w:t xml:space="preserve">    </w:t>
-      </w:r>
-      <w:r>
-        <w:rPr>
-          <w:rFonts w:ascii="Times New Roman" w:hAnsi="Times New Roman" w:cs="Times New Roman"/>
-        </w:rPr>
-        <w:t xml:space="preserve">-Bye</w:t>
+        <w:t xml:space="preserve">A. Hi</w:t>
+      </w:r>
+      <w:r>
+        <w:rPr>
+          <w:rStyle w:val="hljs-selector-id"/>
+          <w:rFonts w:ascii="Times New Roman" w:hAnsi="Times New Roman" w:cs="Times New Roman"/>
+        </w:rPr>
+        <w:t/>
+      </w:r>
+      <w:r>
+        <w:rPr>
+          <w:rFonts w:ascii="Times New Roman" w:hAnsi="Times New Roman" w:cs="Times New Roman"/>
+        </w:rPr>
+        <w:t/>
+      </w:r>
+    </w:p>
+    <w:p>
+      <w:pPr>
+        <w:spacing w:after="0" w:line="240" w:lineRule="auto"/>
+        <w:rPr>
+          <w:rFonts w:ascii="Times New Roman" w:hAnsi="Times New Roman" w:cs="Times New Roman"/>
+          <w:lang w:val="en-US"/>
+        </w:rPr>
+      </w:pPr>
+      <w:r>
+        <w:rPr>
+          <w:rFonts w:ascii="Times New Roman" w:hAnsi="Times New Roman" w:cs="Times New Roman"/>
+        </w:rPr>
+        <w:t xml:space="preserve">    </w:t>
+      </w:r>
+      <w:r>
+        <w:rPr>
+          <w:rFonts w:ascii="Times New Roman" w:hAnsi="Times New Roman" w:cs="Times New Roman"/>
+        </w:rPr>
+        <w:t xml:space="preserve">B. Hello</w:t>
+      </w:r>
+      <w:r>
+        <w:rPr>
+          <w:rStyle w:val="hljs-selector-id"/>
+          <w:rFonts w:ascii="Times New Roman" w:hAnsi="Times New Roman" w:cs="Times New Roman"/>
+        </w:rPr>
+        <w:t/>
+      </w:r>
+      <w:r>
+        <w:rPr>
+          <w:rFonts w:ascii="Times New Roman" w:hAnsi="Times New Roman" w:cs="Times New Roman"/>
+        </w:rPr>
+        <w:t/>
+      </w:r>
+    </w:p>
+    <w:p>
+      <w:pPr>
+        <w:spacing w:after="0" w:line="240" w:lineRule="auto"/>
+        <w:rPr>
+          <w:rFonts w:ascii="Times New Roman" w:hAnsi="Times New Roman" w:cs="Times New Roman"/>
+          <w:lang w:val="en-US"/>
+        </w:rPr>
+      </w:pPr>
+      <w:r>
+        <w:rPr>
+          <w:rFonts w:ascii="Times New Roman" w:hAnsi="Times New Roman" w:cs="Times New Roman"/>
+        </w:rPr>
+        <w:t xml:space="preserve">    </w:t>
+      </w:r>
+      <w:r>
+        <w:rPr>
+          <w:rFonts w:ascii="Times New Roman" w:hAnsi="Times New Roman" w:cs="Times New Roman"/>
+        </w:rPr>
+        <w:t xml:space="preserve">C. Bye</w:t>
       </w:r>
     </w:p>
     <w:p>
@@ -1914,6 +2018,8 @@
         <w:rPr>
           <w:rStyle w:val="markedcontent"/>
           <w:rFonts w:ascii="Times New Roman" w:hAnsi="Times New Roman" w:cs="Times New Roman"/>
+          <w:b/>
+          <w:bCs/>
         </w:rPr>
         <w:t xml:space="preserve">12</w:t>
       </w:r>
@@ -1921,6 +2027,8 @@
         <w:rPr>
           <w:rStyle w:val="markedcontent"/>
           <w:rFonts w:ascii="Times New Roman" w:hAnsi="Times New Roman" w:cs="Times New Roman"/>
+          <w:b/>
+          <w:bCs/>
         </w:rPr>
         <w:t xml:space="preserve">.</w:t>
       </w:r>
@@ -1969,75 +2077,75 @@
         <w:rPr>
           <w:rFonts w:ascii="Times New Roman" w:hAnsi="Times New Roman" w:cs="Times New Roman"/>
         </w:rPr>
-        <w:t xml:space="preserve">-Hi</w:t>
-      </w:r>
-      <w:r>
-        <w:rPr>
-          <w:rStyle w:val="hljs-selector-id"/>
-          <w:rFonts w:ascii="Times New Roman" w:hAnsi="Times New Roman" w:cs="Times New Roman"/>
-        </w:rPr>
-        <w:t/>
-      </w:r>
-      <w:r>
-        <w:rPr>
-          <w:rFonts w:ascii="Times New Roman" w:hAnsi="Times New Roman" w:cs="Times New Roman"/>
-        </w:rPr>
-        <w:t/>
-      </w:r>
-    </w:p>
-    <w:p>
-      <w:pPr>
-        <w:spacing w:after="0" w:line="240" w:lineRule="auto"/>
-        <w:rPr>
-          <w:rFonts w:ascii="Times New Roman" w:hAnsi="Times New Roman" w:cs="Times New Roman"/>
-          <w:lang w:val="en-US"/>
-        </w:rPr>
-      </w:pPr>
-      <w:r>
-        <w:rPr>
-          <w:rFonts w:ascii="Times New Roman" w:hAnsi="Times New Roman" w:cs="Times New Roman"/>
-        </w:rPr>
-        <w:t xml:space="preserve">    </w:t>
-      </w:r>
-      <w:r>
-        <w:rPr>
-          <w:rFonts w:ascii="Times New Roman" w:hAnsi="Times New Roman" w:cs="Times New Roman"/>
-        </w:rPr>
-        <w:t xml:space="preserve">-Hello</w:t>
-      </w:r>
-      <w:r>
-        <w:rPr>
-          <w:rStyle w:val="hljs-selector-id"/>
-          <w:rFonts w:ascii="Times New Roman" w:hAnsi="Times New Roman" w:cs="Times New Roman"/>
-        </w:rPr>
-        <w:t/>
-      </w:r>
-      <w:r>
-        <w:rPr>
-          <w:rFonts w:ascii="Times New Roman" w:hAnsi="Times New Roman" w:cs="Times New Roman"/>
-        </w:rPr>
-        <w:t/>
-      </w:r>
-    </w:p>
-    <w:p>
-      <w:pPr>
-        <w:spacing w:after="0" w:line="240" w:lineRule="auto"/>
-        <w:rPr>
-          <w:rFonts w:ascii="Times New Roman" w:hAnsi="Times New Roman" w:cs="Times New Roman"/>
-          <w:lang w:val="en-US"/>
-        </w:rPr>
-      </w:pPr>
-      <w:r>
-        <w:rPr>
-          <w:rFonts w:ascii="Times New Roman" w:hAnsi="Times New Roman" w:cs="Times New Roman"/>
-        </w:rPr>
-        <w:t xml:space="preserve">    </w:t>
-      </w:r>
-      <w:r>
-        <w:rPr>
-          <w:rFonts w:ascii="Times New Roman" w:hAnsi="Times New Roman" w:cs="Times New Roman"/>
-        </w:rPr>
-        <w:t xml:space="preserve">-Bye</w:t>
+        <w:t xml:space="preserve">A. Hi</w:t>
+      </w:r>
+      <w:r>
+        <w:rPr>
+          <w:rStyle w:val="hljs-selector-id"/>
+          <w:rFonts w:ascii="Times New Roman" w:hAnsi="Times New Roman" w:cs="Times New Roman"/>
+        </w:rPr>
+        <w:t/>
+      </w:r>
+      <w:r>
+        <w:rPr>
+          <w:rFonts w:ascii="Times New Roman" w:hAnsi="Times New Roman" w:cs="Times New Roman"/>
+        </w:rPr>
+        <w:t/>
+      </w:r>
+    </w:p>
+    <w:p>
+      <w:pPr>
+        <w:spacing w:after="0" w:line="240" w:lineRule="auto"/>
+        <w:rPr>
+          <w:rFonts w:ascii="Times New Roman" w:hAnsi="Times New Roman" w:cs="Times New Roman"/>
+          <w:lang w:val="en-US"/>
+        </w:rPr>
+      </w:pPr>
+      <w:r>
+        <w:rPr>
+          <w:rFonts w:ascii="Times New Roman" w:hAnsi="Times New Roman" w:cs="Times New Roman"/>
+        </w:rPr>
+        <w:t xml:space="preserve">    </w:t>
+      </w:r>
+      <w:r>
+        <w:rPr>
+          <w:rFonts w:ascii="Times New Roman" w:hAnsi="Times New Roman" w:cs="Times New Roman"/>
+        </w:rPr>
+        <w:t xml:space="preserve">B. Hello</w:t>
+      </w:r>
+      <w:r>
+        <w:rPr>
+          <w:rStyle w:val="hljs-selector-id"/>
+          <w:rFonts w:ascii="Times New Roman" w:hAnsi="Times New Roman" w:cs="Times New Roman"/>
+        </w:rPr>
+        <w:t/>
+      </w:r>
+      <w:r>
+        <w:rPr>
+          <w:rFonts w:ascii="Times New Roman" w:hAnsi="Times New Roman" w:cs="Times New Roman"/>
+        </w:rPr>
+        <w:t/>
+      </w:r>
+    </w:p>
+    <w:p>
+      <w:pPr>
+        <w:spacing w:after="0" w:line="240" w:lineRule="auto"/>
+        <w:rPr>
+          <w:rFonts w:ascii="Times New Roman" w:hAnsi="Times New Roman" w:cs="Times New Roman"/>
+          <w:lang w:val="en-US"/>
+        </w:rPr>
+      </w:pPr>
+      <w:r>
+        <w:rPr>
+          <w:rFonts w:ascii="Times New Roman" w:hAnsi="Times New Roman" w:cs="Times New Roman"/>
+        </w:rPr>
+        <w:t xml:space="preserve">    </w:t>
+      </w:r>
+      <w:r>
+        <w:rPr>
+          <w:rFonts w:ascii="Times New Roman" w:hAnsi="Times New Roman" w:cs="Times New Roman"/>
+        </w:rPr>
+        <w:t xml:space="preserve">C. Bye</w:t>
       </w:r>
     </w:p>
     <w:p>
@@ -2066,6 +2174,8 @@
         <w:rPr>
           <w:rStyle w:val="markedcontent"/>
           <w:rFonts w:ascii="Times New Roman" w:hAnsi="Times New Roman" w:cs="Times New Roman"/>
+          <w:b/>
+          <w:bCs/>
         </w:rPr>
         <w:t xml:space="preserve">13</w:t>
       </w:r>
@@ -2073,6 +2183,8 @@
         <w:rPr>
           <w:rStyle w:val="markedcontent"/>
           <w:rFonts w:ascii="Times New Roman" w:hAnsi="Times New Roman" w:cs="Times New Roman"/>
+          <w:b/>
+          <w:bCs/>
         </w:rPr>
         <w:t xml:space="preserve">.</w:t>
       </w:r>
@@ -2121,75 +2233,75 @@
         <w:rPr>
           <w:rFonts w:ascii="Times New Roman" w:hAnsi="Times New Roman" w:cs="Times New Roman"/>
         </w:rPr>
-        <w:t xml:space="preserve">-Hi</w:t>
-      </w:r>
-      <w:r>
-        <w:rPr>
-          <w:rStyle w:val="hljs-selector-id"/>
-          <w:rFonts w:ascii="Times New Roman" w:hAnsi="Times New Roman" w:cs="Times New Roman"/>
-        </w:rPr>
-        <w:t/>
-      </w:r>
-      <w:r>
-        <w:rPr>
-          <w:rFonts w:ascii="Times New Roman" w:hAnsi="Times New Roman" w:cs="Times New Roman"/>
-        </w:rPr>
-        <w:t/>
-      </w:r>
-    </w:p>
-    <w:p>
-      <w:pPr>
-        <w:spacing w:after="0" w:line="240" w:lineRule="auto"/>
-        <w:rPr>
-          <w:rFonts w:ascii="Times New Roman" w:hAnsi="Times New Roman" w:cs="Times New Roman"/>
-          <w:lang w:val="en-US"/>
-        </w:rPr>
-      </w:pPr>
-      <w:r>
-        <w:rPr>
-          <w:rFonts w:ascii="Times New Roman" w:hAnsi="Times New Roman" w:cs="Times New Roman"/>
-        </w:rPr>
-        <w:t xml:space="preserve">    </w:t>
-      </w:r>
-      <w:r>
-        <w:rPr>
-          <w:rFonts w:ascii="Times New Roman" w:hAnsi="Times New Roman" w:cs="Times New Roman"/>
-        </w:rPr>
-        <w:t xml:space="preserve">-Hello</w:t>
-      </w:r>
-      <w:r>
-        <w:rPr>
-          <w:rStyle w:val="hljs-selector-id"/>
-          <w:rFonts w:ascii="Times New Roman" w:hAnsi="Times New Roman" w:cs="Times New Roman"/>
-        </w:rPr>
-        <w:t/>
-      </w:r>
-      <w:r>
-        <w:rPr>
-          <w:rFonts w:ascii="Times New Roman" w:hAnsi="Times New Roman" w:cs="Times New Roman"/>
-        </w:rPr>
-        <w:t/>
-      </w:r>
-    </w:p>
-    <w:p>
-      <w:pPr>
-        <w:spacing w:after="0" w:line="240" w:lineRule="auto"/>
-        <w:rPr>
-          <w:rFonts w:ascii="Times New Roman" w:hAnsi="Times New Roman" w:cs="Times New Roman"/>
-          <w:lang w:val="en-US"/>
-        </w:rPr>
-      </w:pPr>
-      <w:r>
-        <w:rPr>
-          <w:rFonts w:ascii="Times New Roman" w:hAnsi="Times New Roman" w:cs="Times New Roman"/>
-        </w:rPr>
-        <w:t xml:space="preserve">    </w:t>
-      </w:r>
-      <w:r>
-        <w:rPr>
-          <w:rFonts w:ascii="Times New Roman" w:hAnsi="Times New Roman" w:cs="Times New Roman"/>
-        </w:rPr>
-        <w:t xml:space="preserve">-Bye</w:t>
+        <w:t xml:space="preserve">A. Hi</w:t>
+      </w:r>
+      <w:r>
+        <w:rPr>
+          <w:rStyle w:val="hljs-selector-id"/>
+          <w:rFonts w:ascii="Times New Roman" w:hAnsi="Times New Roman" w:cs="Times New Roman"/>
+        </w:rPr>
+        <w:t/>
+      </w:r>
+      <w:r>
+        <w:rPr>
+          <w:rFonts w:ascii="Times New Roman" w:hAnsi="Times New Roman" w:cs="Times New Roman"/>
+        </w:rPr>
+        <w:t/>
+      </w:r>
+    </w:p>
+    <w:p>
+      <w:pPr>
+        <w:spacing w:after="0" w:line="240" w:lineRule="auto"/>
+        <w:rPr>
+          <w:rFonts w:ascii="Times New Roman" w:hAnsi="Times New Roman" w:cs="Times New Roman"/>
+          <w:lang w:val="en-US"/>
+        </w:rPr>
+      </w:pPr>
+      <w:r>
+        <w:rPr>
+          <w:rFonts w:ascii="Times New Roman" w:hAnsi="Times New Roman" w:cs="Times New Roman"/>
+        </w:rPr>
+        <w:t xml:space="preserve">    </w:t>
+      </w:r>
+      <w:r>
+        <w:rPr>
+          <w:rFonts w:ascii="Times New Roman" w:hAnsi="Times New Roman" w:cs="Times New Roman"/>
+        </w:rPr>
+        <w:t xml:space="preserve">B. Hello</w:t>
+      </w:r>
+      <w:r>
+        <w:rPr>
+          <w:rStyle w:val="hljs-selector-id"/>
+          <w:rFonts w:ascii="Times New Roman" w:hAnsi="Times New Roman" w:cs="Times New Roman"/>
+        </w:rPr>
+        <w:t/>
+      </w:r>
+      <w:r>
+        <w:rPr>
+          <w:rFonts w:ascii="Times New Roman" w:hAnsi="Times New Roman" w:cs="Times New Roman"/>
+        </w:rPr>
+        <w:t/>
+      </w:r>
+    </w:p>
+    <w:p>
+      <w:pPr>
+        <w:spacing w:after="0" w:line="240" w:lineRule="auto"/>
+        <w:rPr>
+          <w:rFonts w:ascii="Times New Roman" w:hAnsi="Times New Roman" w:cs="Times New Roman"/>
+          <w:lang w:val="en-US"/>
+        </w:rPr>
+      </w:pPr>
+      <w:r>
+        <w:rPr>
+          <w:rFonts w:ascii="Times New Roman" w:hAnsi="Times New Roman" w:cs="Times New Roman"/>
+        </w:rPr>
+        <w:t xml:space="preserve">    </w:t>
+      </w:r>
+      <w:r>
+        <w:rPr>
+          <w:rFonts w:ascii="Times New Roman" w:hAnsi="Times New Roman" w:cs="Times New Roman"/>
+        </w:rPr>
+        <w:t xml:space="preserve">C. Bye</w:t>
       </w:r>
     </w:p>
     <w:p>
@@ -2218,6 +2330,8 @@
         <w:rPr>
           <w:rStyle w:val="markedcontent"/>
           <w:rFonts w:ascii="Times New Roman" w:hAnsi="Times New Roman" w:cs="Times New Roman"/>
+          <w:b/>
+          <w:bCs/>
         </w:rPr>
         <w:t xml:space="preserve">14</w:t>
       </w:r>
@@ -2225,6 +2339,8 @@
         <w:rPr>
           <w:rStyle w:val="markedcontent"/>
           <w:rFonts w:ascii="Times New Roman" w:hAnsi="Times New Roman" w:cs="Times New Roman"/>
+          <w:b/>
+          <w:bCs/>
         </w:rPr>
         <w:t xml:space="preserve">.</w:t>
       </w:r>
@@ -2273,75 +2389,75 @@
         <w:rPr>
           <w:rFonts w:ascii="Times New Roman" w:hAnsi="Times New Roman" w:cs="Times New Roman"/>
         </w:rPr>
-        <w:t xml:space="preserve">-Hi</w:t>
-      </w:r>
-      <w:r>
-        <w:rPr>
-          <w:rStyle w:val="hljs-selector-id"/>
-          <w:rFonts w:ascii="Times New Roman" w:hAnsi="Times New Roman" w:cs="Times New Roman"/>
-        </w:rPr>
-        <w:t/>
-      </w:r>
-      <w:r>
-        <w:rPr>
-          <w:rFonts w:ascii="Times New Roman" w:hAnsi="Times New Roman" w:cs="Times New Roman"/>
-        </w:rPr>
-        <w:t/>
-      </w:r>
-    </w:p>
-    <w:p>
-      <w:pPr>
-        <w:spacing w:after="0" w:line="240" w:lineRule="auto"/>
-        <w:rPr>
-          <w:rFonts w:ascii="Times New Roman" w:hAnsi="Times New Roman" w:cs="Times New Roman"/>
-          <w:lang w:val="en-US"/>
-        </w:rPr>
-      </w:pPr>
-      <w:r>
-        <w:rPr>
-          <w:rFonts w:ascii="Times New Roman" w:hAnsi="Times New Roman" w:cs="Times New Roman"/>
-        </w:rPr>
-        <w:t xml:space="preserve">    </w:t>
-      </w:r>
-      <w:r>
-        <w:rPr>
-          <w:rFonts w:ascii="Times New Roman" w:hAnsi="Times New Roman" w:cs="Times New Roman"/>
-        </w:rPr>
-        <w:t xml:space="preserve">-Hello</w:t>
-      </w:r>
-      <w:r>
-        <w:rPr>
-          <w:rStyle w:val="hljs-selector-id"/>
-          <w:rFonts w:ascii="Times New Roman" w:hAnsi="Times New Roman" w:cs="Times New Roman"/>
-        </w:rPr>
-        <w:t/>
-      </w:r>
-      <w:r>
-        <w:rPr>
-          <w:rFonts w:ascii="Times New Roman" w:hAnsi="Times New Roman" w:cs="Times New Roman"/>
-        </w:rPr>
-        <w:t/>
-      </w:r>
-    </w:p>
-    <w:p>
-      <w:pPr>
-        <w:spacing w:after="0" w:line="240" w:lineRule="auto"/>
-        <w:rPr>
-          <w:rFonts w:ascii="Times New Roman" w:hAnsi="Times New Roman" w:cs="Times New Roman"/>
-          <w:lang w:val="en-US"/>
-        </w:rPr>
-      </w:pPr>
-      <w:r>
-        <w:rPr>
-          <w:rFonts w:ascii="Times New Roman" w:hAnsi="Times New Roman" w:cs="Times New Roman"/>
-        </w:rPr>
-        <w:t xml:space="preserve">    </w:t>
-      </w:r>
-      <w:r>
-        <w:rPr>
-          <w:rFonts w:ascii="Times New Roman" w:hAnsi="Times New Roman" w:cs="Times New Roman"/>
-        </w:rPr>
-        <w:t xml:space="preserve">-Bye</w:t>
+        <w:t xml:space="preserve">A. Hi</w:t>
+      </w:r>
+      <w:r>
+        <w:rPr>
+          <w:rStyle w:val="hljs-selector-id"/>
+          <w:rFonts w:ascii="Times New Roman" w:hAnsi="Times New Roman" w:cs="Times New Roman"/>
+        </w:rPr>
+        <w:t/>
+      </w:r>
+      <w:r>
+        <w:rPr>
+          <w:rFonts w:ascii="Times New Roman" w:hAnsi="Times New Roman" w:cs="Times New Roman"/>
+        </w:rPr>
+        <w:t/>
+      </w:r>
+    </w:p>
+    <w:p>
+      <w:pPr>
+        <w:spacing w:after="0" w:line="240" w:lineRule="auto"/>
+        <w:rPr>
+          <w:rFonts w:ascii="Times New Roman" w:hAnsi="Times New Roman" w:cs="Times New Roman"/>
+          <w:lang w:val="en-US"/>
+        </w:rPr>
+      </w:pPr>
+      <w:r>
+        <w:rPr>
+          <w:rFonts w:ascii="Times New Roman" w:hAnsi="Times New Roman" w:cs="Times New Roman"/>
+        </w:rPr>
+        <w:t xml:space="preserve">    </w:t>
+      </w:r>
+      <w:r>
+        <w:rPr>
+          <w:rFonts w:ascii="Times New Roman" w:hAnsi="Times New Roman" w:cs="Times New Roman"/>
+        </w:rPr>
+        <w:t xml:space="preserve">B. Hello</w:t>
+      </w:r>
+      <w:r>
+        <w:rPr>
+          <w:rStyle w:val="hljs-selector-id"/>
+          <w:rFonts w:ascii="Times New Roman" w:hAnsi="Times New Roman" w:cs="Times New Roman"/>
+        </w:rPr>
+        <w:t/>
+      </w:r>
+      <w:r>
+        <w:rPr>
+          <w:rFonts w:ascii="Times New Roman" w:hAnsi="Times New Roman" w:cs="Times New Roman"/>
+        </w:rPr>
+        <w:t/>
+      </w:r>
+    </w:p>
+    <w:p>
+      <w:pPr>
+        <w:spacing w:after="0" w:line="240" w:lineRule="auto"/>
+        <w:rPr>
+          <w:rFonts w:ascii="Times New Roman" w:hAnsi="Times New Roman" w:cs="Times New Roman"/>
+          <w:lang w:val="en-US"/>
+        </w:rPr>
+      </w:pPr>
+      <w:r>
+        <w:rPr>
+          <w:rFonts w:ascii="Times New Roman" w:hAnsi="Times New Roman" w:cs="Times New Roman"/>
+        </w:rPr>
+        <w:t xml:space="preserve">    </w:t>
+      </w:r>
+      <w:r>
+        <w:rPr>
+          <w:rFonts w:ascii="Times New Roman" w:hAnsi="Times New Roman" w:cs="Times New Roman"/>
+        </w:rPr>
+        <w:t xml:space="preserve">C. Bye</w:t>
       </w:r>
     </w:p>
     <w:p>
@@ -2370,6 +2486,8 @@
         <w:rPr>
           <w:rStyle w:val="markedcontent"/>
           <w:rFonts w:ascii="Times New Roman" w:hAnsi="Times New Roman" w:cs="Times New Roman"/>
+          <w:b/>
+          <w:bCs/>
         </w:rPr>
         <w:t xml:space="preserve">15</w:t>
       </w:r>
@@ -2377,6 +2495,8 @@
         <w:rPr>
           <w:rStyle w:val="markedcontent"/>
           <w:rFonts w:ascii="Times New Roman" w:hAnsi="Times New Roman" w:cs="Times New Roman"/>
+          <w:b/>
+          <w:bCs/>
         </w:rPr>
         <w:t xml:space="preserve">.</w:t>
       </w:r>
@@ -2425,75 +2545,75 @@
         <w:rPr>
           <w:rFonts w:ascii="Times New Roman" w:hAnsi="Times New Roman" w:cs="Times New Roman"/>
         </w:rPr>
-        <w:t xml:space="preserve">-Hi</w:t>
-      </w:r>
-      <w:r>
-        <w:rPr>
-          <w:rStyle w:val="hljs-selector-id"/>
-          <w:rFonts w:ascii="Times New Roman" w:hAnsi="Times New Roman" w:cs="Times New Roman"/>
-        </w:rPr>
-        <w:t/>
-      </w:r>
-      <w:r>
-        <w:rPr>
-          <w:rFonts w:ascii="Times New Roman" w:hAnsi="Times New Roman" w:cs="Times New Roman"/>
-        </w:rPr>
-        <w:t/>
-      </w:r>
-    </w:p>
-    <w:p>
-      <w:pPr>
-        <w:spacing w:after="0" w:line="240" w:lineRule="auto"/>
-        <w:rPr>
-          <w:rFonts w:ascii="Times New Roman" w:hAnsi="Times New Roman" w:cs="Times New Roman"/>
-          <w:lang w:val="en-US"/>
-        </w:rPr>
-      </w:pPr>
-      <w:r>
-        <w:rPr>
-          <w:rFonts w:ascii="Times New Roman" w:hAnsi="Times New Roman" w:cs="Times New Roman"/>
-        </w:rPr>
-        <w:t xml:space="preserve">    </w:t>
-      </w:r>
-      <w:r>
-        <w:rPr>
-          <w:rFonts w:ascii="Times New Roman" w:hAnsi="Times New Roman" w:cs="Times New Roman"/>
-        </w:rPr>
-        <w:t xml:space="preserve">-Hello</w:t>
-      </w:r>
-      <w:r>
-        <w:rPr>
-          <w:rStyle w:val="hljs-selector-id"/>
-          <w:rFonts w:ascii="Times New Roman" w:hAnsi="Times New Roman" w:cs="Times New Roman"/>
-        </w:rPr>
-        <w:t/>
-      </w:r>
-      <w:r>
-        <w:rPr>
-          <w:rFonts w:ascii="Times New Roman" w:hAnsi="Times New Roman" w:cs="Times New Roman"/>
-        </w:rPr>
-        <w:t/>
-      </w:r>
-    </w:p>
-    <w:p>
-      <w:pPr>
-        <w:spacing w:after="0" w:line="240" w:lineRule="auto"/>
-        <w:rPr>
-          <w:rFonts w:ascii="Times New Roman" w:hAnsi="Times New Roman" w:cs="Times New Roman"/>
-          <w:lang w:val="en-US"/>
-        </w:rPr>
-      </w:pPr>
-      <w:r>
-        <w:rPr>
-          <w:rFonts w:ascii="Times New Roman" w:hAnsi="Times New Roman" w:cs="Times New Roman"/>
-        </w:rPr>
-        <w:t xml:space="preserve">    </w:t>
-      </w:r>
-      <w:r>
-        <w:rPr>
-          <w:rFonts w:ascii="Times New Roman" w:hAnsi="Times New Roman" w:cs="Times New Roman"/>
-        </w:rPr>
-        <w:t xml:space="preserve">-Bye</w:t>
+        <w:t xml:space="preserve">A. Hi</w:t>
+      </w:r>
+      <w:r>
+        <w:rPr>
+          <w:rStyle w:val="hljs-selector-id"/>
+          <w:rFonts w:ascii="Times New Roman" w:hAnsi="Times New Roman" w:cs="Times New Roman"/>
+        </w:rPr>
+        <w:t/>
+      </w:r>
+      <w:r>
+        <w:rPr>
+          <w:rFonts w:ascii="Times New Roman" w:hAnsi="Times New Roman" w:cs="Times New Roman"/>
+        </w:rPr>
+        <w:t/>
+      </w:r>
+    </w:p>
+    <w:p>
+      <w:pPr>
+        <w:spacing w:after="0" w:line="240" w:lineRule="auto"/>
+        <w:rPr>
+          <w:rFonts w:ascii="Times New Roman" w:hAnsi="Times New Roman" w:cs="Times New Roman"/>
+          <w:lang w:val="en-US"/>
+        </w:rPr>
+      </w:pPr>
+      <w:r>
+        <w:rPr>
+          <w:rFonts w:ascii="Times New Roman" w:hAnsi="Times New Roman" w:cs="Times New Roman"/>
+        </w:rPr>
+        <w:t xml:space="preserve">    </w:t>
+      </w:r>
+      <w:r>
+        <w:rPr>
+          <w:rFonts w:ascii="Times New Roman" w:hAnsi="Times New Roman" w:cs="Times New Roman"/>
+        </w:rPr>
+        <w:t xml:space="preserve">B. Hello</w:t>
+      </w:r>
+      <w:r>
+        <w:rPr>
+          <w:rStyle w:val="hljs-selector-id"/>
+          <w:rFonts w:ascii="Times New Roman" w:hAnsi="Times New Roman" w:cs="Times New Roman"/>
+        </w:rPr>
+        <w:t/>
+      </w:r>
+      <w:r>
+        <w:rPr>
+          <w:rFonts w:ascii="Times New Roman" w:hAnsi="Times New Roman" w:cs="Times New Roman"/>
+        </w:rPr>
+        <w:t/>
+      </w:r>
+    </w:p>
+    <w:p>
+      <w:pPr>
+        <w:spacing w:after="0" w:line="240" w:lineRule="auto"/>
+        <w:rPr>
+          <w:rFonts w:ascii="Times New Roman" w:hAnsi="Times New Roman" w:cs="Times New Roman"/>
+          <w:lang w:val="en-US"/>
+        </w:rPr>
+      </w:pPr>
+      <w:r>
+        <w:rPr>
+          <w:rFonts w:ascii="Times New Roman" w:hAnsi="Times New Roman" w:cs="Times New Roman"/>
+        </w:rPr>
+        <w:t xml:space="preserve">    </w:t>
+      </w:r>
+      <w:r>
+        <w:rPr>
+          <w:rFonts w:ascii="Times New Roman" w:hAnsi="Times New Roman" w:cs="Times New Roman"/>
+        </w:rPr>
+        <w:t xml:space="preserve">C. Bye</w:t>
       </w:r>
     </w:p>
     <w:p>
@@ -2522,6 +2642,8 @@
         <w:rPr>
           <w:rStyle w:val="markedcontent"/>
           <w:rFonts w:ascii="Times New Roman" w:hAnsi="Times New Roman" w:cs="Times New Roman"/>
+          <w:b/>
+          <w:bCs/>
         </w:rPr>
         <w:t xml:space="preserve">16</w:t>
       </w:r>
@@ -2529,6 +2651,8 @@
         <w:rPr>
           <w:rStyle w:val="markedcontent"/>
           <w:rFonts w:ascii="Times New Roman" w:hAnsi="Times New Roman" w:cs="Times New Roman"/>
+          <w:b/>
+          <w:bCs/>
         </w:rPr>
         <w:t xml:space="preserve">.</w:t>
       </w:r>
@@ -2577,75 +2701,75 @@
         <w:rPr>
           <w:rFonts w:ascii="Times New Roman" w:hAnsi="Times New Roman" w:cs="Times New Roman"/>
         </w:rPr>
-        <w:t xml:space="preserve">-Hi</w:t>
-      </w:r>
-      <w:r>
-        <w:rPr>
-          <w:rStyle w:val="hljs-selector-id"/>
-          <w:rFonts w:ascii="Times New Roman" w:hAnsi="Times New Roman" w:cs="Times New Roman"/>
-        </w:rPr>
-        <w:t/>
-      </w:r>
-      <w:r>
-        <w:rPr>
-          <w:rFonts w:ascii="Times New Roman" w:hAnsi="Times New Roman" w:cs="Times New Roman"/>
-        </w:rPr>
-        <w:t/>
-      </w:r>
-    </w:p>
-    <w:p>
-      <w:pPr>
-        <w:spacing w:after="0" w:line="240" w:lineRule="auto"/>
-        <w:rPr>
-          <w:rFonts w:ascii="Times New Roman" w:hAnsi="Times New Roman" w:cs="Times New Roman"/>
-          <w:lang w:val="en-US"/>
-        </w:rPr>
-      </w:pPr>
-      <w:r>
-        <w:rPr>
-          <w:rFonts w:ascii="Times New Roman" w:hAnsi="Times New Roman" w:cs="Times New Roman"/>
-        </w:rPr>
-        <w:t xml:space="preserve">    </w:t>
-      </w:r>
-      <w:r>
-        <w:rPr>
-          <w:rFonts w:ascii="Times New Roman" w:hAnsi="Times New Roman" w:cs="Times New Roman"/>
-        </w:rPr>
-        <w:t xml:space="preserve">-Hello</w:t>
-      </w:r>
-      <w:r>
-        <w:rPr>
-          <w:rStyle w:val="hljs-selector-id"/>
-          <w:rFonts w:ascii="Times New Roman" w:hAnsi="Times New Roman" w:cs="Times New Roman"/>
-        </w:rPr>
-        <w:t/>
-      </w:r>
-      <w:r>
-        <w:rPr>
-          <w:rFonts w:ascii="Times New Roman" w:hAnsi="Times New Roman" w:cs="Times New Roman"/>
-        </w:rPr>
-        <w:t/>
-      </w:r>
-    </w:p>
-    <w:p>
-      <w:pPr>
-        <w:spacing w:after="0" w:line="240" w:lineRule="auto"/>
-        <w:rPr>
-          <w:rFonts w:ascii="Times New Roman" w:hAnsi="Times New Roman" w:cs="Times New Roman"/>
-          <w:lang w:val="en-US"/>
-        </w:rPr>
-      </w:pPr>
-      <w:r>
-        <w:rPr>
-          <w:rFonts w:ascii="Times New Roman" w:hAnsi="Times New Roman" w:cs="Times New Roman"/>
-        </w:rPr>
-        <w:t xml:space="preserve">    </w:t>
-      </w:r>
-      <w:r>
-        <w:rPr>
-          <w:rFonts w:ascii="Times New Roman" w:hAnsi="Times New Roman" w:cs="Times New Roman"/>
-        </w:rPr>
-        <w:t xml:space="preserve">-Bye</w:t>
+        <w:t xml:space="preserve">A. Hi</w:t>
+      </w:r>
+      <w:r>
+        <w:rPr>
+          <w:rStyle w:val="hljs-selector-id"/>
+          <w:rFonts w:ascii="Times New Roman" w:hAnsi="Times New Roman" w:cs="Times New Roman"/>
+        </w:rPr>
+        <w:t/>
+      </w:r>
+      <w:r>
+        <w:rPr>
+          <w:rFonts w:ascii="Times New Roman" w:hAnsi="Times New Roman" w:cs="Times New Roman"/>
+        </w:rPr>
+        <w:t/>
+      </w:r>
+    </w:p>
+    <w:p>
+      <w:pPr>
+        <w:spacing w:after="0" w:line="240" w:lineRule="auto"/>
+        <w:rPr>
+          <w:rFonts w:ascii="Times New Roman" w:hAnsi="Times New Roman" w:cs="Times New Roman"/>
+          <w:lang w:val="en-US"/>
+        </w:rPr>
+      </w:pPr>
+      <w:r>
+        <w:rPr>
+          <w:rFonts w:ascii="Times New Roman" w:hAnsi="Times New Roman" w:cs="Times New Roman"/>
+        </w:rPr>
+        <w:t xml:space="preserve">    </w:t>
+      </w:r>
+      <w:r>
+        <w:rPr>
+          <w:rFonts w:ascii="Times New Roman" w:hAnsi="Times New Roman" w:cs="Times New Roman"/>
+        </w:rPr>
+        <w:t xml:space="preserve">B. Hello</w:t>
+      </w:r>
+      <w:r>
+        <w:rPr>
+          <w:rStyle w:val="hljs-selector-id"/>
+          <w:rFonts w:ascii="Times New Roman" w:hAnsi="Times New Roman" w:cs="Times New Roman"/>
+        </w:rPr>
+        <w:t/>
+      </w:r>
+      <w:r>
+        <w:rPr>
+          <w:rFonts w:ascii="Times New Roman" w:hAnsi="Times New Roman" w:cs="Times New Roman"/>
+        </w:rPr>
+        <w:t/>
+      </w:r>
+    </w:p>
+    <w:p>
+      <w:pPr>
+        <w:spacing w:after="0" w:line="240" w:lineRule="auto"/>
+        <w:rPr>
+          <w:rFonts w:ascii="Times New Roman" w:hAnsi="Times New Roman" w:cs="Times New Roman"/>
+          <w:lang w:val="en-US"/>
+        </w:rPr>
+      </w:pPr>
+      <w:r>
+        <w:rPr>
+          <w:rFonts w:ascii="Times New Roman" w:hAnsi="Times New Roman" w:cs="Times New Roman"/>
+        </w:rPr>
+        <w:t xml:space="preserve">    </w:t>
+      </w:r>
+      <w:r>
+        <w:rPr>
+          <w:rFonts w:ascii="Times New Roman" w:hAnsi="Times New Roman" w:cs="Times New Roman"/>
+        </w:rPr>
+        <w:t xml:space="preserve">C. Bye</w:t>
       </w:r>
     </w:p>
     <w:p>
@@ -2674,6 +2798,8 @@
         <w:rPr>
           <w:rStyle w:val="markedcontent"/>
           <w:rFonts w:ascii="Times New Roman" w:hAnsi="Times New Roman" w:cs="Times New Roman"/>
+          <w:b/>
+          <w:bCs/>
         </w:rPr>
         <w:t xml:space="preserve">17</w:t>
       </w:r>
@@ -2681,6 +2807,8 @@
         <w:rPr>
           <w:rStyle w:val="markedcontent"/>
           <w:rFonts w:ascii="Times New Roman" w:hAnsi="Times New Roman" w:cs="Times New Roman"/>
+          <w:b/>
+          <w:bCs/>
         </w:rPr>
         <w:t xml:space="preserve">.</w:t>
       </w:r>
@@ -2729,75 +2857,75 @@
         <w:rPr>
           <w:rFonts w:ascii="Times New Roman" w:hAnsi="Times New Roman" w:cs="Times New Roman"/>
         </w:rPr>
-        <w:t xml:space="preserve">-Hi</w:t>
-      </w:r>
-      <w:r>
-        <w:rPr>
-          <w:rStyle w:val="hljs-selector-id"/>
-          <w:rFonts w:ascii="Times New Roman" w:hAnsi="Times New Roman" w:cs="Times New Roman"/>
-        </w:rPr>
-        <w:t/>
-      </w:r>
-      <w:r>
-        <w:rPr>
-          <w:rFonts w:ascii="Times New Roman" w:hAnsi="Times New Roman" w:cs="Times New Roman"/>
-        </w:rPr>
-        <w:t/>
-      </w:r>
-    </w:p>
-    <w:p>
-      <w:pPr>
-        <w:spacing w:after="0" w:line="240" w:lineRule="auto"/>
-        <w:rPr>
-          <w:rFonts w:ascii="Times New Roman" w:hAnsi="Times New Roman" w:cs="Times New Roman"/>
-          <w:lang w:val="en-US"/>
-        </w:rPr>
-      </w:pPr>
-      <w:r>
-        <w:rPr>
-          <w:rFonts w:ascii="Times New Roman" w:hAnsi="Times New Roman" w:cs="Times New Roman"/>
-        </w:rPr>
-        <w:t xml:space="preserve">    </w:t>
-      </w:r>
-      <w:r>
-        <w:rPr>
-          <w:rFonts w:ascii="Times New Roman" w:hAnsi="Times New Roman" w:cs="Times New Roman"/>
-        </w:rPr>
-        <w:t xml:space="preserve">-Hello</w:t>
-      </w:r>
-      <w:r>
-        <w:rPr>
-          <w:rStyle w:val="hljs-selector-id"/>
-          <w:rFonts w:ascii="Times New Roman" w:hAnsi="Times New Roman" w:cs="Times New Roman"/>
-        </w:rPr>
-        <w:t/>
-      </w:r>
-      <w:r>
-        <w:rPr>
-          <w:rFonts w:ascii="Times New Roman" w:hAnsi="Times New Roman" w:cs="Times New Roman"/>
-        </w:rPr>
-        <w:t/>
-      </w:r>
-    </w:p>
-    <w:p>
-      <w:pPr>
-        <w:spacing w:after="0" w:line="240" w:lineRule="auto"/>
-        <w:rPr>
-          <w:rFonts w:ascii="Times New Roman" w:hAnsi="Times New Roman" w:cs="Times New Roman"/>
-          <w:lang w:val="en-US"/>
-        </w:rPr>
-      </w:pPr>
-      <w:r>
-        <w:rPr>
-          <w:rFonts w:ascii="Times New Roman" w:hAnsi="Times New Roman" w:cs="Times New Roman"/>
-        </w:rPr>
-        <w:t xml:space="preserve">    </w:t>
-      </w:r>
-      <w:r>
-        <w:rPr>
-          <w:rFonts w:ascii="Times New Roman" w:hAnsi="Times New Roman" w:cs="Times New Roman"/>
-        </w:rPr>
-        <w:t xml:space="preserve">-Bye</w:t>
+        <w:t xml:space="preserve">A. Hi</w:t>
+      </w:r>
+      <w:r>
+        <w:rPr>
+          <w:rStyle w:val="hljs-selector-id"/>
+          <w:rFonts w:ascii="Times New Roman" w:hAnsi="Times New Roman" w:cs="Times New Roman"/>
+        </w:rPr>
+        <w:t/>
+      </w:r>
+      <w:r>
+        <w:rPr>
+          <w:rFonts w:ascii="Times New Roman" w:hAnsi="Times New Roman" w:cs="Times New Roman"/>
+        </w:rPr>
+        <w:t/>
+      </w:r>
+    </w:p>
+    <w:p>
+      <w:pPr>
+        <w:spacing w:after="0" w:line="240" w:lineRule="auto"/>
+        <w:rPr>
+          <w:rFonts w:ascii="Times New Roman" w:hAnsi="Times New Roman" w:cs="Times New Roman"/>
+          <w:lang w:val="en-US"/>
+        </w:rPr>
+      </w:pPr>
+      <w:r>
+        <w:rPr>
+          <w:rFonts w:ascii="Times New Roman" w:hAnsi="Times New Roman" w:cs="Times New Roman"/>
+        </w:rPr>
+        <w:t xml:space="preserve">    </w:t>
+      </w:r>
+      <w:r>
+        <w:rPr>
+          <w:rFonts w:ascii="Times New Roman" w:hAnsi="Times New Roman" w:cs="Times New Roman"/>
+        </w:rPr>
+        <w:t xml:space="preserve">B. Hello</w:t>
+      </w:r>
+      <w:r>
+        <w:rPr>
+          <w:rStyle w:val="hljs-selector-id"/>
+          <w:rFonts w:ascii="Times New Roman" w:hAnsi="Times New Roman" w:cs="Times New Roman"/>
+        </w:rPr>
+        <w:t/>
+      </w:r>
+      <w:r>
+        <w:rPr>
+          <w:rFonts w:ascii="Times New Roman" w:hAnsi="Times New Roman" w:cs="Times New Roman"/>
+        </w:rPr>
+        <w:t/>
+      </w:r>
+    </w:p>
+    <w:p>
+      <w:pPr>
+        <w:spacing w:after="0" w:line="240" w:lineRule="auto"/>
+        <w:rPr>
+          <w:rFonts w:ascii="Times New Roman" w:hAnsi="Times New Roman" w:cs="Times New Roman"/>
+          <w:lang w:val="en-US"/>
+        </w:rPr>
+      </w:pPr>
+      <w:r>
+        <w:rPr>
+          <w:rFonts w:ascii="Times New Roman" w:hAnsi="Times New Roman" w:cs="Times New Roman"/>
+        </w:rPr>
+        <w:t xml:space="preserve">    </w:t>
+      </w:r>
+      <w:r>
+        <w:rPr>
+          <w:rFonts w:ascii="Times New Roman" w:hAnsi="Times New Roman" w:cs="Times New Roman"/>
+        </w:rPr>
+        <w:t xml:space="preserve">C. Bye</w:t>
       </w:r>
     </w:p>
     <w:p>
@@ -2826,6 +2954,8 @@
         <w:rPr>
           <w:rStyle w:val="markedcontent"/>
           <w:rFonts w:ascii="Times New Roman" w:hAnsi="Times New Roman" w:cs="Times New Roman"/>
+          <w:b/>
+          <w:bCs/>
         </w:rPr>
         <w:t xml:space="preserve">18</w:t>
       </w:r>
@@ -2833,6 +2963,8 @@
         <w:rPr>
           <w:rStyle w:val="markedcontent"/>
           <w:rFonts w:ascii="Times New Roman" w:hAnsi="Times New Roman" w:cs="Times New Roman"/>
+          <w:b/>
+          <w:bCs/>
         </w:rPr>
         <w:t xml:space="preserve">.</w:t>
       </w:r>
@@ -2881,75 +3013,75 @@
         <w:rPr>
           <w:rFonts w:ascii="Times New Roman" w:hAnsi="Times New Roman" w:cs="Times New Roman"/>
         </w:rPr>
-        <w:t xml:space="preserve">-Hi</w:t>
-      </w:r>
-      <w:r>
-        <w:rPr>
-          <w:rStyle w:val="hljs-selector-id"/>
-          <w:rFonts w:ascii="Times New Roman" w:hAnsi="Times New Roman" w:cs="Times New Roman"/>
-        </w:rPr>
-        <w:t/>
-      </w:r>
-      <w:r>
-        <w:rPr>
-          <w:rFonts w:ascii="Times New Roman" w:hAnsi="Times New Roman" w:cs="Times New Roman"/>
-        </w:rPr>
-        <w:t/>
-      </w:r>
-    </w:p>
-    <w:p>
-      <w:pPr>
-        <w:spacing w:after="0" w:line="240" w:lineRule="auto"/>
-        <w:rPr>
-          <w:rFonts w:ascii="Times New Roman" w:hAnsi="Times New Roman" w:cs="Times New Roman"/>
-          <w:lang w:val="en-US"/>
-        </w:rPr>
-      </w:pPr>
-      <w:r>
-        <w:rPr>
-          <w:rFonts w:ascii="Times New Roman" w:hAnsi="Times New Roman" w:cs="Times New Roman"/>
-        </w:rPr>
-        <w:t xml:space="preserve">    </w:t>
-      </w:r>
-      <w:r>
-        <w:rPr>
-          <w:rFonts w:ascii="Times New Roman" w:hAnsi="Times New Roman" w:cs="Times New Roman"/>
-        </w:rPr>
-        <w:t xml:space="preserve">-Hello</w:t>
-      </w:r>
-      <w:r>
-        <w:rPr>
-          <w:rStyle w:val="hljs-selector-id"/>
-          <w:rFonts w:ascii="Times New Roman" w:hAnsi="Times New Roman" w:cs="Times New Roman"/>
-        </w:rPr>
-        <w:t/>
-      </w:r>
-      <w:r>
-        <w:rPr>
-          <w:rFonts w:ascii="Times New Roman" w:hAnsi="Times New Roman" w:cs="Times New Roman"/>
-        </w:rPr>
-        <w:t/>
-      </w:r>
-    </w:p>
-    <w:p>
-      <w:pPr>
-        <w:spacing w:after="0" w:line="240" w:lineRule="auto"/>
-        <w:rPr>
-          <w:rFonts w:ascii="Times New Roman" w:hAnsi="Times New Roman" w:cs="Times New Roman"/>
-          <w:lang w:val="en-US"/>
-        </w:rPr>
-      </w:pPr>
-      <w:r>
-        <w:rPr>
-          <w:rFonts w:ascii="Times New Roman" w:hAnsi="Times New Roman" w:cs="Times New Roman"/>
-        </w:rPr>
-        <w:t xml:space="preserve">    </w:t>
-      </w:r>
-      <w:r>
-        <w:rPr>
-          <w:rFonts w:ascii="Times New Roman" w:hAnsi="Times New Roman" w:cs="Times New Roman"/>
-        </w:rPr>
-        <w:t xml:space="preserve">-Bye</w:t>
+        <w:t xml:space="preserve">A. Hi</w:t>
+      </w:r>
+      <w:r>
+        <w:rPr>
+          <w:rStyle w:val="hljs-selector-id"/>
+          <w:rFonts w:ascii="Times New Roman" w:hAnsi="Times New Roman" w:cs="Times New Roman"/>
+        </w:rPr>
+        <w:t/>
+      </w:r>
+      <w:r>
+        <w:rPr>
+          <w:rFonts w:ascii="Times New Roman" w:hAnsi="Times New Roman" w:cs="Times New Roman"/>
+        </w:rPr>
+        <w:t/>
+      </w:r>
+    </w:p>
+    <w:p>
+      <w:pPr>
+        <w:spacing w:after="0" w:line="240" w:lineRule="auto"/>
+        <w:rPr>
+          <w:rFonts w:ascii="Times New Roman" w:hAnsi="Times New Roman" w:cs="Times New Roman"/>
+          <w:lang w:val="en-US"/>
+        </w:rPr>
+      </w:pPr>
+      <w:r>
+        <w:rPr>
+          <w:rFonts w:ascii="Times New Roman" w:hAnsi="Times New Roman" w:cs="Times New Roman"/>
+        </w:rPr>
+        <w:t xml:space="preserve">    </w:t>
+      </w:r>
+      <w:r>
+        <w:rPr>
+          <w:rFonts w:ascii="Times New Roman" w:hAnsi="Times New Roman" w:cs="Times New Roman"/>
+        </w:rPr>
+        <w:t xml:space="preserve">B. Hello</w:t>
+      </w:r>
+      <w:r>
+        <w:rPr>
+          <w:rStyle w:val="hljs-selector-id"/>
+          <w:rFonts w:ascii="Times New Roman" w:hAnsi="Times New Roman" w:cs="Times New Roman"/>
+        </w:rPr>
+        <w:t/>
+      </w:r>
+      <w:r>
+        <w:rPr>
+          <w:rFonts w:ascii="Times New Roman" w:hAnsi="Times New Roman" w:cs="Times New Roman"/>
+        </w:rPr>
+        <w:t/>
+      </w:r>
+    </w:p>
+    <w:p>
+      <w:pPr>
+        <w:spacing w:after="0" w:line="240" w:lineRule="auto"/>
+        <w:rPr>
+          <w:rFonts w:ascii="Times New Roman" w:hAnsi="Times New Roman" w:cs="Times New Roman"/>
+          <w:lang w:val="en-US"/>
+        </w:rPr>
+      </w:pPr>
+      <w:r>
+        <w:rPr>
+          <w:rFonts w:ascii="Times New Roman" w:hAnsi="Times New Roman" w:cs="Times New Roman"/>
+        </w:rPr>
+        <w:t xml:space="preserve">    </w:t>
+      </w:r>
+      <w:r>
+        <w:rPr>
+          <w:rFonts w:ascii="Times New Roman" w:hAnsi="Times New Roman" w:cs="Times New Roman"/>
+        </w:rPr>
+        <w:t xml:space="preserve">C. Bye</w:t>
       </w:r>
     </w:p>
     <w:p>

</xml_diff>

<commit_message>
Added feature to add images to question paper
</commit_message>
<xml_diff>
--- a/backend/controllers/output.docx
+++ b/backend/controllers/output.docx
@@ -21,26 +21,6 @@
         </w:rPr>
         <w:t xml:space="preserve">CA1</w:t>
       </w:r>
-      <w:proofErr w:type="spellStart"/>
-      <w:r>
-        <w:rPr>
-          <w:rFonts w:ascii="Times New Roman" w:hAnsi="Times New Roman" w:cs="Times New Roman"/>
-          <w:b/>
-          <w:bCs/>
-          <w:lang w:val="en-US"/>
-        </w:rPr>
-        <w:t/>
-      </w:r>
-      <w:proofErr w:type="spellEnd"/>
-      <w:r>
-        <w:rPr>
-          <w:rFonts w:ascii="Times New Roman" w:hAnsi="Times New Roman" w:cs="Times New Roman"/>
-          <w:b/>
-          <w:bCs/>
-          <w:lang w:val="en-US"/>
-        </w:rPr>
-        <w:t/>
-      </w:r>
     </w:p>
     <w:p>
       <w:pPr>
@@ -59,27 +39,7 @@
           <w:bCs/>
           <w:lang w:val="en-US"/>
         </w:rPr>
-        <w:t xml:space="preserve">CSE316</w:t>
-      </w:r>
-      <w:proofErr w:type="spellStart"/>
-      <w:r>
-        <w:rPr>
-          <w:rFonts w:ascii="Times New Roman" w:hAnsi="Times New Roman" w:cs="Times New Roman"/>
-          <w:b/>
-          <w:bCs/>
-          <w:lang w:val="en-US"/>
-        </w:rPr>
-        <w:t/>
-      </w:r>
-      <w:proofErr w:type="spellEnd"/>
-      <w:r>
-        <w:rPr>
-          <w:rFonts w:ascii="Times New Roman" w:hAnsi="Times New Roman" w:cs="Times New Roman"/>
-          <w:b/>
-          <w:bCs/>
-          <w:lang w:val="en-US"/>
-        </w:rPr>
-        <w:t xml:space="preserve">:</w:t>
+        <w:t xml:space="preserve">CSE316:</w:t>
       </w:r>
       <w:r>
         <w:rPr>
@@ -98,26 +58,6 @@
           <w:lang w:val="en-US"/>
         </w:rPr>
         <w:t xml:space="preserve">Operating System</w:t>
-      </w:r>
-      <w:proofErr w:type="spellStart"/>
-      <w:r>
-        <w:rPr>
-          <w:rFonts w:ascii="Times New Roman" w:hAnsi="Times New Roman" w:cs="Times New Roman"/>
-          <w:b/>
-          <w:bCs/>
-          <w:lang w:val="en-US"/>
-        </w:rPr>
-        <w:t/>
-      </w:r>
-      <w:proofErr w:type="spellEnd"/>
-      <w:r>
-        <w:rPr>
-          <w:rFonts w:ascii="Times New Roman" w:hAnsi="Times New Roman" w:cs="Times New Roman"/>
-          <w:b/>
-          <w:bCs/>
-          <w:lang w:val="en-US"/>
-        </w:rPr>
-        <w:t/>
       </w:r>
     </w:p>
     <w:p>
@@ -295,7 +235,6 @@
         <w:spacing w:after="0" w:line="240" w:lineRule="auto"/>
         <w:rPr>
           <w:rFonts w:ascii="Times New Roman" w:hAnsi="Times New Roman" w:cs="Times New Roman"/>
-          <w:lang w:val="en-US"/>
         </w:rPr>
       </w:pPr>
       <w:r>
@@ -325,6 +264,12 @@
       </w:r>
       <w:r>
         <w:rPr>
+          <w:rStyle w:val="markedcontent"/>
+          <w:rFonts w:ascii="Times New Roman" w:hAnsi="Times New Roman" w:cs="Times New Roman"/>
+        </w:rPr>
+      </w:r>
+      <w:r>
+        <w:rPr>
           <w:rFonts w:ascii="Times New Roman" w:hAnsi="Times New Roman" w:cs="Times New Roman"/>
         </w:rPr>
         <w:t/>
@@ -451,7 +396,6 @@
         <w:spacing w:after="0" w:line="240" w:lineRule="auto"/>
         <w:rPr>
           <w:rFonts w:ascii="Times New Roman" w:hAnsi="Times New Roman" w:cs="Times New Roman"/>
-          <w:lang w:val="en-US"/>
         </w:rPr>
       </w:pPr>
       <w:r>
@@ -481,6 +425,12 @@
       </w:r>
       <w:r>
         <w:rPr>
+          <w:rStyle w:val="markedcontent"/>
+          <w:rFonts w:ascii="Times New Roman" w:hAnsi="Times New Roman" w:cs="Times New Roman"/>
+        </w:rPr>
+      </w:r>
+      <w:r>
+        <w:rPr>
           <w:rFonts w:ascii="Times New Roman" w:hAnsi="Times New Roman" w:cs="Times New Roman"/>
         </w:rPr>
         <w:t/>
@@ -607,7 +557,6 @@
         <w:spacing w:after="0" w:line="240" w:lineRule="auto"/>
         <w:rPr>
           <w:rFonts w:ascii="Times New Roman" w:hAnsi="Times New Roman" w:cs="Times New Roman"/>
-          <w:lang w:val="en-US"/>
         </w:rPr>
       </w:pPr>
       <w:r>
@@ -637,6 +586,12 @@
       </w:r>
       <w:r>
         <w:rPr>
+          <w:rStyle w:val="markedcontent"/>
+          <w:rFonts w:ascii="Times New Roman" w:hAnsi="Times New Roman" w:cs="Times New Roman"/>
+        </w:rPr>
+      </w:r>
+      <w:r>
+        <w:rPr>
           <w:rFonts w:ascii="Times New Roman" w:hAnsi="Times New Roman" w:cs="Times New Roman"/>
         </w:rPr>
         <w:t/>
@@ -763,7 +718,6 @@
         <w:spacing w:after="0" w:line="240" w:lineRule="auto"/>
         <w:rPr>
           <w:rFonts w:ascii="Times New Roman" w:hAnsi="Times New Roman" w:cs="Times New Roman"/>
-          <w:lang w:val="en-US"/>
         </w:rPr>
       </w:pPr>
       <w:r>
@@ -793,6 +747,12 @@
       </w:r>
       <w:r>
         <w:rPr>
+          <w:rStyle w:val="markedcontent"/>
+          <w:rFonts w:ascii="Times New Roman" w:hAnsi="Times New Roman" w:cs="Times New Roman"/>
+        </w:rPr>
+      </w:r>
+      <w:r>
+        <w:rPr>
           <w:rFonts w:ascii="Times New Roman" w:hAnsi="Times New Roman" w:cs="Times New Roman"/>
         </w:rPr>
         <w:t/>
@@ -919,7 +879,6 @@
         <w:spacing w:after="0" w:line="240" w:lineRule="auto"/>
         <w:rPr>
           <w:rFonts w:ascii="Times New Roman" w:hAnsi="Times New Roman" w:cs="Times New Roman"/>
-          <w:lang w:val="en-US"/>
         </w:rPr>
       </w:pPr>
       <w:r>
@@ -949,6 +908,12 @@
       </w:r>
       <w:r>
         <w:rPr>
+          <w:rStyle w:val="markedcontent"/>
+          <w:rFonts w:ascii="Times New Roman" w:hAnsi="Times New Roman" w:cs="Times New Roman"/>
+        </w:rPr>
+      </w:r>
+      <w:r>
+        <w:rPr>
           <w:rFonts w:ascii="Times New Roman" w:hAnsi="Times New Roman" w:cs="Times New Roman"/>
         </w:rPr>
         <w:t/>
@@ -1075,7 +1040,6 @@
         <w:spacing w:after="0" w:line="240" w:lineRule="auto"/>
         <w:rPr>
           <w:rFonts w:ascii="Times New Roman" w:hAnsi="Times New Roman" w:cs="Times New Roman"/>
-          <w:lang w:val="en-US"/>
         </w:rPr>
       </w:pPr>
       <w:r>
@@ -1105,6 +1069,12 @@
       </w:r>
       <w:r>
         <w:rPr>
+          <w:rStyle w:val="markedcontent"/>
+          <w:rFonts w:ascii="Times New Roman" w:hAnsi="Times New Roman" w:cs="Times New Roman"/>
+        </w:rPr>
+      </w:r>
+      <w:r>
+        <w:rPr>
           <w:rFonts w:ascii="Times New Roman" w:hAnsi="Times New Roman" w:cs="Times New Roman"/>
         </w:rPr>
         <w:t/>
@@ -1231,7 +1201,6 @@
         <w:spacing w:after="0" w:line="240" w:lineRule="auto"/>
         <w:rPr>
           <w:rFonts w:ascii="Times New Roman" w:hAnsi="Times New Roman" w:cs="Times New Roman"/>
-          <w:lang w:val="en-US"/>
         </w:rPr>
       </w:pPr>
       <w:r>
@@ -1261,6 +1230,12 @@
       </w:r>
       <w:r>
         <w:rPr>
+          <w:rStyle w:val="markedcontent"/>
+          <w:rFonts w:ascii="Times New Roman" w:hAnsi="Times New Roman" w:cs="Times New Roman"/>
+        </w:rPr>
+      </w:r>
+      <w:r>
+        <w:rPr>
           <w:rFonts w:ascii="Times New Roman" w:hAnsi="Times New Roman" w:cs="Times New Roman"/>
         </w:rPr>
         <w:t/>
@@ -1387,7 +1362,6 @@
         <w:spacing w:after="0" w:line="240" w:lineRule="auto"/>
         <w:rPr>
           <w:rFonts w:ascii="Times New Roman" w:hAnsi="Times New Roman" w:cs="Times New Roman"/>
-          <w:lang w:val="en-US"/>
         </w:rPr>
       </w:pPr>
       <w:r>
@@ -1417,6 +1391,12 @@
       </w:r>
       <w:r>
         <w:rPr>
+          <w:rStyle w:val="markedcontent"/>
+          <w:rFonts w:ascii="Times New Roman" w:hAnsi="Times New Roman" w:cs="Times New Roman"/>
+        </w:rPr>
+      </w:r>
+      <w:r>
+        <w:rPr>
           <w:rFonts w:ascii="Times New Roman" w:hAnsi="Times New Roman" w:cs="Times New Roman"/>
         </w:rPr>
         <w:t/>
@@ -1543,7 +1523,6 @@
         <w:spacing w:after="0" w:line="240" w:lineRule="auto"/>
         <w:rPr>
           <w:rFonts w:ascii="Times New Roman" w:hAnsi="Times New Roman" w:cs="Times New Roman"/>
-          <w:lang w:val="en-US"/>
         </w:rPr>
       </w:pPr>
       <w:r>
@@ -1573,6 +1552,12 @@
       </w:r>
       <w:r>
         <w:rPr>
+          <w:rStyle w:val="markedcontent"/>
+          <w:rFonts w:ascii="Times New Roman" w:hAnsi="Times New Roman" w:cs="Times New Roman"/>
+        </w:rPr>
+      </w:r>
+      <w:r>
+        <w:rPr>
           <w:rFonts w:ascii="Times New Roman" w:hAnsi="Times New Roman" w:cs="Times New Roman"/>
         </w:rPr>
         <w:t/>
@@ -1699,7 +1684,6 @@
         <w:spacing w:after="0" w:line="240" w:lineRule="auto"/>
         <w:rPr>
           <w:rFonts w:ascii="Times New Roman" w:hAnsi="Times New Roman" w:cs="Times New Roman"/>
-          <w:lang w:val="en-US"/>
         </w:rPr>
       </w:pPr>
       <w:r>
@@ -1729,6 +1713,12 @@
       </w:r>
       <w:r>
         <w:rPr>
+          <w:rStyle w:val="markedcontent"/>
+          <w:rFonts w:ascii="Times New Roman" w:hAnsi="Times New Roman" w:cs="Times New Roman"/>
+        </w:rPr>
+      </w:r>
+      <w:r>
+        <w:rPr>
           <w:rFonts w:ascii="Times New Roman" w:hAnsi="Times New Roman" w:cs="Times New Roman"/>
         </w:rPr>
         <w:t/>
@@ -1855,7 +1845,6 @@
         <w:spacing w:after="0" w:line="240" w:lineRule="auto"/>
         <w:rPr>
           <w:rFonts w:ascii="Times New Roman" w:hAnsi="Times New Roman" w:cs="Times New Roman"/>
-          <w:lang w:val="en-US"/>
         </w:rPr>
       </w:pPr>
       <w:r>
@@ -1885,6 +1874,12 @@
       </w:r>
       <w:r>
         <w:rPr>
+          <w:rStyle w:val="markedcontent"/>
+          <w:rFonts w:ascii="Times New Roman" w:hAnsi="Times New Roman" w:cs="Times New Roman"/>
+        </w:rPr>
+      </w:r>
+      <w:r>
+        <w:rPr>
           <w:rFonts w:ascii="Times New Roman" w:hAnsi="Times New Roman" w:cs="Times New Roman"/>
         </w:rPr>
         <w:t/>
@@ -2011,7 +2006,6 @@
         <w:spacing w:after="0" w:line="240" w:lineRule="auto"/>
         <w:rPr>
           <w:rFonts w:ascii="Times New Roman" w:hAnsi="Times New Roman" w:cs="Times New Roman"/>
-          <w:lang w:val="en-US"/>
         </w:rPr>
       </w:pPr>
       <w:r>
@@ -2041,6 +2035,12 @@
       </w:r>
       <w:r>
         <w:rPr>
+          <w:rStyle w:val="markedcontent"/>
+          <w:rFonts w:ascii="Times New Roman" w:hAnsi="Times New Roman" w:cs="Times New Roman"/>
+        </w:rPr>
+      </w:r>
+      <w:r>
+        <w:rPr>
           <w:rFonts w:ascii="Times New Roman" w:hAnsi="Times New Roman" w:cs="Times New Roman"/>
         </w:rPr>
         <w:t/>
@@ -2167,7 +2167,6 @@
         <w:spacing w:after="0" w:line="240" w:lineRule="auto"/>
         <w:rPr>
           <w:rFonts w:ascii="Times New Roman" w:hAnsi="Times New Roman" w:cs="Times New Roman"/>
-          <w:lang w:val="en-US"/>
         </w:rPr>
       </w:pPr>
       <w:r>
@@ -2197,6 +2196,12 @@
       </w:r>
       <w:r>
         <w:rPr>
+          <w:rStyle w:val="markedcontent"/>
+          <w:rFonts w:ascii="Times New Roman" w:hAnsi="Times New Roman" w:cs="Times New Roman"/>
+        </w:rPr>
+      </w:r>
+      <w:r>
+        <w:rPr>
           <w:rFonts w:ascii="Times New Roman" w:hAnsi="Times New Roman" w:cs="Times New Roman"/>
         </w:rPr>
         <w:t/>
@@ -2323,7 +2328,6 @@
         <w:spacing w:after="0" w:line="240" w:lineRule="auto"/>
         <w:rPr>
           <w:rFonts w:ascii="Times New Roman" w:hAnsi="Times New Roman" w:cs="Times New Roman"/>
-          <w:lang w:val="en-US"/>
         </w:rPr>
       </w:pPr>
       <w:r>
@@ -2353,6 +2357,12 @@
       </w:r>
       <w:r>
         <w:rPr>
+          <w:rStyle w:val="markedcontent"/>
+          <w:rFonts w:ascii="Times New Roman" w:hAnsi="Times New Roman" w:cs="Times New Roman"/>
+        </w:rPr>
+      </w:r>
+      <w:r>
+        <w:rPr>
           <w:rFonts w:ascii="Times New Roman" w:hAnsi="Times New Roman" w:cs="Times New Roman"/>
         </w:rPr>
         <w:t/>
@@ -2479,7 +2489,6 @@
         <w:spacing w:after="0" w:line="240" w:lineRule="auto"/>
         <w:rPr>
           <w:rFonts w:ascii="Times New Roman" w:hAnsi="Times New Roman" w:cs="Times New Roman"/>
-          <w:lang w:val="en-US"/>
         </w:rPr>
       </w:pPr>
       <w:r>
@@ -2509,6 +2518,12 @@
       </w:r>
       <w:r>
         <w:rPr>
+          <w:rStyle w:val="markedcontent"/>
+          <w:rFonts w:ascii="Times New Roman" w:hAnsi="Times New Roman" w:cs="Times New Roman"/>
+        </w:rPr>
+      </w:r>
+      <w:r>
+        <w:rPr>
           <w:rFonts w:ascii="Times New Roman" w:hAnsi="Times New Roman" w:cs="Times New Roman"/>
         </w:rPr>
         <w:t/>
@@ -2635,7 +2650,6 @@
         <w:spacing w:after="0" w:line="240" w:lineRule="auto"/>
         <w:rPr>
           <w:rFonts w:ascii="Times New Roman" w:hAnsi="Times New Roman" w:cs="Times New Roman"/>
-          <w:lang w:val="en-US"/>
         </w:rPr>
       </w:pPr>
       <w:r>
@@ -2665,6 +2679,12 @@
       </w:r>
       <w:r>
         <w:rPr>
+          <w:rStyle w:val="markedcontent"/>
+          <w:rFonts w:ascii="Times New Roman" w:hAnsi="Times New Roman" w:cs="Times New Roman"/>
+        </w:rPr>
+      </w:r>
+      <w:r>
+        <w:rPr>
           <w:rFonts w:ascii="Times New Roman" w:hAnsi="Times New Roman" w:cs="Times New Roman"/>
         </w:rPr>
         <w:t/>
@@ -2791,7 +2811,6 @@
         <w:spacing w:after="0" w:line="240" w:lineRule="auto"/>
         <w:rPr>
           <w:rFonts w:ascii="Times New Roman" w:hAnsi="Times New Roman" w:cs="Times New Roman"/>
-          <w:lang w:val="en-US"/>
         </w:rPr>
       </w:pPr>
       <w:r>
@@ -2821,6 +2840,12 @@
       </w:r>
       <w:r>
         <w:rPr>
+          <w:rStyle w:val="markedcontent"/>
+          <w:rFonts w:ascii="Times New Roman" w:hAnsi="Times New Roman" w:cs="Times New Roman"/>
+        </w:rPr>
+      </w:r>
+      <w:r>
+        <w:rPr>
           <w:rFonts w:ascii="Times New Roman" w:hAnsi="Times New Roman" w:cs="Times New Roman"/>
         </w:rPr>
         <w:t/>
@@ -2947,7 +2972,6 @@
         <w:spacing w:after="0" w:line="240" w:lineRule="auto"/>
         <w:rPr>
           <w:rFonts w:ascii="Times New Roman" w:hAnsi="Times New Roman" w:cs="Times New Roman"/>
-          <w:lang w:val="en-US"/>
         </w:rPr>
       </w:pPr>
       <w:r>
@@ -2977,6 +3001,12 @@
       </w:r>
       <w:r>
         <w:rPr>
+          <w:rStyle w:val="markedcontent"/>
+          <w:rFonts w:ascii="Times New Roman" w:hAnsi="Times New Roman" w:cs="Times New Roman"/>
+        </w:rPr>
+      </w:r>
+      <w:r>
+        <w:rPr>
           <w:rFonts w:ascii="Times New Roman" w:hAnsi="Times New Roman" w:cs="Times New Roman"/>
         </w:rPr>
         <w:t/>
@@ -3082,6 +3112,113 @@
           <w:rFonts w:ascii="Times New Roman" w:hAnsi="Times New Roman" w:cs="Times New Roman"/>
         </w:rPr>
         <w:t xml:space="preserve">C. Bye</w:t>
+      </w:r>
+    </w:p>
+    <w:p>
+      <w:pPr>
+        <w:spacing w:after="0" w:line="240" w:lineRule="auto"/>
+        <w:rPr>
+          <w:rFonts w:ascii="Times New Roman" w:hAnsi="Times New Roman" w:cs="Times New Roman"/>
+        </w:rPr>
+      </w:pPr>
+      <w:r>
+        <w:rPr>
+          <w:rFonts w:ascii="Times New Roman" w:hAnsi="Times New Roman" w:cs="Times New Roman"/>
+        </w:rPr>
+        <w:t xml:space="preserve"> </w:t>
+      </w:r>
+    </w:p>
+    <w:p>
+      <w:pPr>
+        <w:spacing w:after="0" w:line="240" w:lineRule="auto"/>
+        <w:rPr>
+          <w:rFonts w:ascii="Times New Roman" w:hAnsi="Times New Roman" w:cs="Times New Roman"/>
+        </w:rPr>
+      </w:pPr>
+      <w:r>
+        <w:rPr>
+          <w:rStyle w:val="markedcontent"/>
+          <w:rFonts w:ascii="Times New Roman" w:hAnsi="Times New Roman" w:cs="Times New Roman"/>
+          <w:b/>
+          <w:bCs/>
+        </w:rPr>
+        <w:t xml:space="preserve">19</w:t>
+      </w:r>
+      <w:r>
+        <w:rPr>
+          <w:rStyle w:val="markedcontent"/>
+          <w:rFonts w:ascii="Times New Roman" w:hAnsi="Times New Roman" w:cs="Times New Roman"/>
+          <w:b/>
+          <w:bCs/>
+        </w:rPr>
+        <w:t xml:space="preserve">.</w:t>
+      </w:r>
+      <w:r>
+        <w:rPr>
+          <w:rStyle w:val="markedcontent"/>
+          <w:rFonts w:ascii="Times New Roman" w:hAnsi="Times New Roman" w:cs="Times New Roman"/>
+        </w:rPr>
+        <w:t xml:space="preserve"> This is one more sample question</w:t>
+      </w:r>
+      <w:r>
+        <w:rPr>
+          <w:rStyle w:val="markedcontent"/>
+          <w:rFonts w:ascii="Times New Roman" w:hAnsi="Times New Roman" w:cs="Times New Roman"/>
+        </w:rPr>
+        <w:drawing>
+          <wp:inline distT="0" distB="0" distL="0" distR="0">
+            <wp:extent cx="1428750" cy="1428750"/>
+            <wp:effectExtent l="0" t="0" r="0" b="0"/>
+            <wp:docPr id="2" name="Image 2" descr="image"/>
+            <wp:cNvGraphicFramePr>
+              <a:graphicFrameLocks xmlns:a="http://schemas.openxmlformats.org/drawingml/2006/main" noChangeAspect="1"/>
+            </wp:cNvGraphicFramePr>
+            <a:graphic xmlns:a="http://schemas.openxmlformats.org/drawingml/2006/main">
+              <a:graphicData uri="http://schemas.openxmlformats.org/drawingml/2006/picture">
+                <pic:pic xmlns:pic="http://schemas.openxmlformats.org/drawingml/2006/picture">
+                  <pic:nvPicPr>
+                    <pic:cNvPr id="0" name="Picture 1" descr="image"/>
+                    <pic:cNvPicPr>
+                      <a:picLocks noChangeAspect="1" noChangeArrowheads="1"/>
+                    </pic:cNvPicPr>
+                  </pic:nvPicPr>
+                  <pic:blipFill>
+                    <a:blip r:embed="rId7">
+                      <a:extLst>
+                        <a:ext uri="{28A0092B-C50C-407E-A947-70E740481C1C}">
+                          <a14:useLocalDpi xmlns:a14="http://schemas.microsoft.com/office/drawing/2010/main" val="0"/>
+                        </a:ext>
+                      </a:extLst>
+                    </a:blip>
+                    <a:srcRect/>
+                    <a:stretch>
+                      <a:fillRect/>
+                    </a:stretch>
+                  </pic:blipFill>
+                  <pic:spPr bwMode="auto">
+                    <a:xfrm>
+                      <a:off x="0" y="0"/>
+                      <a:ext cx="1428750" cy="1428750"/>
+                    </a:xfrm>
+                    <a:prstGeom prst="rect">
+                      <a:avLst/>
+                    </a:prstGeom>
+                    <a:noFill/>
+                    <a:ln>
+                      <a:noFill/>
+                    </a:ln>
+                  </pic:spPr>
+                </pic:pic>
+              </a:graphicData>
+            </a:graphic>
+          </wp:inline>
+        </w:drawing>
+      </w:r>
+      <w:r>
+        <w:rPr>
+          <w:rFonts w:ascii="Times New Roman" w:hAnsi="Times New Roman" w:cs="Times New Roman"/>
+        </w:rPr>
+        <w:t/>
       </w:r>
     </w:p>
     <w:p>

</xml_diff>

<commit_message>
Added new route to make a new set
</commit_message>
<xml_diff>
--- a/backend/controllers/output.docx
+++ b/backend/controllers/output.docx
@@ -260,7 +260,7 @@
           <w:rStyle w:val="markedcontent"/>
           <w:rFonts w:ascii="Times New Roman" w:hAnsi="Times New Roman" w:cs="Times New Roman"/>
         </w:rPr>
-        <w:t xml:space="preserve"> What is Operating System?</w:t>
+        <w:t xml:space="preserve"> This is a test question</w:t>
       </w:r>
       <w:r>
         <w:rPr>
@@ -273,591 +273,6 @@
           <w:rFonts w:ascii="Times New Roman" w:hAnsi="Times New Roman" w:cs="Times New Roman"/>
         </w:rPr>
         <w:t/>
-      </w:r>
-      <w:r>
-        <w:rPr>
-          <w:rStyle w:val="hljs-selector-id"/>
-          <w:rFonts w:ascii="Times New Roman" w:hAnsi="Times New Roman" w:cs="Times New Roman"/>
-        </w:rPr>
-        <w:t/>
-      </w:r>
-      <w:r>
-        <w:rPr>
-          <w:rFonts w:ascii="Times New Roman" w:hAnsi="Times New Roman" w:cs="Times New Roman"/>
-        </w:rPr>
-        <w:t/>
-      </w:r>
-    </w:p>
-    <w:p>
-      <w:pPr>
-        <w:spacing w:after="0" w:line="240" w:lineRule="auto"/>
-        <w:rPr>
-          <w:rFonts w:ascii="Times New Roman" w:hAnsi="Times New Roman" w:cs="Times New Roman"/>
-          <w:lang w:val="en-US"/>
-        </w:rPr>
-      </w:pPr>
-      <w:r>
-        <w:rPr>
-          <w:rFonts w:ascii="Times New Roman" w:hAnsi="Times New Roman" w:cs="Times New Roman"/>
-        </w:rPr>
-        <w:t xml:space="preserve">    </w:t>
-      </w:r>
-      <w:r>
-        <w:rPr>
-          <w:rFonts w:ascii="Times New Roman" w:hAnsi="Times New Roman" w:cs="Times New Roman"/>
-        </w:rPr>
-        <w:t xml:space="preserve">A. Hi</w:t>
-      </w:r>
-      <w:r>
-        <w:rPr>
-          <w:rStyle w:val="hljs-selector-id"/>
-          <w:rFonts w:ascii="Times New Roman" w:hAnsi="Times New Roman" w:cs="Times New Roman"/>
-        </w:rPr>
-        <w:t/>
-      </w:r>
-      <w:r>
-        <w:rPr>
-          <w:rFonts w:ascii="Times New Roman" w:hAnsi="Times New Roman" w:cs="Times New Roman"/>
-        </w:rPr>
-        <w:t/>
-      </w:r>
-    </w:p>
-    <w:p>
-      <w:pPr>
-        <w:spacing w:after="0" w:line="240" w:lineRule="auto"/>
-        <w:rPr>
-          <w:rFonts w:ascii="Times New Roman" w:hAnsi="Times New Roman" w:cs="Times New Roman"/>
-          <w:lang w:val="en-US"/>
-        </w:rPr>
-      </w:pPr>
-      <w:r>
-        <w:rPr>
-          <w:rFonts w:ascii="Times New Roman" w:hAnsi="Times New Roman" w:cs="Times New Roman"/>
-        </w:rPr>
-        <w:t xml:space="preserve">    </w:t>
-      </w:r>
-      <w:r>
-        <w:rPr>
-          <w:rFonts w:ascii="Times New Roman" w:hAnsi="Times New Roman" w:cs="Times New Roman"/>
-        </w:rPr>
-        <w:t xml:space="preserve">B. Hello</w:t>
-      </w:r>
-      <w:r>
-        <w:rPr>
-          <w:rStyle w:val="hljs-selector-id"/>
-          <w:rFonts w:ascii="Times New Roman" w:hAnsi="Times New Roman" w:cs="Times New Roman"/>
-        </w:rPr>
-        <w:t/>
-      </w:r>
-      <w:r>
-        <w:rPr>
-          <w:rFonts w:ascii="Times New Roman" w:hAnsi="Times New Roman" w:cs="Times New Roman"/>
-        </w:rPr>
-        <w:t/>
-      </w:r>
-    </w:p>
-    <w:p>
-      <w:pPr>
-        <w:spacing w:after="0" w:line="240" w:lineRule="auto"/>
-        <w:rPr>
-          <w:rFonts w:ascii="Times New Roman" w:hAnsi="Times New Roman" w:cs="Times New Roman"/>
-          <w:lang w:val="en-US"/>
-        </w:rPr>
-      </w:pPr>
-      <w:r>
-        <w:rPr>
-          <w:rFonts w:ascii="Times New Roman" w:hAnsi="Times New Roman" w:cs="Times New Roman"/>
-        </w:rPr>
-        <w:t xml:space="preserve">    </w:t>
-      </w:r>
-      <w:r>
-        <w:rPr>
-          <w:rFonts w:ascii="Times New Roman" w:hAnsi="Times New Roman" w:cs="Times New Roman"/>
-        </w:rPr>
-        <w:t xml:space="preserve">C. Byeee</w:t>
-      </w:r>
-    </w:p>
-    <w:p>
-      <w:pPr>
-        <w:spacing w:after="0" w:line="240" w:lineRule="auto"/>
-        <w:rPr>
-          <w:rFonts w:ascii="Times New Roman" w:hAnsi="Times New Roman" w:cs="Times New Roman"/>
-        </w:rPr>
-      </w:pPr>
-      <w:r>
-        <w:rPr>
-          <w:rFonts w:ascii="Times New Roman" w:hAnsi="Times New Roman" w:cs="Times New Roman"/>
-        </w:rPr>
-        <w:t xml:space="preserve"> </w:t>
-      </w:r>
-    </w:p>
-    <w:p>
-      <w:pPr>
-        <w:spacing w:after="0" w:line="240" w:lineRule="auto"/>
-        <w:rPr>
-          <w:rFonts w:ascii="Times New Roman" w:hAnsi="Times New Roman" w:cs="Times New Roman"/>
-        </w:rPr>
-      </w:pPr>
-      <w:r>
-        <w:rPr>
-          <w:rStyle w:val="markedcontent"/>
-          <w:rFonts w:ascii="Times New Roman" w:hAnsi="Times New Roman" w:cs="Times New Roman"/>
-          <w:b/>
-          <w:bCs/>
-        </w:rPr>
-        <w:t xml:space="preserve">2</w:t>
-      </w:r>
-      <w:r>
-        <w:rPr>
-          <w:rStyle w:val="markedcontent"/>
-          <w:rFonts w:ascii="Times New Roman" w:hAnsi="Times New Roman" w:cs="Times New Roman"/>
-          <w:b/>
-          <w:bCs/>
-        </w:rPr>
-        <w:t xml:space="preserve">.</w:t>
-      </w:r>
-      <w:r>
-        <w:rPr>
-          <w:rStyle w:val="markedcontent"/>
-          <w:rFonts w:ascii="Times New Roman" w:hAnsi="Times New Roman" w:cs="Times New Roman"/>
-        </w:rPr>
-        <w:t xml:space="preserve"> What is Operating System?</w:t>
-      </w:r>
-      <w:r>
-        <w:rPr>
-          <w:rStyle w:val="markedcontent"/>
-          <w:rFonts w:ascii="Times New Roman" w:hAnsi="Times New Roman" w:cs="Times New Roman"/>
-        </w:rPr>
-      </w:r>
-      <w:r>
-        <w:rPr>
-          <w:rFonts w:ascii="Times New Roman" w:hAnsi="Times New Roman" w:cs="Times New Roman"/>
-        </w:rPr>
-        <w:t/>
-      </w:r>
-      <w:r>
-        <w:rPr>
-          <w:rStyle w:val="hljs-selector-id"/>
-          <w:rFonts w:ascii="Times New Roman" w:hAnsi="Times New Roman" w:cs="Times New Roman"/>
-        </w:rPr>
-        <w:t/>
-      </w:r>
-      <w:r>
-        <w:rPr>
-          <w:rFonts w:ascii="Times New Roman" w:hAnsi="Times New Roman" w:cs="Times New Roman"/>
-        </w:rPr>
-        <w:t/>
-      </w:r>
-    </w:p>
-    <w:p>
-      <w:pPr>
-        <w:spacing w:after="0" w:line="240" w:lineRule="auto"/>
-        <w:rPr>
-          <w:rFonts w:ascii="Times New Roman" w:hAnsi="Times New Roman" w:cs="Times New Roman"/>
-          <w:lang w:val="en-US"/>
-        </w:rPr>
-      </w:pPr>
-      <w:r>
-        <w:rPr>
-          <w:rFonts w:ascii="Times New Roman" w:hAnsi="Times New Roman" w:cs="Times New Roman"/>
-        </w:rPr>
-        <w:t xml:space="preserve">    </w:t>
-      </w:r>
-      <w:r>
-        <w:rPr>
-          <w:rFonts w:ascii="Times New Roman" w:hAnsi="Times New Roman" w:cs="Times New Roman"/>
-        </w:rPr>
-        <w:t xml:space="preserve">A. Hi</w:t>
-      </w:r>
-      <w:r>
-        <w:rPr>
-          <w:rStyle w:val="hljs-selector-id"/>
-          <w:rFonts w:ascii="Times New Roman" w:hAnsi="Times New Roman" w:cs="Times New Roman"/>
-        </w:rPr>
-        <w:t/>
-      </w:r>
-      <w:r>
-        <w:rPr>
-          <w:rFonts w:ascii="Times New Roman" w:hAnsi="Times New Roman" w:cs="Times New Roman"/>
-        </w:rPr>
-        <w:t/>
-      </w:r>
-    </w:p>
-    <w:p>
-      <w:pPr>
-        <w:spacing w:after="0" w:line="240" w:lineRule="auto"/>
-        <w:rPr>
-          <w:rFonts w:ascii="Times New Roman" w:hAnsi="Times New Roman" w:cs="Times New Roman"/>
-          <w:lang w:val="en-US"/>
-        </w:rPr>
-      </w:pPr>
-      <w:r>
-        <w:rPr>
-          <w:rFonts w:ascii="Times New Roman" w:hAnsi="Times New Roman" w:cs="Times New Roman"/>
-        </w:rPr>
-        <w:t xml:space="preserve">    </w:t>
-      </w:r>
-      <w:r>
-        <w:rPr>
-          <w:rFonts w:ascii="Times New Roman" w:hAnsi="Times New Roman" w:cs="Times New Roman"/>
-        </w:rPr>
-        <w:t xml:space="preserve">B. Hello</w:t>
-      </w:r>
-      <w:r>
-        <w:rPr>
-          <w:rStyle w:val="hljs-selector-id"/>
-          <w:rFonts w:ascii="Times New Roman" w:hAnsi="Times New Roman" w:cs="Times New Roman"/>
-        </w:rPr>
-        <w:t/>
-      </w:r>
-      <w:r>
-        <w:rPr>
-          <w:rFonts w:ascii="Times New Roman" w:hAnsi="Times New Roman" w:cs="Times New Roman"/>
-        </w:rPr>
-        <w:t/>
-      </w:r>
-    </w:p>
-    <w:p>
-      <w:pPr>
-        <w:spacing w:after="0" w:line="240" w:lineRule="auto"/>
-        <w:rPr>
-          <w:rFonts w:ascii="Times New Roman" w:hAnsi="Times New Roman" w:cs="Times New Roman"/>
-          <w:lang w:val="en-US"/>
-        </w:rPr>
-      </w:pPr>
-      <w:r>
-        <w:rPr>
-          <w:rFonts w:ascii="Times New Roman" w:hAnsi="Times New Roman" w:cs="Times New Roman"/>
-        </w:rPr>
-        <w:t xml:space="preserve">    </w:t>
-      </w:r>
-      <w:r>
-        <w:rPr>
-          <w:rFonts w:ascii="Times New Roman" w:hAnsi="Times New Roman" w:cs="Times New Roman"/>
-        </w:rPr>
-        <w:t xml:space="preserve">C. Check</w:t>
-      </w:r>
-    </w:p>
-    <w:p>
-      <w:pPr>
-        <w:spacing w:after="0" w:line="240" w:lineRule="auto"/>
-        <w:rPr>
-          <w:rFonts w:ascii="Times New Roman" w:hAnsi="Times New Roman" w:cs="Times New Roman"/>
-        </w:rPr>
-      </w:pPr>
-      <w:r>
-        <w:rPr>
-          <w:rFonts w:ascii="Times New Roman" w:hAnsi="Times New Roman" w:cs="Times New Roman"/>
-        </w:rPr>
-        <w:t xml:space="preserve"> </w:t>
-      </w:r>
-    </w:p>
-    <w:p>
-      <w:pPr>
-        <w:spacing w:after="0" w:line="240" w:lineRule="auto"/>
-        <w:rPr>
-          <w:rFonts w:ascii="Times New Roman" w:hAnsi="Times New Roman" w:cs="Times New Roman"/>
-        </w:rPr>
-      </w:pPr>
-      <w:r>
-        <w:rPr>
-          <w:rStyle w:val="markedcontent"/>
-          <w:rFonts w:ascii="Times New Roman" w:hAnsi="Times New Roman" w:cs="Times New Roman"/>
-          <w:b/>
-          <w:bCs/>
-        </w:rPr>
-        <w:t xml:space="preserve">3</w:t>
-      </w:r>
-      <w:r>
-        <w:rPr>
-          <w:rStyle w:val="markedcontent"/>
-          <w:rFonts w:ascii="Times New Roman" w:hAnsi="Times New Roman" w:cs="Times New Roman"/>
-          <w:b/>
-          <w:bCs/>
-        </w:rPr>
-        <w:t xml:space="preserve">.</w:t>
-      </w:r>
-      <w:r>
-        <w:rPr>
-          <w:rStyle w:val="markedcontent"/>
-          <w:rFonts w:ascii="Times New Roman" w:hAnsi="Times New Roman" w:cs="Times New Roman"/>
-        </w:rPr>
-        <w:t xml:space="preserve"> What is Operating System?</w:t>
-      </w:r>
-      <w:r>
-        <w:rPr>
-          <w:rStyle w:val="markedcontent"/>
-          <w:rFonts w:ascii="Times New Roman" w:hAnsi="Times New Roman" w:cs="Times New Roman"/>
-        </w:rPr>
-      </w:r>
-      <w:r>
-        <w:rPr>
-          <w:rFonts w:ascii="Times New Roman" w:hAnsi="Times New Roman" w:cs="Times New Roman"/>
-        </w:rPr>
-        <w:t/>
-      </w:r>
-      <w:r>
-        <w:rPr>
-          <w:rStyle w:val="hljs-selector-id"/>
-          <w:rFonts w:ascii="Times New Roman" w:hAnsi="Times New Roman" w:cs="Times New Roman"/>
-        </w:rPr>
-        <w:t/>
-      </w:r>
-      <w:r>
-        <w:rPr>
-          <w:rFonts w:ascii="Times New Roman" w:hAnsi="Times New Roman" w:cs="Times New Roman"/>
-        </w:rPr>
-        <w:t/>
-      </w:r>
-    </w:p>
-    <w:p>
-      <w:pPr>
-        <w:spacing w:after="0" w:line="240" w:lineRule="auto"/>
-        <w:rPr>
-          <w:rFonts w:ascii="Times New Roman" w:hAnsi="Times New Roman" w:cs="Times New Roman"/>
-          <w:lang w:val="en-US"/>
-        </w:rPr>
-      </w:pPr>
-      <w:r>
-        <w:rPr>
-          <w:rFonts w:ascii="Times New Roman" w:hAnsi="Times New Roman" w:cs="Times New Roman"/>
-        </w:rPr>
-        <w:t xml:space="preserve">    </w:t>
-      </w:r>
-      <w:r>
-        <w:rPr>
-          <w:rFonts w:ascii="Times New Roman" w:hAnsi="Times New Roman" w:cs="Times New Roman"/>
-        </w:rPr>
-        <w:t xml:space="preserve">A. Hi</w:t>
-      </w:r>
-      <w:r>
-        <w:rPr>
-          <w:rStyle w:val="hljs-selector-id"/>
-          <w:rFonts w:ascii="Times New Roman" w:hAnsi="Times New Roman" w:cs="Times New Roman"/>
-        </w:rPr>
-        <w:t/>
-      </w:r>
-      <w:r>
-        <w:rPr>
-          <w:rFonts w:ascii="Times New Roman" w:hAnsi="Times New Roman" w:cs="Times New Roman"/>
-        </w:rPr>
-        <w:t/>
-      </w:r>
-    </w:p>
-    <w:p>
-      <w:pPr>
-        <w:spacing w:after="0" w:line="240" w:lineRule="auto"/>
-        <w:rPr>
-          <w:rFonts w:ascii="Times New Roman" w:hAnsi="Times New Roman" w:cs="Times New Roman"/>
-          <w:lang w:val="en-US"/>
-        </w:rPr>
-      </w:pPr>
-      <w:r>
-        <w:rPr>
-          <w:rFonts w:ascii="Times New Roman" w:hAnsi="Times New Roman" w:cs="Times New Roman"/>
-        </w:rPr>
-        <w:t xml:space="preserve">    </w:t>
-      </w:r>
-      <w:r>
-        <w:rPr>
-          <w:rFonts w:ascii="Times New Roman" w:hAnsi="Times New Roman" w:cs="Times New Roman"/>
-        </w:rPr>
-        <w:t xml:space="preserve">B. Hello</w:t>
-      </w:r>
-      <w:r>
-        <w:rPr>
-          <w:rStyle w:val="hljs-selector-id"/>
-          <w:rFonts w:ascii="Times New Roman" w:hAnsi="Times New Roman" w:cs="Times New Roman"/>
-        </w:rPr>
-        <w:t/>
-      </w:r>
-      <w:r>
-        <w:rPr>
-          <w:rFonts w:ascii="Times New Roman" w:hAnsi="Times New Roman" w:cs="Times New Roman"/>
-        </w:rPr>
-        <w:t/>
-      </w:r>
-    </w:p>
-    <w:p>
-      <w:pPr>
-        <w:spacing w:after="0" w:line="240" w:lineRule="auto"/>
-        <w:rPr>
-          <w:rFonts w:ascii="Times New Roman" w:hAnsi="Times New Roman" w:cs="Times New Roman"/>
-          <w:lang w:val="en-US"/>
-        </w:rPr>
-      </w:pPr>
-      <w:r>
-        <w:rPr>
-          <w:rFonts w:ascii="Times New Roman" w:hAnsi="Times New Roman" w:cs="Times New Roman"/>
-        </w:rPr>
-        <w:t xml:space="preserve">    </w:t>
-      </w:r>
-      <w:r>
-        <w:rPr>
-          <w:rFonts w:ascii="Times New Roman" w:hAnsi="Times New Roman" w:cs="Times New Roman"/>
-        </w:rPr>
-        <w:t xml:space="preserve">C. Bye</w:t>
-      </w:r>
-    </w:p>
-    <w:p>
-      <w:pPr>
-        <w:spacing w:after="0" w:line="240" w:lineRule="auto"/>
-        <w:rPr>
-          <w:rFonts w:ascii="Times New Roman" w:hAnsi="Times New Roman" w:cs="Times New Roman"/>
-        </w:rPr>
-      </w:pPr>
-      <w:r>
-        <w:rPr>
-          <w:rFonts w:ascii="Times New Roman" w:hAnsi="Times New Roman" w:cs="Times New Roman"/>
-        </w:rPr>
-        <w:t xml:space="preserve"> </w:t>
-      </w:r>
-    </w:p>
-    <w:p>
-      <w:pPr>
-        <w:spacing w:after="0" w:line="240" w:lineRule="auto"/>
-        <w:rPr>
-          <w:rFonts w:ascii="Times New Roman" w:hAnsi="Times New Roman" w:cs="Times New Roman"/>
-        </w:rPr>
-      </w:pPr>
-      <w:r>
-        <w:rPr>
-          <w:rStyle w:val="markedcontent"/>
-          <w:rFonts w:ascii="Times New Roman" w:hAnsi="Times New Roman" w:cs="Times New Roman"/>
-          <w:b/>
-          <w:bCs/>
-        </w:rPr>
-        <w:t xml:space="preserve">4</w:t>
-      </w:r>
-      <w:r>
-        <w:rPr>
-          <w:rStyle w:val="markedcontent"/>
-          <w:rFonts w:ascii="Times New Roman" w:hAnsi="Times New Roman" w:cs="Times New Roman"/>
-          <w:b/>
-          <w:bCs/>
-        </w:rPr>
-        <w:t xml:space="preserve">.</w:t>
-      </w:r>
-      <w:r>
-        <w:rPr>
-          <w:rStyle w:val="markedcontent"/>
-          <w:rFonts w:ascii="Times New Roman" w:hAnsi="Times New Roman" w:cs="Times New Roman"/>
-        </w:rPr>
-        <w:t xml:space="preserve"> What is Operating System?</w:t>
-      </w:r>
-      <w:r>
-        <w:rPr>
-          <w:rStyle w:val="markedcontent"/>
-          <w:rFonts w:ascii="Times New Roman" w:hAnsi="Times New Roman" w:cs="Times New Roman"/>
-        </w:rPr>
-      </w:r>
-      <w:r>
-        <w:rPr>
-          <w:rFonts w:ascii="Times New Roman" w:hAnsi="Times New Roman" w:cs="Times New Roman"/>
-        </w:rPr>
-        <w:t/>
-      </w:r>
-      <w:r>
-        <w:rPr>
-          <w:rStyle w:val="hljs-selector-id"/>
-          <w:rFonts w:ascii="Times New Roman" w:hAnsi="Times New Roman" w:cs="Times New Roman"/>
-        </w:rPr>
-        <w:t/>
-      </w:r>
-      <w:r>
-        <w:rPr>
-          <w:rFonts w:ascii="Times New Roman" w:hAnsi="Times New Roman" w:cs="Times New Roman"/>
-        </w:rPr>
-        <w:t/>
-      </w:r>
-    </w:p>
-    <w:p>
-      <w:pPr>
-        <w:spacing w:after="0" w:line="240" w:lineRule="auto"/>
-        <w:rPr>
-          <w:rFonts w:ascii="Times New Roman" w:hAnsi="Times New Roman" w:cs="Times New Roman"/>
-          <w:lang w:val="en-US"/>
-        </w:rPr>
-      </w:pPr>
-      <w:r>
-        <w:rPr>
-          <w:rFonts w:ascii="Times New Roman" w:hAnsi="Times New Roman" w:cs="Times New Roman"/>
-        </w:rPr>
-        <w:t xml:space="preserve">    </w:t>
-      </w:r>
-      <w:r>
-        <w:rPr>
-          <w:rFonts w:ascii="Times New Roman" w:hAnsi="Times New Roman" w:cs="Times New Roman"/>
-        </w:rPr>
-        <w:t xml:space="preserve">A. Hi</w:t>
-      </w:r>
-      <w:r>
-        <w:rPr>
-          <w:rStyle w:val="hljs-selector-id"/>
-          <w:rFonts w:ascii="Times New Roman" w:hAnsi="Times New Roman" w:cs="Times New Roman"/>
-        </w:rPr>
-        <w:t/>
-      </w:r>
-      <w:r>
-        <w:rPr>
-          <w:rFonts w:ascii="Times New Roman" w:hAnsi="Times New Roman" w:cs="Times New Roman"/>
-        </w:rPr>
-        <w:t/>
-      </w:r>
-    </w:p>
-    <w:p>
-      <w:pPr>
-        <w:spacing w:after="0" w:line="240" w:lineRule="auto"/>
-        <w:rPr>
-          <w:rFonts w:ascii="Times New Roman" w:hAnsi="Times New Roman" w:cs="Times New Roman"/>
-          <w:lang w:val="en-US"/>
-        </w:rPr>
-      </w:pPr>
-      <w:r>
-        <w:rPr>
-          <w:rFonts w:ascii="Times New Roman" w:hAnsi="Times New Roman" w:cs="Times New Roman"/>
-        </w:rPr>
-        <w:t xml:space="preserve">    </w:t>
-      </w:r>
-      <w:r>
-        <w:rPr>
-          <w:rFonts w:ascii="Times New Roman" w:hAnsi="Times New Roman" w:cs="Times New Roman"/>
-        </w:rPr>
-        <w:t xml:space="preserve">B. Hello</w:t>
-      </w:r>
-      <w:r>
-        <w:rPr>
-          <w:rStyle w:val="hljs-selector-id"/>
-          <w:rFonts w:ascii="Times New Roman" w:hAnsi="Times New Roman" w:cs="Times New Roman"/>
-        </w:rPr>
-        <w:t/>
-      </w:r>
-      <w:r>
-        <w:rPr>
-          <w:rFonts w:ascii="Times New Roman" w:hAnsi="Times New Roman" w:cs="Times New Roman"/>
-        </w:rPr>
-        <w:t/>
-      </w:r>
-    </w:p>
-    <w:p>
-      <w:pPr>
-        <w:spacing w:after="0" w:line="240" w:lineRule="auto"/>
-        <w:rPr>
-          <w:rFonts w:ascii="Times New Roman" w:hAnsi="Times New Roman" w:cs="Times New Roman"/>
-          <w:lang w:val="en-US"/>
-        </w:rPr>
-      </w:pPr>
-      <w:r>
-        <w:rPr>
-          <w:rFonts w:ascii="Times New Roman" w:hAnsi="Times New Roman" w:cs="Times New Roman"/>
-        </w:rPr>
-        <w:t xml:space="preserve">    </w:t>
-      </w:r>
-      <w:r>
-        <w:rPr>
-          <w:rFonts w:ascii="Times New Roman" w:hAnsi="Times New Roman" w:cs="Times New Roman"/>
-        </w:rPr>
-        <w:t xml:space="preserve">C. Bye</w:t>
       </w:r>
     </w:p>
     <w:p>

</xml_diff>

<commit_message>
Delete function updated to handle image files
</commit_message>
<xml_diff>
--- a/backend/controllers/output.docx
+++ b/backend/controllers/output.docx
@@ -226,65 +226,6 @@
         <w:rPr>
           <w:rFonts w:ascii="Times New Roman" w:hAnsi="Times New Roman" w:cs="Times New Roman"/>
           <w:lang w:val="en-US"/>
-        </w:rPr>
-        <w:t xml:space="preserve"> </w:t>
-      </w:r>
-    </w:p>
-    <w:p>
-      <w:pPr>
-        <w:spacing w:after="0" w:line="240" w:lineRule="auto"/>
-        <w:rPr>
-          <w:rFonts w:ascii="Times New Roman" w:hAnsi="Times New Roman" w:cs="Times New Roman"/>
-        </w:rPr>
-      </w:pPr>
-      <w:r>
-        <w:rPr>
-          <w:rStyle w:val="markedcontent"/>
-          <w:rFonts w:ascii="Times New Roman" w:hAnsi="Times New Roman" w:cs="Times New Roman"/>
-          <w:b/>
-          <w:bCs/>
-        </w:rPr>
-        <w:t xml:space="preserve">1</w:t>
-      </w:r>
-      <w:r>
-        <w:rPr>
-          <w:rStyle w:val="markedcontent"/>
-          <w:rFonts w:ascii="Times New Roman" w:hAnsi="Times New Roman" w:cs="Times New Roman"/>
-          <w:b/>
-          <w:bCs/>
-        </w:rPr>
-        <w:t xml:space="preserve">.</w:t>
-      </w:r>
-      <w:r>
-        <w:rPr>
-          <w:rStyle w:val="markedcontent"/>
-          <w:rFonts w:ascii="Times New Roman" w:hAnsi="Times New Roman" w:cs="Times New Roman"/>
-        </w:rPr>
-        <w:t xml:space="preserve"> This is a test question</w:t>
-      </w:r>
-      <w:r>
-        <w:rPr>
-          <w:rStyle w:val="markedcontent"/>
-          <w:rFonts w:ascii="Times New Roman" w:hAnsi="Times New Roman" w:cs="Times New Roman"/>
-        </w:rPr>
-      </w:r>
-      <w:r>
-        <w:rPr>
-          <w:rFonts w:ascii="Times New Roman" w:hAnsi="Times New Roman" w:cs="Times New Roman"/>
-        </w:rPr>
-        <w:t/>
-      </w:r>
-    </w:p>
-    <w:p>
-      <w:pPr>
-        <w:spacing w:after="0" w:line="240" w:lineRule="auto"/>
-        <w:rPr>
-          <w:rFonts w:ascii="Times New Roman" w:hAnsi="Times New Roman" w:cs="Times New Roman"/>
-        </w:rPr>
-      </w:pPr>
-      <w:r>
-        <w:rPr>
-          <w:rFonts w:ascii="Times New Roman" w:hAnsi="Times New Roman" w:cs="Times New Roman"/>
         </w:rPr>
         <w:t/>
       </w:r>

</xml_diff>